<commit_message>
Update SDLC Central Technical User Guide
</commit_message>
<xml_diff>
--- a/SDLC-Central-Technical-User-Guide.docx
+++ b/SDLC-Central-Technical-User-Guide.docx
@@ -76,7 +76,7 @@
           <w:sz w:val="22"/>
           <w:szCs w:val="22"/>
         </w:rPr>
-        <w:t xml:space="preserve">Version 1.2 — 60 Skills · 30 Pipelines · 9 Agents · 8 Roles</w:t>
+        <w:t xml:space="preserve">Version 1.3 — 60 Skills · 30 Pipelines · 9 Agents · 8 Roles</w:t>
       </w:r>
     </w:p>
     <w:p>
@@ -194,7 +194,7 @@
           <w:sz w:val="22"/>
           <w:szCs w:val="22"/>
         </w:rPr>
-        <w:t xml:space="preserve">This guide walks you through installation, daily use, the skill and pipeline systems, the adapter architecture, quality gates, MCP integrations, and recommended git branching strategies.</w:t>
+        <w:t xml:space="preserve">This guide walks you through team conventions, installation, daily use, the skill and pipeline systems, the adapter architecture, quality gates, MCP integrations, and recommended git branching strategies.</w:t>
       </w:r>
     </w:p>
     <w:p>
@@ -1566,7 +1566,20 @@
           <w:sz w:val="32"/>
           <w:szCs w:val="32"/>
         </w:rPr>
-        <w:t xml:space="preserve">3. Installation</w:t>
+        <w:t xml:space="preserve">3. Team Conventions &amp; Ways of Working</w:t>
+      </w:r>
+    </w:p>
+    <w:p>
+      <w:pPr>
+        <w:spacing w:after="80" w:before="80"/>
+      </w:pPr>
+      <w:r>
+        <w:rPr>
+          <w:rFonts w:ascii="Arial" w:cs="Arial" w:eastAsia="Arial" w:hAnsi="Arial"/>
+          <w:sz w:val="22"/>
+          <w:szCs w:val="22"/>
+        </w:rPr>
+        <w:t xml:space="preserve">This chapter defines the standard team conventions for teams using SDLC Central. These are the shared agreements that turn the framework from a collection of tools into a coherent way of working. Every team member should read this chapter on their first day.</w:t>
       </w:r>
     </w:p>
     <w:p>
@@ -1583,7 +1596,7 @@
           <w:sz w:val="26"/>
           <w:szCs w:val="26"/>
         </w:rPr>
-        <w:t xml:space="preserve">3.1 Interactive Installer</w:t>
+        <w:t xml:space="preserve">3.1 Work Tiers</w:t>
       </w:r>
     </w:p>
     <w:p>
@@ -1596,37 +1609,677 @@
           <w:sz w:val="22"/>
           <w:szCs w:val="22"/>
         </w:rPr>
-        <w:t xml:space="preserve">Run the interactive installer from any project directory:</w:t>
-      </w:r>
-    </w:p>
-    <w:p>
-      <w:pPr>
-        <w:spacing w:after="60" w:before="60"/>
-        <w:ind w:left="360"/>
-      </w:pPr>
-      <w:r>
-        <w:rPr>
-          <w:rFonts w:ascii="Courier New" w:cs="Courier New" w:eastAsia="Courier New" w:hAnsi="Courier New"/>
-          <w:color w:val="444444"/>
-          <w:sz w:val="20"/>
-          <w:szCs w:val="20"/>
-        </w:rPr>
-        <w:t xml:space="preserve">bash /path/to/sdlc_central/setup/install.sh</w:t>
-      </w:r>
-    </w:p>
-    <w:p>
-      <w:pPr>
-        <w:spacing w:after="80" w:before="80"/>
-      </w:pPr>
-      <w:r>
-        <w:rPr>
-          <w:rFonts w:ascii="Arial" w:cs="Arial" w:eastAsia="Arial" w:hAnsi="Arial"/>
-          <w:sz w:val="22"/>
-          <w:szCs w:val="22"/>
-        </w:rPr>
-        <w:t xml:space="preserve">The installer auto-detects your agent from project markers (.claude/, .cursor/, etc.), then presents menus for agent selection and role selection. It delegates to install-role.sh for individual roles or install-all.sh for the full suite.</w:t>
-      </w:r>
-    </w:p>
+        <w:t xml:space="preserve">Every code change falls into one of three tiers. The product owner or tech lead assigns the tier when work enters the backlog — developers should never have to guess.</w:t>
+      </w:r>
+    </w:p>
+    <w:tbl>
+      <w:tblPr>
+        <w:tblW w:type="dxa" w:w="9360"/>
+        <w:tblBorders>
+          <w:top w:val="single" w:color="auto" w:sz="4"/>
+          <w:left w:val="single" w:color="auto" w:sz="4"/>
+          <w:bottom w:val="single" w:color="auto" w:sz="4"/>
+          <w:right w:val="single" w:color="auto" w:sz="4"/>
+          <w:insideH w:val="single" w:color="auto" w:sz="4"/>
+          <w:insideV w:val="single" w:color="auto" w:sz="4"/>
+        </w:tblBorders>
+      </w:tblPr>
+      <w:tblGrid>
+        <w:gridCol w:w="1200"/>
+        <w:gridCol w:w="1600"/>
+        <w:gridCol w:w="2000"/>
+        <w:gridCol w:w="1200"/>
+        <w:gridCol w:w="3360"/>
+      </w:tblGrid>
+      <w:tr>
+        <w:tc>
+          <w:tcPr>
+            <w:tcW w:type="dxa" w:w="1200"/>
+            <w:tcBorders>
+              <w:top w:val="single" w:color="2E75B6" w:sz="1"/>
+              <w:left w:val="single" w:color="2E75B6" w:sz="1"/>
+              <w:bottom w:val="single" w:color="2E75B6" w:sz="1"/>
+              <w:right w:val="single" w:color="2E75B6" w:sz="1"/>
+            </w:tcBorders>
+            <w:shd w:fill="2E75B6" w:val="clear"/>
+            <w:tcMar>
+              <w:top w:type="dxa" w:w="60"/>
+              <w:left w:type="dxa" w:w="100"/>
+              <w:bottom w:type="dxa" w:w="60"/>
+              <w:right w:type="dxa" w:w="100"/>
+            </w:tcMar>
+          </w:tcPr>
+          <w:p>
+            <w:pPr>
+              <w:spacing w:after="0" w:before="0"/>
+            </w:pPr>
+            <w:r>
+              <w:rPr>
+                <w:rFonts w:ascii="Arial" w:cs="Arial" w:eastAsia="Arial" w:hAnsi="Arial"/>
+                <w:b/>
+                <w:bCs/>
+                <w:color w:val="FFFFFF"/>
+                <w:sz w:val="18"/>
+                <w:szCs w:val="18"/>
+              </w:rPr>
+              <w:t xml:space="preserve">Tier</w:t>
+            </w:r>
+          </w:p>
+        </w:tc>
+        <w:tc>
+          <w:tcPr>
+            <w:tcW w:type="dxa" w:w="1600"/>
+            <w:tcBorders>
+              <w:top w:val="single" w:color="2E75B6" w:sz="1"/>
+              <w:left w:val="single" w:color="2E75B6" w:sz="1"/>
+              <w:bottom w:val="single" w:color="2E75B6" w:sz="1"/>
+              <w:right w:val="single" w:color="2E75B6" w:sz="1"/>
+            </w:tcBorders>
+            <w:shd w:fill="2E75B6" w:val="clear"/>
+            <w:tcMar>
+              <w:top w:type="dxa" w:w="60"/>
+              <w:left w:type="dxa" w:w="100"/>
+              <w:bottom w:type="dxa" w:w="60"/>
+              <w:right w:type="dxa" w:w="100"/>
+            </w:tcMar>
+          </w:tcPr>
+          <w:p>
+            <w:pPr>
+              <w:spacing w:after="0" w:before="0"/>
+            </w:pPr>
+            <w:r>
+              <w:rPr>
+                <w:rFonts w:ascii="Arial" w:cs="Arial" w:eastAsia="Arial" w:hAnsi="Arial"/>
+                <w:b/>
+                <w:bCs/>
+                <w:color w:val="FFFFFF"/>
+                <w:sz w:val="18"/>
+                <w:szCs w:val="18"/>
+              </w:rPr>
+              <w:t xml:space="preserve">Scope</w:t>
+            </w:r>
+          </w:p>
+        </w:tc>
+        <w:tc>
+          <w:tcPr>
+            <w:tcW w:type="dxa" w:w="2000"/>
+            <w:tcBorders>
+              <w:top w:val="single" w:color="2E75B6" w:sz="1"/>
+              <w:left w:val="single" w:color="2E75B6" w:sz="1"/>
+              <w:bottom w:val="single" w:color="2E75B6" w:sz="1"/>
+              <w:right w:val="single" w:color="2E75B6" w:sz="1"/>
+            </w:tcBorders>
+            <w:shd w:fill="2E75B6" w:val="clear"/>
+            <w:tcMar>
+              <w:top w:type="dxa" w:w="60"/>
+              <w:left w:type="dxa" w:w="100"/>
+              <w:bottom w:type="dxa" w:w="60"/>
+              <w:right w:type="dxa" w:w="100"/>
+            </w:tcMar>
+          </w:tcPr>
+          <w:p>
+            <w:pPr>
+              <w:spacing w:after="0" w:before="0"/>
+            </w:pPr>
+            <w:r>
+              <w:rPr>
+                <w:rFonts w:ascii="Arial" w:cs="Arial" w:eastAsia="Arial" w:hAnsi="Arial"/>
+                <w:b/>
+                <w:bCs/>
+                <w:color w:val="FFFFFF"/>
+                <w:sz w:val="18"/>
+                <w:szCs w:val="18"/>
+              </w:rPr>
+              <w:t xml:space="preserve">Pipeline</w:t>
+            </w:r>
+          </w:p>
+        </w:tc>
+        <w:tc>
+          <w:tcPr>
+            <w:tcW w:type="dxa" w:w="1200"/>
+            <w:tcBorders>
+              <w:top w:val="single" w:color="2E75B6" w:sz="1"/>
+              <w:left w:val="single" w:color="2E75B6" w:sz="1"/>
+              <w:bottom w:val="single" w:color="2E75B6" w:sz="1"/>
+              <w:right w:val="single" w:color="2E75B6" w:sz="1"/>
+            </w:tcBorders>
+            <w:shd w:fill="2E75B6" w:val="clear"/>
+            <w:tcMar>
+              <w:top w:type="dxa" w:w="60"/>
+              <w:left w:type="dxa" w:w="100"/>
+              <w:bottom w:type="dxa" w:w="60"/>
+              <w:right w:type="dxa" w:w="100"/>
+            </w:tcMar>
+          </w:tcPr>
+          <w:p>
+            <w:pPr>
+              <w:spacing w:after="0" w:before="0"/>
+            </w:pPr>
+            <w:r>
+              <w:rPr>
+                <w:rFonts w:ascii="Arial" w:cs="Arial" w:eastAsia="Arial" w:hAnsi="Arial"/>
+                <w:b/>
+                <w:bCs/>
+                <w:color w:val="FFFFFF"/>
+                <w:sz w:val="18"/>
+                <w:szCs w:val="18"/>
+              </w:rPr>
+              <w:t xml:space="preserve">Gate Profile</w:t>
+            </w:r>
+          </w:p>
+        </w:tc>
+        <w:tc>
+          <w:tcPr>
+            <w:tcW w:type="dxa" w:w="3360"/>
+            <w:tcBorders>
+              <w:top w:val="single" w:color="2E75B6" w:sz="1"/>
+              <w:left w:val="single" w:color="2E75B6" w:sz="1"/>
+              <w:bottom w:val="single" w:color="2E75B6" w:sz="1"/>
+              <w:right w:val="single" w:color="2E75B6" w:sz="1"/>
+            </w:tcBorders>
+            <w:shd w:fill="2E75B6" w:val="clear"/>
+            <w:tcMar>
+              <w:top w:type="dxa" w:w="60"/>
+              <w:left w:type="dxa" w:w="100"/>
+              <w:bottom w:type="dxa" w:w="60"/>
+              <w:right w:type="dxa" w:w="100"/>
+            </w:tcMar>
+          </w:tcPr>
+          <w:p>
+            <w:pPr>
+              <w:spacing w:after="0" w:before="0"/>
+            </w:pPr>
+            <w:r>
+              <w:rPr>
+                <w:rFonts w:ascii="Arial" w:cs="Arial" w:eastAsia="Arial" w:hAnsi="Arial"/>
+                <w:b/>
+                <w:bCs/>
+                <w:color w:val="FFFFFF"/>
+                <w:sz w:val="18"/>
+                <w:szCs w:val="18"/>
+              </w:rPr>
+              <w:t xml:space="preserve">Examples</w:t>
+            </w:r>
+          </w:p>
+        </w:tc>
+      </w:tr>
+      <w:tr>
+        <w:tc>
+          <w:tcPr>
+            <w:tcW w:type="dxa" w:w="1200"/>
+            <w:tcBorders>
+              <w:top w:val="single" w:color="CCCCCC" w:sz="1"/>
+              <w:left w:val="single" w:color="CCCCCC" w:sz="1"/>
+              <w:bottom w:val="single" w:color="CCCCCC" w:sz="1"/>
+              <w:right w:val="single" w:color="CCCCCC" w:sz="1"/>
+            </w:tcBorders>
+            <w:tcMar>
+              <w:top w:type="dxa" w:w="60"/>
+              <w:left w:type="dxa" w:w="100"/>
+              <w:bottom w:type="dxa" w:w="60"/>
+              <w:right w:type="dxa" w:w="100"/>
+            </w:tcMar>
+          </w:tcPr>
+          <w:p>
+            <w:pPr>
+              <w:spacing w:after="0" w:before="0"/>
+            </w:pPr>
+            <w:r>
+              <w:rPr>
+                <w:rFonts w:ascii="Arial" w:cs="Arial" w:eastAsia="Arial" w:hAnsi="Arial"/>
+                <w:color w:val="333333"/>
+                <w:sz w:val="18"/>
+                <w:szCs w:val="18"/>
+              </w:rPr>
+              <w:t xml:space="preserve">Tier 1 — Trivial</w:t>
+            </w:r>
+          </w:p>
+        </w:tc>
+        <w:tc>
+          <w:tcPr>
+            <w:tcW w:type="dxa" w:w="1600"/>
+            <w:tcBorders>
+              <w:top w:val="single" w:color="CCCCCC" w:sz="1"/>
+              <w:left w:val="single" w:color="CCCCCC" w:sz="1"/>
+              <w:bottom w:val="single" w:color="CCCCCC" w:sz="1"/>
+              <w:right w:val="single" w:color="CCCCCC" w:sz="1"/>
+            </w:tcBorders>
+            <w:tcMar>
+              <w:top w:type="dxa" w:w="60"/>
+              <w:left w:type="dxa" w:w="100"/>
+              <w:bottom w:type="dxa" w:w="60"/>
+              <w:right w:type="dxa" w:w="100"/>
+            </w:tcMar>
+          </w:tcPr>
+          <w:p>
+            <w:pPr>
+              <w:spacing w:after="0" w:before="0"/>
+            </w:pPr>
+            <w:r>
+              <w:rPr>
+                <w:rFonts w:ascii="Arial" w:cs="Arial" w:eastAsia="Arial" w:hAnsi="Arial"/>
+                <w:color w:val="333333"/>
+                <w:sz w:val="18"/>
+                <w:szCs w:val="18"/>
+              </w:rPr>
+              <w:t xml:space="preserve">One-file changes, no behavior change</w:t>
+            </w:r>
+          </w:p>
+        </w:tc>
+        <w:tc>
+          <w:tcPr>
+            <w:tcW w:type="dxa" w:w="2000"/>
+            <w:tcBorders>
+              <w:top w:val="single" w:color="CCCCCC" w:sz="1"/>
+              <w:left w:val="single" w:color="CCCCCC" w:sz="1"/>
+              <w:bottom w:val="single" w:color="CCCCCC" w:sz="1"/>
+              <w:right w:val="single" w:color="CCCCCC" w:sz="1"/>
+            </w:tcBorders>
+            <w:tcMar>
+              <w:top w:type="dxa" w:w="60"/>
+              <w:left w:type="dxa" w:w="100"/>
+              <w:bottom w:type="dxa" w:w="60"/>
+              <w:right w:type="dxa" w:w="100"/>
+            </w:tcMar>
+          </w:tcPr>
+          <w:p>
+            <w:pPr>
+              <w:spacing w:after="0" w:before="0"/>
+            </w:pPr>
+            <w:r>
+              <w:rPr>
+                <w:rFonts w:ascii="Arial" w:cs="Arial" w:eastAsia="Arial" w:hAnsi="Arial"/>
+                <w:color w:val="333333"/>
+                <w:sz w:val="18"/>
+                <w:szCs w:val="18"/>
+              </w:rPr>
+              <w:t xml:space="preserve">None (branch → fix → PR)</w:t>
+            </w:r>
+          </w:p>
+        </w:tc>
+        <w:tc>
+          <w:tcPr>
+            <w:tcW w:type="dxa" w:w="1200"/>
+            <w:tcBorders>
+              <w:top w:val="single" w:color="CCCCCC" w:sz="1"/>
+              <w:left w:val="single" w:color="CCCCCC" w:sz="1"/>
+              <w:bottom w:val="single" w:color="CCCCCC" w:sz="1"/>
+              <w:right w:val="single" w:color="CCCCCC" w:sz="1"/>
+            </w:tcBorders>
+            <w:tcMar>
+              <w:top w:type="dxa" w:w="60"/>
+              <w:left w:type="dxa" w:w="100"/>
+              <w:bottom w:type="dxa" w:w="60"/>
+              <w:right w:type="dxa" w:w="100"/>
+            </w:tcMar>
+          </w:tcPr>
+          <w:p>
+            <w:pPr>
+              <w:spacing w:after="0" w:before="0"/>
+            </w:pPr>
+            <w:r>
+              <w:rPr>
+                <w:rFonts w:ascii="Arial" w:cs="Arial" w:eastAsia="Arial" w:hAnsi="Arial"/>
+                <w:color w:val="333333"/>
+                <w:sz w:val="18"/>
+                <w:szCs w:val="18"/>
+              </w:rPr>
+              <w:t xml:space="preserve">None</w:t>
+            </w:r>
+          </w:p>
+        </w:tc>
+        <w:tc>
+          <w:tcPr>
+            <w:tcW w:type="dxa" w:w="3360"/>
+            <w:tcBorders>
+              <w:top w:val="single" w:color="CCCCCC" w:sz="1"/>
+              <w:left w:val="single" w:color="CCCCCC" w:sz="1"/>
+              <w:bottom w:val="single" w:color="CCCCCC" w:sz="1"/>
+              <w:right w:val="single" w:color="CCCCCC" w:sz="1"/>
+            </w:tcBorders>
+            <w:tcMar>
+              <w:top w:type="dxa" w:w="60"/>
+              <w:left w:type="dxa" w:w="100"/>
+              <w:bottom w:type="dxa" w:w="60"/>
+              <w:right w:type="dxa" w:w="100"/>
+            </w:tcMar>
+          </w:tcPr>
+          <w:p>
+            <w:pPr>
+              <w:spacing w:after="0" w:before="0"/>
+            </w:pPr>
+            <w:r>
+              <w:rPr>
+                <w:rFonts w:ascii="Arial" w:cs="Arial" w:eastAsia="Arial" w:hAnsi="Arial"/>
+                <w:color w:val="333333"/>
+                <w:sz w:val="18"/>
+                <w:szCs w:val="18"/>
+              </w:rPr>
+              <w:t xml:space="preserve">Typos, config tweaks, copy updates, one-line fixes</w:t>
+            </w:r>
+          </w:p>
+        </w:tc>
+      </w:tr>
+      <w:tr>
+        <w:tc>
+          <w:tcPr>
+            <w:tcW w:type="dxa" w:w="1200"/>
+            <w:tcBorders>
+              <w:top w:val="single" w:color="CCCCCC" w:sz="1"/>
+              <w:left w:val="single" w:color="CCCCCC" w:sz="1"/>
+              <w:bottom w:val="single" w:color="CCCCCC" w:sz="1"/>
+              <w:right w:val="single" w:color="CCCCCC" w:sz="1"/>
+            </w:tcBorders>
+            <w:shd w:fill="F2F7FB" w:val="clear"/>
+            <w:tcMar>
+              <w:top w:type="dxa" w:w="60"/>
+              <w:left w:type="dxa" w:w="100"/>
+              <w:bottom w:type="dxa" w:w="60"/>
+              <w:right w:type="dxa" w:w="100"/>
+            </w:tcMar>
+          </w:tcPr>
+          <w:p>
+            <w:pPr>
+              <w:spacing w:after="0" w:before="0"/>
+            </w:pPr>
+            <w:r>
+              <w:rPr>
+                <w:rFonts w:ascii="Arial" w:cs="Arial" w:eastAsia="Arial" w:hAnsi="Arial"/>
+                <w:color w:val="333333"/>
+                <w:sz w:val="18"/>
+                <w:szCs w:val="18"/>
+              </w:rPr>
+              <w:t xml:space="preserve">Tier 2 — Standard</w:t>
+            </w:r>
+          </w:p>
+        </w:tc>
+        <w:tc>
+          <w:tcPr>
+            <w:tcW w:type="dxa" w:w="1600"/>
+            <w:tcBorders>
+              <w:top w:val="single" w:color="CCCCCC" w:sz="1"/>
+              <w:left w:val="single" w:color="CCCCCC" w:sz="1"/>
+              <w:bottom w:val="single" w:color="CCCCCC" w:sz="1"/>
+              <w:right w:val="single" w:color="CCCCCC" w:sz="1"/>
+            </w:tcBorders>
+            <w:shd w:fill="F2F7FB" w:val="clear"/>
+            <w:tcMar>
+              <w:top w:type="dxa" w:w="60"/>
+              <w:left w:type="dxa" w:w="100"/>
+              <w:bottom w:type="dxa" w:w="60"/>
+              <w:right w:type="dxa" w:w="100"/>
+            </w:tcMar>
+          </w:tcPr>
+          <w:p>
+            <w:pPr>
+              <w:spacing w:after="0" w:before="0"/>
+            </w:pPr>
+            <w:r>
+              <w:rPr>
+                <w:rFonts w:ascii="Arial" w:cs="Arial" w:eastAsia="Arial" w:hAnsi="Arial"/>
+                <w:color w:val="333333"/>
+                <w:sz w:val="18"/>
+                <w:szCs w:val="18"/>
+              </w:rPr>
+              <w:t xml:space="preserve">Bugs, small features, improvements</w:t>
+            </w:r>
+          </w:p>
+        </w:tc>
+        <w:tc>
+          <w:tcPr>
+            <w:tcW w:type="dxa" w:w="2000"/>
+            <w:tcBorders>
+              <w:top w:val="single" w:color="CCCCCC" w:sz="1"/>
+              <w:left w:val="single" w:color="CCCCCC" w:sz="1"/>
+              <w:bottom w:val="single" w:color="CCCCCC" w:sz="1"/>
+              <w:right w:val="single" w:color="CCCCCC" w:sz="1"/>
+            </w:tcBorders>
+            <w:shd w:fill="F2F7FB" w:val="clear"/>
+            <w:tcMar>
+              <w:top w:type="dxa" w:w="60"/>
+              <w:left w:type="dxa" w:w="100"/>
+              <w:bottom w:type="dxa" w:w="60"/>
+              <w:right w:type="dxa" w:w="100"/>
+            </w:tcMar>
+          </w:tcPr>
+          <w:p>
+            <w:pPr>
+              <w:spacing w:after="0" w:before="0"/>
+            </w:pPr>
+            <w:r>
+              <w:rPr>
+                <w:rFonts w:ascii="Arial" w:cs="Arial" w:eastAsia="Arial" w:hAnsi="Arial"/>
+                <w:color w:val="333333"/>
+                <w:sz w:val="18"/>
+                <w:szCs w:val="18"/>
+              </w:rPr>
+              <w:t xml:space="preserve">Start at /spec-gen</w:t>
+            </w:r>
+          </w:p>
+        </w:tc>
+        <w:tc>
+          <w:tcPr>
+            <w:tcW w:type="dxa" w:w="1200"/>
+            <w:tcBorders>
+              <w:top w:val="single" w:color="CCCCCC" w:sz="1"/>
+              <w:left w:val="single" w:color="CCCCCC" w:sz="1"/>
+              <w:bottom w:val="single" w:color="CCCCCC" w:sz="1"/>
+              <w:right w:val="single" w:color="CCCCCC" w:sz="1"/>
+            </w:tcBorders>
+            <w:shd w:fill="F2F7FB" w:val="clear"/>
+            <w:tcMar>
+              <w:top w:type="dxa" w:w="60"/>
+              <w:left w:type="dxa" w:w="100"/>
+              <w:bottom w:type="dxa" w:w="60"/>
+              <w:right w:type="dxa" w:w="100"/>
+            </w:tcMar>
+          </w:tcPr>
+          <w:p>
+            <w:pPr>
+              <w:spacing w:after="0" w:before="0"/>
+            </w:pPr>
+            <w:r>
+              <w:rPr>
+                <w:rFonts w:ascii="Arial" w:cs="Arial" w:eastAsia="Arial" w:hAnsi="Arial"/>
+                <w:color w:val="333333"/>
+                <w:sz w:val="18"/>
+                <w:szCs w:val="18"/>
+              </w:rPr>
+              <w:t xml:space="preserve">standard</w:t>
+            </w:r>
+          </w:p>
+        </w:tc>
+        <w:tc>
+          <w:tcPr>
+            <w:tcW w:type="dxa" w:w="3360"/>
+            <w:tcBorders>
+              <w:top w:val="single" w:color="CCCCCC" w:sz="1"/>
+              <w:left w:val="single" w:color="CCCCCC" w:sz="1"/>
+              <w:bottom w:val="single" w:color="CCCCCC" w:sz="1"/>
+              <w:right w:val="single" w:color="CCCCCC" w:sz="1"/>
+            </w:tcBorders>
+            <w:shd w:fill="F2F7FB" w:val="clear"/>
+            <w:tcMar>
+              <w:top w:type="dxa" w:w="60"/>
+              <w:left w:type="dxa" w:w="100"/>
+              <w:bottom w:type="dxa" w:w="60"/>
+              <w:right w:type="dxa" w:w="100"/>
+            </w:tcMar>
+          </w:tcPr>
+          <w:p>
+            <w:pPr>
+              <w:spacing w:after="0" w:before="0"/>
+            </w:pPr>
+            <w:r>
+              <w:rPr>
+                <w:rFonts w:ascii="Arial" w:cs="Arial" w:eastAsia="Arial" w:hAnsi="Arial"/>
+                <w:color w:val="333333"/>
+                <w:sz w:val="18"/>
+                <w:szCs w:val="18"/>
+              </w:rPr>
+              <w:t xml:space="preserve">Bug fixes, UI improvements, new API endpoint, refactors</w:t>
+            </w:r>
+          </w:p>
+        </w:tc>
+      </w:tr>
+      <w:tr>
+        <w:tc>
+          <w:tcPr>
+            <w:tcW w:type="dxa" w:w="1200"/>
+            <w:tcBorders>
+              <w:top w:val="single" w:color="CCCCCC" w:sz="1"/>
+              <w:left w:val="single" w:color="CCCCCC" w:sz="1"/>
+              <w:bottom w:val="single" w:color="CCCCCC" w:sz="1"/>
+              <w:right w:val="single" w:color="CCCCCC" w:sz="1"/>
+            </w:tcBorders>
+            <w:tcMar>
+              <w:top w:type="dxa" w:w="60"/>
+              <w:left w:type="dxa" w:w="100"/>
+              <w:bottom w:type="dxa" w:w="60"/>
+              <w:right w:type="dxa" w:w="100"/>
+            </w:tcMar>
+          </w:tcPr>
+          <w:p>
+            <w:pPr>
+              <w:spacing w:after="0" w:before="0"/>
+            </w:pPr>
+            <w:r>
+              <w:rPr>
+                <w:rFonts w:ascii="Arial" w:cs="Arial" w:eastAsia="Arial" w:hAnsi="Arial"/>
+                <w:color w:val="333333"/>
+                <w:sz w:val="18"/>
+                <w:szCs w:val="18"/>
+              </w:rPr>
+              <w:t xml:space="preserve">Tier 3 — Significant</w:t>
+            </w:r>
+          </w:p>
+        </w:tc>
+        <w:tc>
+          <w:tcPr>
+            <w:tcW w:type="dxa" w:w="1600"/>
+            <w:tcBorders>
+              <w:top w:val="single" w:color="CCCCCC" w:sz="1"/>
+              <w:left w:val="single" w:color="CCCCCC" w:sz="1"/>
+              <w:bottom w:val="single" w:color="CCCCCC" w:sz="1"/>
+              <w:right w:val="single" w:color="CCCCCC" w:sz="1"/>
+            </w:tcBorders>
+            <w:tcMar>
+              <w:top w:type="dxa" w:w="60"/>
+              <w:left w:type="dxa" w:w="100"/>
+              <w:bottom w:type="dxa" w:w="60"/>
+              <w:right w:type="dxa" w:w="100"/>
+            </w:tcMar>
+          </w:tcPr>
+          <w:p>
+            <w:pPr>
+              <w:spacing w:after="0" w:before="0"/>
+            </w:pPr>
+            <w:r>
+              <w:rPr>
+                <w:rFonts w:ascii="Arial" w:cs="Arial" w:eastAsia="Arial" w:hAnsi="Arial"/>
+                <w:color w:val="333333"/>
+                <w:sz w:val="18"/>
+                <w:szCs w:val="18"/>
+              </w:rPr>
+              <w:t xml:space="preserve">New features, migrations, cross-service</w:t>
+            </w:r>
+          </w:p>
+        </w:tc>
+        <w:tc>
+          <w:tcPr>
+            <w:tcW w:type="dxa" w:w="2000"/>
+            <w:tcBorders>
+              <w:top w:val="single" w:color="CCCCCC" w:sz="1"/>
+              <w:left w:val="single" w:color="CCCCCC" w:sz="1"/>
+              <w:bottom w:val="single" w:color="CCCCCC" w:sz="1"/>
+              <w:right w:val="single" w:color="CCCCCC" w:sz="1"/>
+            </w:tcBorders>
+            <w:tcMar>
+              <w:top w:type="dxa" w:w="60"/>
+              <w:left w:type="dxa" w:w="100"/>
+              <w:bottom w:type="dxa" w:w="60"/>
+              <w:right w:type="dxa" w:w="100"/>
+            </w:tcMar>
+          </w:tcPr>
+          <w:p>
+            <w:pPr>
+              <w:spacing w:after="0" w:before="0"/>
+            </w:pPr>
+            <w:r>
+              <w:rPr>
+                <w:rFonts w:ascii="Arial" w:cs="Arial" w:eastAsia="Arial" w:hAnsi="Arial"/>
+                <w:color w:val="333333"/>
+                <w:sz w:val="18"/>
+                <w:szCs w:val="18"/>
+              </w:rPr>
+              <w:t xml:space="preserve">Full idea-to-spec → design-to-plan → feature-build</w:t>
+            </w:r>
+          </w:p>
+        </w:tc>
+        <w:tc>
+          <w:tcPr>
+            <w:tcW w:type="dxa" w:w="1200"/>
+            <w:tcBorders>
+              <w:top w:val="single" w:color="CCCCCC" w:sz="1"/>
+              <w:left w:val="single" w:color="CCCCCC" w:sz="1"/>
+              <w:bottom w:val="single" w:color="CCCCCC" w:sz="1"/>
+              <w:right w:val="single" w:color="CCCCCC" w:sz="1"/>
+            </w:tcBorders>
+            <w:tcMar>
+              <w:top w:type="dxa" w:w="60"/>
+              <w:left w:type="dxa" w:w="100"/>
+              <w:bottom w:type="dxa" w:w="60"/>
+              <w:right w:type="dxa" w:w="100"/>
+            </w:tcMar>
+          </w:tcPr>
+          <w:p>
+            <w:pPr>
+              <w:spacing w:after="0" w:before="0"/>
+            </w:pPr>
+            <w:r>
+              <w:rPr>
+                <w:rFonts w:ascii="Arial" w:cs="Arial" w:eastAsia="Arial" w:hAnsi="Arial"/>
+                <w:color w:val="333333"/>
+                <w:sz w:val="18"/>
+                <w:szCs w:val="18"/>
+              </w:rPr>
+              <w:t xml:space="preserve">standard (strict if security/payments/PII)</w:t>
+            </w:r>
+          </w:p>
+        </w:tc>
+        <w:tc>
+          <w:tcPr>
+            <w:tcW w:type="dxa" w:w="3360"/>
+            <w:tcBorders>
+              <w:top w:val="single" w:color="CCCCCC" w:sz="1"/>
+              <w:left w:val="single" w:color="CCCCCC" w:sz="1"/>
+              <w:bottom w:val="single" w:color="CCCCCC" w:sz="1"/>
+              <w:right w:val="single" w:color="CCCCCC" w:sz="1"/>
+            </w:tcBorders>
+            <w:tcMar>
+              <w:top w:type="dxa" w:w="60"/>
+              <w:left w:type="dxa" w:w="100"/>
+              <w:bottom w:type="dxa" w:w="60"/>
+              <w:right w:type="dxa" w:w="100"/>
+            </w:tcMar>
+          </w:tcPr>
+          <w:p>
+            <w:pPr>
+              <w:spacing w:after="0" w:before="0"/>
+            </w:pPr>
+            <w:r>
+              <w:rPr>
+                <w:rFonts w:ascii="Arial" w:cs="Arial" w:eastAsia="Arial" w:hAnsi="Arial"/>
+                <w:color w:val="333333"/>
+                <w:sz w:val="18"/>
+                <w:szCs w:val="18"/>
+              </w:rPr>
+              <w:t xml:space="preserve">New feature modules, database migrations, auth changes, public API changes</w:t>
+            </w:r>
+          </w:p>
+        </w:tc>
+      </w:tr>
+    </w:tbl>
     <w:p>
       <w:pPr>
         <w:pStyle w:val="Heading2"/>
@@ -1641,7 +2294,7 @@
           <w:sz w:val="26"/>
           <w:szCs w:val="26"/>
         </w:rPr>
-        <w:t xml:space="preserve">3.2 Non-Interactive Install</w:t>
+        <w:t xml:space="preserve">3.2 Pipeline Ownership</w:t>
       </w:r>
     </w:p>
     <w:p>
@@ -1654,67 +2307,710 @@
           <w:sz w:val="22"/>
           <w:szCs w:val="22"/>
         </w:rPr>
-        <w:t xml:space="preserve">Install for a specific role and agent directly:</w:t>
-      </w:r>
-    </w:p>
-    <w:p>
-      <w:pPr>
-        <w:spacing w:after="60" w:before="60"/>
-        <w:ind w:left="360"/>
-      </w:pPr>
-      <w:r>
-        <w:rPr>
-          <w:rFonts w:ascii="Courier New" w:cs="Courier New" w:eastAsia="Courier New" w:hAnsi="Courier New"/>
-          <w:color w:val="444444"/>
-          <w:sz w:val="20"/>
-          <w:szCs w:val="20"/>
-        </w:rPr>
-        <w:t xml:space="preserve">bash setup/install-role.sh developer --agent cursor</w:t>
-      </w:r>
-    </w:p>
-    <w:p>
-      <w:pPr>
-        <w:spacing w:after="60" w:before="60"/>
-        <w:ind w:left="360"/>
-      </w:pPr>
-      <w:r>
-        <w:rPr>
-          <w:rFonts w:ascii="Courier New" w:cs="Courier New" w:eastAsia="Courier New" w:hAnsi="Courier New"/>
-          <w:color w:val="444444"/>
-          <w:sz w:val="20"/>
-          <w:szCs w:val="20"/>
-        </w:rPr>
-        <w:t xml:space="preserve">bash setup/install-role.sh designer --agent claude-code</w:t>
-      </w:r>
-    </w:p>
-    <w:p>
-      <w:pPr>
-        <w:spacing w:after="80" w:before="80"/>
-      </w:pPr>
-      <w:r>
-        <w:rPr>
-          <w:rFonts w:ascii="Arial" w:cs="Arial" w:eastAsia="Arial" w:hAnsi="Arial"/>
-          <w:sz w:val="22"/>
-          <w:szCs w:val="22"/>
-        </w:rPr>
-        <w:t xml:space="preserve">To install all 60 skills:</w:t>
-      </w:r>
-    </w:p>
-    <w:p>
-      <w:pPr>
-        <w:spacing w:after="60" w:before="60"/>
-        <w:ind w:left="360"/>
-      </w:pPr>
-      <w:r>
-        <w:rPr>
-          <w:rFonts w:ascii="Courier New" w:cs="Courier New" w:eastAsia="Courier New" w:hAnsi="Courier New"/>
-          <w:color w:val="444444"/>
-          <w:sz w:val="20"/>
-          <w:szCs w:val="20"/>
-        </w:rPr>
-        <w:t xml:space="preserve">bash setup/install-all.sh --agent claude-code</w:t>
-      </w:r>
-    </w:p>
+        <w:t xml:space="preserve">Each pipeline step has a clear owner. The person who runs a skill should never be the same person who approves its gate output.</w:t>
+      </w:r>
+    </w:p>
+    <w:tbl>
+      <w:tblPr>
+        <w:tblW w:type="dxa" w:w="9360"/>
+        <w:tblBorders>
+          <w:top w:val="single" w:color="auto" w:sz="4"/>
+          <w:left w:val="single" w:color="auto" w:sz="4"/>
+          <w:bottom w:val="single" w:color="auto" w:sz="4"/>
+          <w:right w:val="single" w:color="auto" w:sz="4"/>
+          <w:insideH w:val="single" w:color="auto" w:sz="4"/>
+          <w:insideV w:val="single" w:color="auto" w:sz="4"/>
+        </w:tblBorders>
+      </w:tblPr>
+      <w:tblGrid>
+        <w:gridCol w:w="2800"/>
+        <w:gridCol w:w="2800"/>
+        <w:gridCol w:w="3760"/>
+      </w:tblGrid>
+      <w:tr>
+        <w:tc>
+          <w:tcPr>
+            <w:tcW w:type="dxa" w:w="2800"/>
+            <w:tcBorders>
+              <w:top w:val="single" w:color="2E75B6" w:sz="1"/>
+              <w:left w:val="single" w:color="2E75B6" w:sz="1"/>
+              <w:bottom w:val="single" w:color="2E75B6" w:sz="1"/>
+              <w:right w:val="single" w:color="2E75B6" w:sz="1"/>
+            </w:tcBorders>
+            <w:shd w:fill="2E75B6" w:val="clear"/>
+            <w:tcMar>
+              <w:top w:type="dxa" w:w="60"/>
+              <w:left w:type="dxa" w:w="100"/>
+              <w:bottom w:type="dxa" w:w="60"/>
+              <w:right w:type="dxa" w:w="100"/>
+            </w:tcMar>
+          </w:tcPr>
+          <w:p>
+            <w:pPr>
+              <w:spacing w:after="0" w:before="0"/>
+            </w:pPr>
+            <w:r>
+              <w:rPr>
+                <w:rFonts w:ascii="Arial" w:cs="Arial" w:eastAsia="Arial" w:hAnsi="Arial"/>
+                <w:b/>
+                <w:bCs/>
+                <w:color w:val="FFFFFF"/>
+                <w:sz w:val="18"/>
+                <w:szCs w:val="18"/>
+              </w:rPr>
+              <w:t xml:space="preserve">Pipeline Step</w:t>
+            </w:r>
+          </w:p>
+        </w:tc>
+        <w:tc>
+          <w:tcPr>
+            <w:tcW w:type="dxa" w:w="2800"/>
+            <w:tcBorders>
+              <w:top w:val="single" w:color="2E75B6" w:sz="1"/>
+              <w:left w:val="single" w:color="2E75B6" w:sz="1"/>
+              <w:bottom w:val="single" w:color="2E75B6" w:sz="1"/>
+              <w:right w:val="single" w:color="2E75B6" w:sz="1"/>
+            </w:tcBorders>
+            <w:shd w:fill="2E75B6" w:val="clear"/>
+            <w:tcMar>
+              <w:top w:type="dxa" w:w="60"/>
+              <w:left w:type="dxa" w:w="100"/>
+              <w:bottom w:type="dxa" w:w="60"/>
+              <w:right w:type="dxa" w:w="100"/>
+            </w:tcMar>
+          </w:tcPr>
+          <w:p>
+            <w:pPr>
+              <w:spacing w:after="0" w:before="0"/>
+            </w:pPr>
+            <w:r>
+              <w:rPr>
+                <w:rFonts w:ascii="Arial" w:cs="Arial" w:eastAsia="Arial" w:hAnsi="Arial"/>
+                <w:b/>
+                <w:bCs/>
+                <w:color w:val="FFFFFF"/>
+                <w:sz w:val="18"/>
+                <w:szCs w:val="18"/>
+              </w:rPr>
+              <w:t xml:space="preserve">Runs It</w:t>
+            </w:r>
+          </w:p>
+        </w:tc>
+        <w:tc>
+          <w:tcPr>
+            <w:tcW w:type="dxa" w:w="3760"/>
+            <w:tcBorders>
+              <w:top w:val="single" w:color="2E75B6" w:sz="1"/>
+              <w:left w:val="single" w:color="2E75B6" w:sz="1"/>
+              <w:bottom w:val="single" w:color="2E75B6" w:sz="1"/>
+              <w:right w:val="single" w:color="2E75B6" w:sz="1"/>
+            </w:tcBorders>
+            <w:shd w:fill="2E75B6" w:val="clear"/>
+            <w:tcMar>
+              <w:top w:type="dxa" w:w="60"/>
+              <w:left w:type="dxa" w:w="100"/>
+              <w:bottom w:type="dxa" w:w="60"/>
+              <w:right w:type="dxa" w:w="100"/>
+            </w:tcMar>
+          </w:tcPr>
+          <w:p>
+            <w:pPr>
+              <w:spacing w:after="0" w:before="0"/>
+            </w:pPr>
+            <w:r>
+              <w:rPr>
+                <w:rFonts w:ascii="Arial" w:cs="Arial" w:eastAsia="Arial" w:hAnsi="Arial"/>
+                <w:b/>
+                <w:bCs/>
+                <w:color w:val="FFFFFF"/>
+                <w:sz w:val="18"/>
+                <w:szCs w:val="18"/>
+              </w:rPr>
+              <w:t xml:space="preserve">Approves Gate Output</w:t>
+            </w:r>
+          </w:p>
+        </w:tc>
+      </w:tr>
+      <w:tr>
+        <w:tc>
+          <w:tcPr>
+            <w:tcW w:type="dxa" w:w="2800"/>
+            <w:tcBorders>
+              <w:top w:val="single" w:color="CCCCCC" w:sz="1"/>
+              <w:left w:val="single" w:color="CCCCCC" w:sz="1"/>
+              <w:bottom w:val="single" w:color="CCCCCC" w:sz="1"/>
+              <w:right w:val="single" w:color="CCCCCC" w:sz="1"/>
+            </w:tcBorders>
+            <w:tcMar>
+              <w:top w:type="dxa" w:w="60"/>
+              <w:left w:type="dxa" w:w="100"/>
+              <w:bottom w:type="dxa" w:w="60"/>
+              <w:right w:type="dxa" w:w="100"/>
+            </w:tcMar>
+          </w:tcPr>
+          <w:p>
+            <w:pPr>
+              <w:spacing w:after="0" w:before="0"/>
+            </w:pPr>
+            <w:r>
+              <w:rPr>
+                <w:rFonts w:ascii="Arial" w:cs="Arial" w:eastAsia="Arial" w:hAnsi="Arial"/>
+                <w:color w:val="333333"/>
+                <w:sz w:val="18"/>
+                <w:szCs w:val="18"/>
+              </w:rPr>
+              <w:t xml:space="preserve">idea-to-spec (user-story-refiner → spec-gen)</w:t>
+            </w:r>
+          </w:p>
+        </w:tc>
+        <w:tc>
+          <w:tcPr>
+            <w:tcW w:type="dxa" w:w="2800"/>
+            <w:tcBorders>
+              <w:top w:val="single" w:color="CCCCCC" w:sz="1"/>
+              <w:left w:val="single" w:color="CCCCCC" w:sz="1"/>
+              <w:bottom w:val="single" w:color="CCCCCC" w:sz="1"/>
+              <w:right w:val="single" w:color="CCCCCC" w:sz="1"/>
+            </w:tcBorders>
+            <w:tcMar>
+              <w:top w:type="dxa" w:w="60"/>
+              <w:left w:type="dxa" w:w="100"/>
+              <w:bottom w:type="dxa" w:w="60"/>
+              <w:right w:type="dxa" w:w="100"/>
+            </w:tcMar>
+          </w:tcPr>
+          <w:p>
+            <w:pPr>
+              <w:spacing w:after="0" w:before="0"/>
+            </w:pPr>
+            <w:r>
+              <w:rPr>
+                <w:rFonts w:ascii="Arial" w:cs="Arial" w:eastAsia="Arial" w:hAnsi="Arial"/>
+                <w:color w:val="333333"/>
+                <w:sz w:val="18"/>
+                <w:szCs w:val="18"/>
+              </w:rPr>
+              <w:t xml:space="preserve">Product Owner</w:t>
+            </w:r>
+          </w:p>
+        </w:tc>
+        <w:tc>
+          <w:tcPr>
+            <w:tcW w:type="dxa" w:w="3760"/>
+            <w:tcBorders>
+              <w:top w:val="single" w:color="CCCCCC" w:sz="1"/>
+              <w:left w:val="single" w:color="CCCCCC" w:sz="1"/>
+              <w:bottom w:val="single" w:color="CCCCCC" w:sz="1"/>
+              <w:right w:val="single" w:color="CCCCCC" w:sz="1"/>
+            </w:tcBorders>
+            <w:tcMar>
+              <w:top w:type="dxa" w:w="60"/>
+              <w:left w:type="dxa" w:w="100"/>
+              <w:bottom w:type="dxa" w:w="60"/>
+              <w:right w:type="dxa" w:w="100"/>
+            </w:tcMar>
+          </w:tcPr>
+          <w:p>
+            <w:pPr>
+              <w:spacing w:after="0" w:before="0"/>
+            </w:pPr>
+            <w:r>
+              <w:rPr>
+                <w:rFonts w:ascii="Arial" w:cs="Arial" w:eastAsia="Arial" w:hAnsi="Arial"/>
+                <w:color w:val="333333"/>
+                <w:sz w:val="18"/>
+                <w:szCs w:val="18"/>
+              </w:rPr>
+              <w:t xml:space="preserve">Architect or Tech Lead reviews spec</w:t>
+            </w:r>
+          </w:p>
+        </w:tc>
+      </w:tr>
+      <w:tr>
+        <w:tc>
+          <w:tcPr>
+            <w:tcW w:type="dxa" w:w="2800"/>
+            <w:tcBorders>
+              <w:top w:val="single" w:color="CCCCCC" w:sz="1"/>
+              <w:left w:val="single" w:color="CCCCCC" w:sz="1"/>
+              <w:bottom w:val="single" w:color="CCCCCC" w:sz="1"/>
+              <w:right w:val="single" w:color="CCCCCC" w:sz="1"/>
+            </w:tcBorders>
+            <w:shd w:fill="F2F7FB" w:val="clear"/>
+            <w:tcMar>
+              <w:top w:type="dxa" w:w="60"/>
+              <w:left w:type="dxa" w:w="100"/>
+              <w:bottom w:type="dxa" w:w="60"/>
+              <w:right w:type="dxa" w:w="100"/>
+            </w:tcMar>
+          </w:tcPr>
+          <w:p>
+            <w:pPr>
+              <w:spacing w:after="0" w:before="0"/>
+            </w:pPr>
+            <w:r>
+              <w:rPr>
+                <w:rFonts w:ascii="Arial" w:cs="Arial" w:eastAsia="Arial" w:hAnsi="Arial"/>
+                <w:color w:val="333333"/>
+                <w:sz w:val="18"/>
+                <w:szCs w:val="18"/>
+              </w:rPr>
+              <w:t xml:space="preserve">design-to-plan (spec-review → plan-gen)</w:t>
+            </w:r>
+          </w:p>
+        </w:tc>
+        <w:tc>
+          <w:tcPr>
+            <w:tcW w:type="dxa" w:w="2800"/>
+            <w:tcBorders>
+              <w:top w:val="single" w:color="CCCCCC" w:sz="1"/>
+              <w:left w:val="single" w:color="CCCCCC" w:sz="1"/>
+              <w:bottom w:val="single" w:color="CCCCCC" w:sz="1"/>
+              <w:right w:val="single" w:color="CCCCCC" w:sz="1"/>
+            </w:tcBorders>
+            <w:shd w:fill="F2F7FB" w:val="clear"/>
+            <w:tcMar>
+              <w:top w:type="dxa" w:w="60"/>
+              <w:left w:type="dxa" w:w="100"/>
+              <w:bottom w:type="dxa" w:w="60"/>
+              <w:right w:type="dxa" w:w="100"/>
+            </w:tcMar>
+          </w:tcPr>
+          <w:p>
+            <w:pPr>
+              <w:spacing w:after="0" w:before="0"/>
+            </w:pPr>
+            <w:r>
+              <w:rPr>
+                <w:rFonts w:ascii="Arial" w:cs="Arial" w:eastAsia="Arial" w:hAnsi="Arial"/>
+                <w:color w:val="333333"/>
+                <w:sz w:val="18"/>
+                <w:szCs w:val="18"/>
+              </w:rPr>
+              <w:t xml:space="preserve">Architect</w:t>
+            </w:r>
+          </w:p>
+        </w:tc>
+        <w:tc>
+          <w:tcPr>
+            <w:tcW w:type="dxa" w:w="3760"/>
+            <w:tcBorders>
+              <w:top w:val="single" w:color="CCCCCC" w:sz="1"/>
+              <w:left w:val="single" w:color="CCCCCC" w:sz="1"/>
+              <w:bottom w:val="single" w:color="CCCCCC" w:sz="1"/>
+              <w:right w:val="single" w:color="CCCCCC" w:sz="1"/>
+            </w:tcBorders>
+            <w:shd w:fill="F2F7FB" w:val="clear"/>
+            <w:tcMar>
+              <w:top w:type="dxa" w:w="60"/>
+              <w:left w:type="dxa" w:w="100"/>
+              <w:bottom w:type="dxa" w:w="60"/>
+              <w:right w:type="dxa" w:w="100"/>
+            </w:tcMar>
+          </w:tcPr>
+          <w:p>
+            <w:pPr>
+              <w:spacing w:after="0" w:before="0"/>
+            </w:pPr>
+            <w:r>
+              <w:rPr>
+                <w:rFonts w:ascii="Arial" w:cs="Arial" w:eastAsia="Arial" w:hAnsi="Arial"/>
+                <w:color w:val="333333"/>
+                <w:sz w:val="18"/>
+                <w:szCs w:val="18"/>
+              </w:rPr>
+              <w:t xml:space="preserve">Tech Lead or peer architect reviews plan</w:t>
+            </w:r>
+          </w:p>
+        </w:tc>
+      </w:tr>
+      <w:tr>
+        <w:tc>
+          <w:tcPr>
+            <w:tcW w:type="dxa" w:w="2800"/>
+            <w:tcBorders>
+              <w:top w:val="single" w:color="CCCCCC" w:sz="1"/>
+              <w:left w:val="single" w:color="CCCCCC" w:sz="1"/>
+              <w:bottom w:val="single" w:color="CCCCCC" w:sz="1"/>
+              <w:right w:val="single" w:color="CCCCCC" w:sz="1"/>
+            </w:tcBorders>
+            <w:tcMar>
+              <w:top w:type="dxa" w:w="60"/>
+              <w:left w:type="dxa" w:w="100"/>
+              <w:bottom w:type="dxa" w:w="60"/>
+              <w:right w:type="dxa" w:w="100"/>
+            </w:tcMar>
+          </w:tcPr>
+          <w:p>
+            <w:pPr>
+              <w:spacing w:after="0" w:before="0"/>
+            </w:pPr>
+            <w:r>
+              <w:rPr>
+                <w:rFonts w:ascii="Arial" w:cs="Arial" w:eastAsia="Arial" w:hAnsi="Arial"/>
+                <w:color w:val="333333"/>
+                <w:sz w:val="18"/>
+                <w:szCs w:val="18"/>
+              </w:rPr>
+              <w:t xml:space="preserve">feature-build (task-gen → implement → review)</w:t>
+            </w:r>
+          </w:p>
+        </w:tc>
+        <w:tc>
+          <w:tcPr>
+            <w:tcW w:type="dxa" w:w="2800"/>
+            <w:tcBorders>
+              <w:top w:val="single" w:color="CCCCCC" w:sz="1"/>
+              <w:left w:val="single" w:color="CCCCCC" w:sz="1"/>
+              <w:bottom w:val="single" w:color="CCCCCC" w:sz="1"/>
+              <w:right w:val="single" w:color="CCCCCC" w:sz="1"/>
+            </w:tcBorders>
+            <w:tcMar>
+              <w:top w:type="dxa" w:w="60"/>
+              <w:left w:type="dxa" w:w="100"/>
+              <w:bottom w:type="dxa" w:w="60"/>
+              <w:right w:type="dxa" w:w="100"/>
+            </w:tcMar>
+          </w:tcPr>
+          <w:p>
+            <w:pPr>
+              <w:spacing w:after="0" w:before="0"/>
+            </w:pPr>
+            <w:r>
+              <w:rPr>
+                <w:rFonts w:ascii="Arial" w:cs="Arial" w:eastAsia="Arial" w:hAnsi="Arial"/>
+                <w:color w:val="333333"/>
+                <w:sz w:val="18"/>
+                <w:szCs w:val="18"/>
+              </w:rPr>
+              <w:t xml:space="preserve">Developer</w:t>
+            </w:r>
+          </w:p>
+        </w:tc>
+        <w:tc>
+          <w:tcPr>
+            <w:tcW w:type="dxa" w:w="3760"/>
+            <w:tcBorders>
+              <w:top w:val="single" w:color="CCCCCC" w:sz="1"/>
+              <w:left w:val="single" w:color="CCCCCC" w:sz="1"/>
+              <w:bottom w:val="single" w:color="CCCCCC" w:sz="1"/>
+              <w:right w:val="single" w:color="CCCCCC" w:sz="1"/>
+            </w:tcBorders>
+            <w:tcMar>
+              <w:top w:type="dxa" w:w="60"/>
+              <w:left w:type="dxa" w:w="100"/>
+              <w:bottom w:type="dxa" w:w="60"/>
+              <w:right w:type="dxa" w:w="100"/>
+            </w:tcMar>
+          </w:tcPr>
+          <w:p>
+            <w:pPr>
+              <w:spacing w:after="0" w:before="0"/>
+            </w:pPr>
+            <w:r>
+              <w:rPr>
+                <w:rFonts w:ascii="Arial" w:cs="Arial" w:eastAsia="Arial" w:hAnsi="Arial"/>
+                <w:color w:val="333333"/>
+                <w:sz w:val="18"/>
+                <w:szCs w:val="18"/>
+              </w:rPr>
+              <w:t xml:space="preserve">Tech Lead or peer developer approves quality gate</w:t>
+            </w:r>
+          </w:p>
+        </w:tc>
+      </w:tr>
+      <w:tr>
+        <w:tc>
+          <w:tcPr>
+            <w:tcW w:type="dxa" w:w="2800"/>
+            <w:tcBorders>
+              <w:top w:val="single" w:color="CCCCCC" w:sz="1"/>
+              <w:left w:val="single" w:color="CCCCCC" w:sz="1"/>
+              <w:bottom w:val="single" w:color="CCCCCC" w:sz="1"/>
+              <w:right w:val="single" w:color="CCCCCC" w:sz="1"/>
+            </w:tcBorders>
+            <w:shd w:fill="F2F7FB" w:val="clear"/>
+            <w:tcMar>
+              <w:top w:type="dxa" w:w="60"/>
+              <w:left w:type="dxa" w:w="100"/>
+              <w:bottom w:type="dxa" w:w="60"/>
+              <w:right w:type="dxa" w:w="100"/>
+            </w:tcMar>
+          </w:tcPr>
+          <w:p>
+            <w:pPr>
+              <w:spacing w:after="0" w:before="0"/>
+            </w:pPr>
+            <w:r>
+              <w:rPr>
+                <w:rFonts w:ascii="Arial" w:cs="Arial" w:eastAsia="Arial" w:hAnsi="Arial"/>
+                <w:color w:val="333333"/>
+                <w:sz w:val="18"/>
+                <w:szCs w:val="18"/>
+              </w:rPr>
+              <w:t xml:space="preserve">release-validation</w:t>
+            </w:r>
+          </w:p>
+        </w:tc>
+        <w:tc>
+          <w:tcPr>
+            <w:tcW w:type="dxa" w:w="2800"/>
+            <w:tcBorders>
+              <w:top w:val="single" w:color="CCCCCC" w:sz="1"/>
+              <w:left w:val="single" w:color="CCCCCC" w:sz="1"/>
+              <w:bottom w:val="single" w:color="CCCCCC" w:sz="1"/>
+              <w:right w:val="single" w:color="CCCCCC" w:sz="1"/>
+            </w:tcBorders>
+            <w:shd w:fill="F2F7FB" w:val="clear"/>
+            <w:tcMar>
+              <w:top w:type="dxa" w:w="60"/>
+              <w:left w:type="dxa" w:w="100"/>
+              <w:bottom w:type="dxa" w:w="60"/>
+              <w:right w:type="dxa" w:w="100"/>
+            </w:tcMar>
+          </w:tcPr>
+          <w:p>
+            <w:pPr>
+              <w:spacing w:after="0" w:before="0"/>
+            </w:pPr>
+            <w:r>
+              <w:rPr>
+                <w:rFonts w:ascii="Arial" w:cs="Arial" w:eastAsia="Arial" w:hAnsi="Arial"/>
+                <w:color w:val="333333"/>
+                <w:sz w:val="18"/>
+                <w:szCs w:val="18"/>
+              </w:rPr>
+              <w:t xml:space="preserve">QA</w:t>
+            </w:r>
+          </w:p>
+        </w:tc>
+        <w:tc>
+          <w:tcPr>
+            <w:tcW w:type="dxa" w:w="3760"/>
+            <w:tcBorders>
+              <w:top w:val="single" w:color="CCCCCC" w:sz="1"/>
+              <w:left w:val="single" w:color="CCCCCC" w:sz="1"/>
+              <w:bottom w:val="single" w:color="CCCCCC" w:sz="1"/>
+              <w:right w:val="single" w:color="CCCCCC" w:sz="1"/>
+            </w:tcBorders>
+            <w:shd w:fill="F2F7FB" w:val="clear"/>
+            <w:tcMar>
+              <w:top w:type="dxa" w:w="60"/>
+              <w:left w:type="dxa" w:w="100"/>
+              <w:bottom w:type="dxa" w:w="60"/>
+              <w:right w:type="dxa" w:w="100"/>
+            </w:tcMar>
+          </w:tcPr>
+          <w:p>
+            <w:pPr>
+              <w:spacing w:after="0" w:before="0"/>
+            </w:pPr>
+            <w:r>
+              <w:rPr>
+                <w:rFonts w:ascii="Arial" w:cs="Arial" w:eastAsia="Arial" w:hAnsi="Arial"/>
+                <w:color w:val="333333"/>
+                <w:sz w:val="18"/>
+                <w:szCs w:val="18"/>
+              </w:rPr>
+              <w:t xml:space="preserve">QA has veto power at impl-to-release gate</w:t>
+            </w:r>
+          </w:p>
+        </w:tc>
+      </w:tr>
+      <w:tr>
+        <w:tc>
+          <w:tcPr>
+            <w:tcW w:type="dxa" w:w="2800"/>
+            <w:tcBorders>
+              <w:top w:val="single" w:color="CCCCCC" w:sz="1"/>
+              <w:left w:val="single" w:color="CCCCCC" w:sz="1"/>
+              <w:bottom w:val="single" w:color="CCCCCC" w:sz="1"/>
+              <w:right w:val="single" w:color="CCCCCC" w:sz="1"/>
+            </w:tcBorders>
+            <w:tcMar>
+              <w:top w:type="dxa" w:w="60"/>
+              <w:left w:type="dxa" w:w="100"/>
+              <w:bottom w:type="dxa" w:w="60"/>
+              <w:right w:type="dxa" w:w="100"/>
+            </w:tcMar>
+          </w:tcPr>
+          <w:p>
+            <w:pPr>
+              <w:spacing w:after="0" w:before="0"/>
+            </w:pPr>
+            <w:r>
+              <w:rPr>
+                <w:rFonts w:ascii="Arial" w:cs="Arial" w:eastAsia="Arial" w:hAnsi="Arial"/>
+                <w:color w:val="333333"/>
+                <w:sz w:val="18"/>
+                <w:szCs w:val="18"/>
+              </w:rPr>
+              <w:t xml:space="preserve">design-implementation</w:t>
+            </w:r>
+          </w:p>
+        </w:tc>
+        <w:tc>
+          <w:tcPr>
+            <w:tcW w:type="dxa" w:w="2800"/>
+            <w:tcBorders>
+              <w:top w:val="single" w:color="CCCCCC" w:sz="1"/>
+              <w:left w:val="single" w:color="CCCCCC" w:sz="1"/>
+              <w:bottom w:val="single" w:color="CCCCCC" w:sz="1"/>
+              <w:right w:val="single" w:color="CCCCCC" w:sz="1"/>
+            </w:tcBorders>
+            <w:tcMar>
+              <w:top w:type="dxa" w:w="60"/>
+              <w:left w:type="dxa" w:w="100"/>
+              <w:bottom w:type="dxa" w:w="60"/>
+              <w:right w:type="dxa" w:w="100"/>
+            </w:tcMar>
+          </w:tcPr>
+          <w:p>
+            <w:pPr>
+              <w:spacing w:after="0" w:before="0"/>
+            </w:pPr>
+            <w:r>
+              <w:rPr>
+                <w:rFonts w:ascii="Arial" w:cs="Arial" w:eastAsia="Arial" w:hAnsi="Arial"/>
+                <w:color w:val="333333"/>
+                <w:sz w:val="18"/>
+                <w:szCs w:val="18"/>
+              </w:rPr>
+              <w:t xml:space="preserve">Designer</w:t>
+            </w:r>
+          </w:p>
+        </w:tc>
+        <w:tc>
+          <w:tcPr>
+            <w:tcW w:type="dxa" w:w="3760"/>
+            <w:tcBorders>
+              <w:top w:val="single" w:color="CCCCCC" w:sz="1"/>
+              <w:left w:val="single" w:color="CCCCCC" w:sz="1"/>
+              <w:bottom w:val="single" w:color="CCCCCC" w:sz="1"/>
+              <w:right w:val="single" w:color="CCCCCC" w:sz="1"/>
+            </w:tcBorders>
+            <w:tcMar>
+              <w:top w:type="dxa" w:w="60"/>
+              <w:left w:type="dxa" w:w="100"/>
+              <w:bottom w:type="dxa" w:w="60"/>
+              <w:right w:type="dxa" w:w="100"/>
+            </w:tcMar>
+          </w:tcPr>
+          <w:p>
+            <w:pPr>
+              <w:spacing w:after="0" w:before="0"/>
+            </w:pPr>
+            <w:r>
+              <w:rPr>
+                <w:rFonts w:ascii="Arial" w:cs="Arial" w:eastAsia="Arial" w:hAnsi="Arial"/>
+                <w:color w:val="333333"/>
+                <w:sz w:val="18"/>
+                <w:szCs w:val="18"/>
+              </w:rPr>
+              <w:t xml:space="preserve">Developer reviews code output; QA reviews visual fidelity</w:t>
+            </w:r>
+          </w:p>
+        </w:tc>
+      </w:tr>
+      <w:tr>
+        <w:tc>
+          <w:tcPr>
+            <w:tcW w:type="dxa" w:w="2800"/>
+            <w:tcBorders>
+              <w:top w:val="single" w:color="CCCCCC" w:sz="1"/>
+              <w:left w:val="single" w:color="CCCCCC" w:sz="1"/>
+              <w:bottom w:val="single" w:color="CCCCCC" w:sz="1"/>
+              <w:right w:val="single" w:color="CCCCCC" w:sz="1"/>
+            </w:tcBorders>
+            <w:shd w:fill="F2F7FB" w:val="clear"/>
+            <w:tcMar>
+              <w:top w:type="dxa" w:w="60"/>
+              <w:left w:type="dxa" w:w="100"/>
+              <w:bottom w:type="dxa" w:w="60"/>
+              <w:right w:type="dxa" w:w="100"/>
+            </w:tcMar>
+          </w:tcPr>
+          <w:p>
+            <w:pPr>
+              <w:spacing w:after="0" w:before="0"/>
+            </w:pPr>
+            <w:r>
+              <w:rPr>
+                <w:rFonts w:ascii="Arial" w:cs="Arial" w:eastAsia="Arial" w:hAnsi="Arial"/>
+                <w:color w:val="333333"/>
+                <w:sz w:val="18"/>
+                <w:szCs w:val="18"/>
+              </w:rPr>
+              <w:t xml:space="preserve">bug-to-fix</w:t>
+            </w:r>
+          </w:p>
+        </w:tc>
+        <w:tc>
+          <w:tcPr>
+            <w:tcW w:type="dxa" w:w="2800"/>
+            <w:tcBorders>
+              <w:top w:val="single" w:color="CCCCCC" w:sz="1"/>
+              <w:left w:val="single" w:color="CCCCCC" w:sz="1"/>
+              <w:bottom w:val="single" w:color="CCCCCC" w:sz="1"/>
+              <w:right w:val="single" w:color="CCCCCC" w:sz="1"/>
+            </w:tcBorders>
+            <w:shd w:fill="F2F7FB" w:val="clear"/>
+            <w:tcMar>
+              <w:top w:type="dxa" w:w="60"/>
+              <w:left w:type="dxa" w:w="100"/>
+              <w:bottom w:type="dxa" w:w="60"/>
+              <w:right w:type="dxa" w:w="100"/>
+            </w:tcMar>
+          </w:tcPr>
+          <w:p>
+            <w:pPr>
+              <w:spacing w:after="0" w:before="0"/>
+            </w:pPr>
+            <w:r>
+              <w:rPr>
+                <w:rFonts w:ascii="Arial" w:cs="Arial" w:eastAsia="Arial" w:hAnsi="Arial"/>
+                <w:color w:val="333333"/>
+                <w:sz w:val="18"/>
+                <w:szCs w:val="18"/>
+              </w:rPr>
+              <w:t xml:space="preserve">QA or Product Owner</w:t>
+            </w:r>
+          </w:p>
+        </w:tc>
+        <w:tc>
+          <w:tcPr>
+            <w:tcW w:type="dxa" w:w="3760"/>
+            <w:tcBorders>
+              <w:top w:val="single" w:color="CCCCCC" w:sz="1"/>
+              <w:left w:val="single" w:color="CCCCCC" w:sz="1"/>
+              <w:bottom w:val="single" w:color="CCCCCC" w:sz="1"/>
+              <w:right w:val="single" w:color="CCCCCC" w:sz="1"/>
+            </w:tcBorders>
+            <w:shd w:fill="F2F7FB" w:val="clear"/>
+            <w:tcMar>
+              <w:top w:type="dxa" w:w="60"/>
+              <w:left w:type="dxa" w:w="100"/>
+              <w:bottom w:type="dxa" w:w="60"/>
+              <w:right w:type="dxa" w:w="100"/>
+            </w:tcMar>
+          </w:tcPr>
+          <w:p>
+            <w:pPr>
+              <w:spacing w:after="0" w:before="0"/>
+            </w:pPr>
+            <w:r>
+              <w:rPr>
+                <w:rFonts w:ascii="Arial" w:cs="Arial" w:eastAsia="Arial" w:hAnsi="Arial"/>
+                <w:color w:val="333333"/>
+                <w:sz w:val="18"/>
+                <w:szCs w:val="18"/>
+              </w:rPr>
+              <w:t xml:space="preserve">Developer triages the output report</w:t>
+            </w:r>
+          </w:p>
+        </w:tc>
+      </w:tr>
+    </w:tbl>
     <w:p>
       <w:pPr>
         <w:pStyle w:val="Heading2"/>
@@ -1729,7 +3025,158 @@
           <w:sz w:val="26"/>
           <w:szCs w:val="26"/>
         </w:rPr>
-        <w:t xml:space="preserve">3.3 What Gets Installed</w:t>
+        <w:t xml:space="preserve">3.3 HITL Gate Protocol</w:t>
+      </w:r>
+    </w:p>
+    <w:p>
+      <w:pPr>
+        <w:spacing w:after="80" w:before="80"/>
+      </w:pPr>
+      <w:r>
+        <w:rPr>
+          <w:rFonts w:ascii="Arial" w:cs="Arial" w:eastAsia="Arial" w:hAnsi="Arial"/>
+          <w:sz w:val="22"/>
+          <w:szCs w:val="22"/>
+        </w:rPr>
+        <w:t xml:space="preserve">When a pipeline pauses at a human-in-the-loop (HITL) gate, the following protocol applies:</w:t>
+      </w:r>
+    </w:p>
+    <w:p>
+      <w:pPr>
+        <w:pStyle w:val="ListParagraph"/>
+        <w:numPr>
+          <w:ilvl w:val="0"/>
+          <w:numId w:val="3"/>
+        </w:numPr>
+        <w:spacing w:after="40" w:before="40"/>
+      </w:pPr>
+      <w:r>
+        <w:rPr>
+          <w:rFonts w:ascii="Arial" w:cs="Arial" w:eastAsia="Arial" w:hAnsi="Arial"/>
+          <w:sz w:val="22"/>
+          <w:szCs w:val="22"/>
+        </w:rPr>
+        <w:t xml:space="preserve">The gate creates a report in the reports/ directory with findings and a recommendation</w:t>
+      </w:r>
+    </w:p>
+    <w:p>
+      <w:pPr>
+        <w:pStyle w:val="ListParagraph"/>
+        <w:numPr>
+          <w:ilvl w:val="0"/>
+          <w:numId w:val="3"/>
+        </w:numPr>
+        <w:spacing w:after="40" w:before="40"/>
+      </w:pPr>
+      <w:r>
+        <w:rPr>
+          <w:rFonts w:ascii="Arial" w:cs="Arial" w:eastAsia="Arial" w:hAnsi="Arial"/>
+          <w:sz w:val="22"/>
+          <w:szCs w:val="22"/>
+        </w:rPr>
+        <w:t xml:space="preserve">The pipeline runner posts the report link to the team channel (Slack, Teams, or equivalent)</w:t>
+      </w:r>
+    </w:p>
+    <w:p>
+      <w:pPr>
+        <w:pStyle w:val="ListParagraph"/>
+        <w:numPr>
+          <w:ilvl w:val="0"/>
+          <w:numId w:val="3"/>
+        </w:numPr>
+        <w:spacing w:after="40" w:before="40"/>
+      </w:pPr>
+      <w:r>
+        <w:rPr>
+          <w:rFonts w:ascii="Arial" w:cs="Arial" w:eastAsia="Arial" w:hAnsi="Arial"/>
+          <w:sz w:val="22"/>
+          <w:szCs w:val="22"/>
+        </w:rPr>
+        <w:t xml:space="preserve">The designated approver has 4 business hours to respond</w:t>
+      </w:r>
+    </w:p>
+    <w:p>
+      <w:pPr>
+        <w:pStyle w:val="ListParagraph"/>
+        <w:numPr>
+          <w:ilvl w:val="0"/>
+          <w:numId w:val="3"/>
+        </w:numPr>
+        <w:spacing w:after="40" w:before="40"/>
+      </w:pPr>
+      <w:r>
+        <w:rPr>
+          <w:rFonts w:ascii="Arial" w:cs="Arial" w:eastAsia="Arial" w:hAnsi="Arial"/>
+          <w:sz w:val="22"/>
+          <w:szCs w:val="22"/>
+        </w:rPr>
+        <w:t xml:space="preserve">Approval: the approver resumes the pipeline with /run-pipeline &lt;pipeline&gt; --resume</w:t>
+      </w:r>
+    </w:p>
+    <w:p>
+      <w:pPr>
+        <w:pStyle w:val="ListParagraph"/>
+        <w:numPr>
+          <w:ilvl w:val="0"/>
+          <w:numId w:val="3"/>
+        </w:numPr>
+        <w:spacing w:after="40" w:before="40"/>
+      </w:pPr>
+      <w:r>
+        <w:rPr>
+          <w:rFonts w:ascii="Arial" w:cs="Arial" w:eastAsia="Arial" w:hAnsi="Arial"/>
+          <w:sz w:val="22"/>
+          <w:szCs w:val="22"/>
+        </w:rPr>
+        <w:t xml:space="preserve">Rejection: the approver adds a comment explaining why, which feeds back into the fix step</w:t>
+      </w:r>
+    </w:p>
+    <w:p>
+      <w:pPr>
+        <w:pStyle w:val="ListParagraph"/>
+        <w:numPr>
+          <w:ilvl w:val="0"/>
+          <w:numId w:val="3"/>
+        </w:numPr>
+        <w:spacing w:after="40" w:before="40"/>
+      </w:pPr>
+      <w:r>
+        <w:rPr>
+          <w:rFonts w:ascii="Arial" w:cs="Arial" w:eastAsia="Arial" w:hAnsi="Arial"/>
+          <w:sz w:val="22"/>
+          <w:szCs w:val="22"/>
+        </w:rPr>
+        <w:t xml:space="preserve">No response within 4 hours: the scrum master escalates to the tech lead</w:t>
+      </w:r>
+    </w:p>
+    <w:p>
+      <w:pPr>
+        <w:pStyle w:val="Heading2"/>
+        <w:spacing w:after="160" w:before="280"/>
+      </w:pPr>
+      <w:r>
+        <w:rPr>
+          <w:rFonts w:ascii="Arial" w:cs="Arial" w:eastAsia="Arial" w:hAnsi="Arial"/>
+          <w:b/>
+          <w:bCs/>
+          <w:color w:val="2E75B6"/>
+          <w:sz w:val="26"/>
+          <w:szCs w:val="26"/>
+        </w:rPr>
+        <w:t xml:space="preserve">3.4 Gate Profile Rules</w:t>
+      </w:r>
+    </w:p>
+    <w:p>
+      <w:pPr>
+        <w:spacing w:after="80" w:before="80"/>
+      </w:pPr>
+      <w:r>
+        <w:rPr>
+          <w:rFonts w:ascii="Arial" w:cs="Arial" w:eastAsia="Arial" w:hAnsi="Arial"/>
+          <w:sz w:val="22"/>
+          <w:szCs w:val="22"/>
+        </w:rPr>
+        <w:t xml:space="preserve">Gate profiles are not optional or up to individual discretion. The team follows these rules:</w:t>
       </w:r>
     </w:p>
     <w:p>
@@ -1747,7 +3194,7 @@
           <w:sz w:val="22"/>
           <w:szCs w:val="22"/>
         </w:rPr>
-        <w:t xml:space="preserve">Skill files — transformed by the adapter into agent-native format</w:t>
+        <w:t xml:space="preserve">minimal — only for spikes and throwaway prototypes. Anything merged to main must use standard at minimum.</w:t>
       </w:r>
     </w:p>
     <w:p>
@@ -1765,7 +3212,7 @@
           <w:sz w:val="22"/>
           <w:szCs w:val="22"/>
         </w:rPr>
-        <w:t xml:space="preserve">Pipeline YAMLs — copied to the agent’s pipelines/ directory (agent-agnostic)</w:t>
+        <w:t xml:space="preserve">standard — the default for all Tier 2 and Tier 3 work on feature branches.</w:t>
       </w:r>
     </w:p>
     <w:p>
@@ -1783,7 +3230,50 @@
           <w:sz w:val="22"/>
           <w:szCs w:val="22"/>
         </w:rPr>
-        <w:t xml:space="preserve">Pipeline engine — PIPELINE-RUNNER.md and PROGRESS-TEMPLATE.md</w:t>
+        <w:t xml:space="preserve">strict — mandatory for release branches and any Tier 3 work touching security, authentication, payments, PII, or public APIs.</w:t>
+      </w:r>
+    </w:p>
+    <w:p>
+      <w:pPr>
+        <w:spacing w:after="80" w:before="80"/>
+      </w:pPr>
+      <w:r>
+        <w:rPr>
+          <w:rFonts w:ascii="Arial" w:cs="Arial" w:eastAsia="Arial" w:hAnsi="Arial"/>
+          <w:sz w:val="22"/>
+          <w:szCs w:val="22"/>
+        </w:rPr>
+        <w:t xml:space="preserve">The tech lead can downgrade a gate profile for a specific PR, but must document the reason in the PR description.</w:t>
+      </w:r>
+    </w:p>
+    <w:p>
+      <w:pPr>
+        <w:pStyle w:val="Heading2"/>
+        <w:spacing w:after="160" w:before="280"/>
+      </w:pPr>
+      <w:r>
+        <w:rPr>
+          <w:rFonts w:ascii="Arial" w:cs="Arial" w:eastAsia="Arial" w:hAnsi="Arial"/>
+          <w:b/>
+          <w:bCs/>
+          <w:color w:val="2E75B6"/>
+          <w:sz w:val="26"/>
+          <w:szCs w:val="26"/>
+        </w:rPr>
+        <w:t xml:space="preserve">3.5 Git Workflow Conventions</w:t>
+      </w:r>
+    </w:p>
+    <w:p>
+      <w:pPr>
+        <w:spacing w:after="80" w:before="80"/>
+      </w:pPr>
+      <w:r>
+        <w:rPr>
+          <w:rFonts w:ascii="Arial" w:cs="Arial" w:eastAsia="Arial" w:hAnsi="Arial"/>
+          <w:sz w:val="22"/>
+          <w:szCs w:val="22"/>
+        </w:rPr>
+        <w:t xml:space="preserve">Branch naming encodes the work tier for immediate context:</w:t>
       </w:r>
     </w:p>
     <w:p>
@@ -1801,7 +3291,7 @@
           <w:sz w:val="22"/>
           <w:szCs w:val="22"/>
         </w:rPr>
-        <w:t xml:space="preserve">Configuration — gate-config.json and balance-sheet-config.json (never overwritten)</w:t>
+        <w:t xml:space="preserve">Tier 1: fix/&lt;issue-id&gt;-&lt;slug&gt; (e.g., fix/1234-typo-in-header)</w:t>
       </w:r>
     </w:p>
     <w:p>
@@ -1819,7 +3309,7 @@
           <w:sz w:val="22"/>
           <w:szCs w:val="22"/>
         </w:rPr>
-        <w:t xml:space="preserve">Tracking file — .sdlc-installed.json records installed roles, agent, and version</w:t>
+        <w:t xml:space="preserve">Tier 2: feat/T2-&lt;spec-id&gt;-&lt;slug&gt; (e.g., feat/T2-spec-042-dark-mode)</w:t>
       </w:r>
     </w:p>
     <w:p>
@@ -1837,7 +3327,38 @@
           <w:sz w:val="22"/>
           <w:szCs w:val="22"/>
         </w:rPr>
-        <w:t xml:space="preserve">MCP config — .mcp.json for Figma integration (designer role)</w:t>
+        <w:t xml:space="preserve">Tier 3: feat/T3-&lt;spec-id&gt;-&lt;slug&gt; (e.g., feat/T3-spec-051-payment-redesign)</w:t>
+      </w:r>
+    </w:p>
+    <w:p>
+      <w:pPr>
+        <w:pStyle w:val="ListParagraph"/>
+        <w:numPr>
+          <w:ilvl w:val="0"/>
+          <w:numId w:val="2"/>
+        </w:numPr>
+        <w:spacing w:after="40" w:before="40"/>
+      </w:pPr>
+      <w:r>
+        <w:rPr>
+          <w:rFonts w:ascii="Arial" w:cs="Arial" w:eastAsia="Arial" w:hAnsi="Arial"/>
+          <w:sz w:val="22"/>
+          <w:szCs w:val="22"/>
+        </w:rPr>
+        <w:t xml:space="preserve">Spikes: spike/&lt;topic&gt; (e.g., spike/graphql-evaluation)</w:t>
+      </w:r>
+    </w:p>
+    <w:p>
+      <w:pPr>
+        <w:spacing w:after="80" w:before="80"/>
+      </w:pPr>
+      <w:r>
+        <w:rPr>
+          <w:rFonts w:ascii="Arial" w:cs="Arial" w:eastAsia="Arial" w:hAnsi="Arial"/>
+          <w:sz w:val="22"/>
+          <w:szCs w:val="22"/>
+        </w:rPr>
+        <w:t xml:space="preserve">Spec files and plan files are committed to the feature branch — they are reviewable documentation, not throwaway output. Pipeline state (.claude/pipelines/) is gitignored. PR descriptions must reference the pipeline used and the final quality gate score.</w:t>
       </w:r>
     </w:p>
     <w:p>
@@ -1854,35 +3375,375 @@
           <w:sz w:val="26"/>
           <w:szCs w:val="26"/>
         </w:rPr>
-        <w:t xml:space="preserve">3.4 Updating</w:t>
-      </w:r>
-    </w:p>
-    <w:p>
-      <w:pPr>
-        <w:spacing w:after="60" w:before="60"/>
-        <w:ind w:left="360"/>
-      </w:pPr>
-      <w:r>
-        <w:rPr>
-          <w:rFonts w:ascii="Courier New" w:cs="Courier New" w:eastAsia="Courier New" w:hAnsi="Courier New"/>
+        <w:t xml:space="preserve">3.6 Daily Rhythm by Role</w:t>
+      </w:r>
+    </w:p>
+    <w:p>
+      <w:pPr>
+        <w:spacing w:after="80" w:before="80"/>
+      </w:pPr>
+      <w:r>
+        <w:rPr>
+          <w:rFonts w:ascii="Arial" w:cs="Arial" w:eastAsia="Arial" w:hAnsi="Arial"/>
+          <w:sz w:val="22"/>
+          <w:szCs w:val="22"/>
+        </w:rPr>
+        <w:t xml:space="preserve">These are not optional habits — they should be calendar-blocked:</w:t>
+      </w:r>
+    </w:p>
+    <w:p>
+      <w:pPr>
+        <w:pStyle w:val="Heading3"/>
+        <w:spacing w:after="120" w:before="200"/>
+      </w:pPr>
+      <w:r>
+        <w:rPr>
+          <w:rFonts w:ascii="Arial" w:cs="Arial" w:eastAsia="Arial" w:hAnsi="Arial"/>
+          <w:b/>
+          <w:bCs/>
           <w:color w:val="444444"/>
-          <w:sz w:val="20"/>
-          <w:szCs w:val="20"/>
-        </w:rPr>
-        <w:t xml:space="preserve">bash setup/update.sh</w:t>
-      </w:r>
-    </w:p>
-    <w:p>
-      <w:pPr>
-        <w:spacing w:after="80" w:before="80"/>
-      </w:pPr>
-      <w:r>
-        <w:rPr>
-          <w:rFonts w:ascii="Arial" w:cs="Arial" w:eastAsia="Arial" w:hAnsi="Arial"/>
-          <w:sz w:val="22"/>
-          <w:szCs w:val="22"/>
-        </w:rPr>
-        <w:t xml:space="preserve">Reads the tracking file, re-runs the installer, and preserves existing configuration files.</w:t>
+          <w:sz w:val="22"/>
+          <w:szCs w:val="22"/>
+        </w:rPr>
+        <w:t xml:space="preserve">Developer</w:t>
+      </w:r>
+    </w:p>
+    <w:p>
+      <w:pPr>
+        <w:pStyle w:val="ListParagraph"/>
+        <w:numPr>
+          <w:ilvl w:val="0"/>
+          <w:numId w:val="2"/>
+        </w:numPr>
+        <w:spacing w:after="40" w:before="40"/>
+      </w:pPr>
+      <w:r>
+        <w:rPr>
+          <w:rFonts w:ascii="Arial" w:cs="Arial" w:eastAsia="Arial" w:hAnsi="Arial"/>
+          <w:sz w:val="22"/>
+          <w:szCs w:val="22"/>
+        </w:rPr>
+        <w:t xml:space="preserve">Start of day: run /run-pipeline --resume on any paused pipelines</w:t>
+      </w:r>
+    </w:p>
+    <w:p>
+      <w:pPr>
+        <w:pStyle w:val="ListParagraph"/>
+        <w:numPr>
+          <w:ilvl w:val="0"/>
+          <w:numId w:val="2"/>
+        </w:numPr>
+        <w:spacing w:after="40" w:before="40"/>
+      </w:pPr>
+      <w:r>
+        <w:rPr>
+          <w:rFonts w:ascii="Arial" w:cs="Arial" w:eastAsia="Arial" w:hAnsi="Arial"/>
+          <w:sz w:val="22"/>
+          <w:szCs w:val="22"/>
+        </w:rPr>
+        <w:t xml:space="preserve">Pick up tasks from the board; run the appropriate pipeline for the tier</w:t>
+      </w:r>
+    </w:p>
+    <w:p>
+      <w:pPr>
+        <w:pStyle w:val="ListParagraph"/>
+        <w:numPr>
+          <w:ilvl w:val="0"/>
+          <w:numId w:val="2"/>
+        </w:numPr>
+        <w:spacing w:after="40" w:before="40"/>
+      </w:pPr>
+      <w:r>
+        <w:rPr>
+          <w:rFonts w:ascii="Arial" w:cs="Arial" w:eastAsia="Arial" w:hAnsi="Arial"/>
+          <w:sz w:val="22"/>
+          <w:szCs w:val="22"/>
+        </w:rPr>
+        <w:t xml:space="preserve">End of day: commit work-in-progress; pipeline state auto-saves for resume</w:t>
+      </w:r>
+    </w:p>
+    <w:p>
+      <w:pPr>
+        <w:pStyle w:val="Heading3"/>
+        <w:spacing w:after="120" w:before="200"/>
+      </w:pPr>
+      <w:r>
+        <w:rPr>
+          <w:rFonts w:ascii="Arial" w:cs="Arial" w:eastAsia="Arial" w:hAnsi="Arial"/>
+          <w:b/>
+          <w:bCs/>
+          <w:color w:val="444444"/>
+          <w:sz w:val="22"/>
+          <w:szCs w:val="22"/>
+        </w:rPr>
+        <w:t xml:space="preserve">Product Owner</w:t>
+      </w:r>
+    </w:p>
+    <w:p>
+      <w:pPr>
+        <w:pStyle w:val="ListParagraph"/>
+        <w:numPr>
+          <w:ilvl w:val="0"/>
+          <w:numId w:val="2"/>
+        </w:numPr>
+        <w:spacing w:after="40" w:before="40"/>
+      </w:pPr>
+      <w:r>
+        <w:rPr>
+          <w:rFonts w:ascii="Arial" w:cs="Arial" w:eastAsia="Arial" w:hAnsi="Arial"/>
+          <w:sz w:val="22"/>
+          <w:szCs w:val="22"/>
+        </w:rPr>
+        <w:t xml:space="preserve">Monday morning: run /progress-summary weekly for the week-ahead view</w:t>
+      </w:r>
+    </w:p>
+    <w:p>
+      <w:pPr>
+        <w:pStyle w:val="ListParagraph"/>
+        <w:numPr>
+          <w:ilvl w:val="0"/>
+          <w:numId w:val="2"/>
+        </w:numPr>
+        <w:spacing w:after="40" w:before="40"/>
+      </w:pPr>
+      <w:r>
+        <w:rPr>
+          <w:rFonts w:ascii="Arial" w:cs="Arial" w:eastAsia="Arial" w:hAnsi="Arial"/>
+          <w:sz w:val="22"/>
+          <w:szCs w:val="22"/>
+        </w:rPr>
+        <w:t xml:space="preserve">Before any stakeholder meeting: run /run-pipeline product-owner/stakeholder-update</w:t>
+      </w:r>
+    </w:p>
+    <w:p>
+      <w:pPr>
+        <w:pStyle w:val="ListParagraph"/>
+        <w:numPr>
+          <w:ilvl w:val="0"/>
+          <w:numId w:val="2"/>
+        </w:numPr>
+        <w:spacing w:after="40" w:before="40"/>
+      </w:pPr>
+      <w:r>
+        <w:rPr>
+          <w:rFonts w:ascii="Arial" w:cs="Arial" w:eastAsia="Arial" w:hAnsi="Arial"/>
+          <w:sz w:val="22"/>
+          <w:szCs w:val="22"/>
+        </w:rPr>
+        <w:t xml:space="preserve">When a new idea arrives: run /run-pipeline product-owner/idea-to-spec immediately — don't let ideas sit as undocumented Slack messages</w:t>
+      </w:r>
+    </w:p>
+    <w:p>
+      <w:pPr>
+        <w:pStyle w:val="Heading3"/>
+        <w:spacing w:after="120" w:before="200"/>
+      </w:pPr>
+      <w:r>
+        <w:rPr>
+          <w:rFonts w:ascii="Arial" w:cs="Arial" w:eastAsia="Arial" w:hAnsi="Arial"/>
+          <w:b/>
+          <w:bCs/>
+          <w:color w:val="444444"/>
+          <w:sz w:val="22"/>
+          <w:szCs w:val="22"/>
+        </w:rPr>
+        <w:t xml:space="preserve">QA</w:t>
+      </w:r>
+    </w:p>
+    <w:p>
+      <w:pPr>
+        <w:pStyle w:val="ListParagraph"/>
+        <w:numPr>
+          <w:ilvl w:val="0"/>
+          <w:numId w:val="2"/>
+        </w:numPr>
+        <w:spacing w:after="40" w:before="40"/>
+      </w:pPr>
+      <w:r>
+        <w:rPr>
+          <w:rFonts w:ascii="Arial" w:cs="Arial" w:eastAsia="Arial" w:hAnsi="Arial"/>
+          <w:sz w:val="22"/>
+          <w:szCs w:val="22"/>
+        </w:rPr>
+        <w:t xml:space="preserve">When a bug is reported (by anyone): run /bug-report with the plain-English description before assigning to a developer</w:t>
+      </w:r>
+    </w:p>
+    <w:p>
+      <w:pPr>
+        <w:pStyle w:val="ListParagraph"/>
+        <w:numPr>
+          <w:ilvl w:val="0"/>
+          <w:numId w:val="2"/>
+        </w:numPr>
+        <w:spacing w:after="40" w:before="40"/>
+      </w:pPr>
+      <w:r>
+        <w:rPr>
+          <w:rFonts w:ascii="Arial" w:cs="Arial" w:eastAsia="Arial" w:hAnsi="Arial"/>
+          <w:sz w:val="22"/>
+          <w:szCs w:val="22"/>
+        </w:rPr>
+        <w:t xml:space="preserve">Before release: run /run-pipeline qa/release-validation</w:t>
+      </w:r>
+    </w:p>
+    <w:p>
+      <w:pPr>
+        <w:pStyle w:val="ListParagraph"/>
+        <w:numPr>
+          <w:ilvl w:val="0"/>
+          <w:numId w:val="2"/>
+        </w:numPr>
+        <w:spacing w:after="40" w:before="40"/>
+      </w:pPr>
+      <w:r>
+        <w:rPr>
+          <w:rFonts w:ascii="Arial" w:cs="Arial" w:eastAsia="Arial" w:hAnsi="Arial"/>
+          <w:sz w:val="22"/>
+          <w:szCs w:val="22"/>
+        </w:rPr>
+        <w:t xml:space="preserve">When investigating a reported issue: run /codebase-qa to understand the affected area before diving into code</w:t>
+      </w:r>
+    </w:p>
+    <w:p>
+      <w:pPr>
+        <w:pStyle w:val="Heading3"/>
+        <w:spacing w:after="120" w:before="200"/>
+      </w:pPr>
+      <w:r>
+        <w:rPr>
+          <w:rFonts w:ascii="Arial" w:cs="Arial" w:eastAsia="Arial" w:hAnsi="Arial"/>
+          <w:b/>
+          <w:bCs/>
+          <w:color w:val="444444"/>
+          <w:sz w:val="22"/>
+          <w:szCs w:val="22"/>
+        </w:rPr>
+        <w:t xml:space="preserve">Scrum Master</w:t>
+      </w:r>
+    </w:p>
+    <w:p>
+      <w:pPr>
+        <w:pStyle w:val="ListParagraph"/>
+        <w:numPr>
+          <w:ilvl w:val="0"/>
+          <w:numId w:val="2"/>
+        </w:numPr>
+        <w:spacing w:after="40" w:before="40"/>
+      </w:pPr>
+      <w:r>
+        <w:rPr>
+          <w:rFonts w:ascii="Arial" w:cs="Arial" w:eastAsia="Arial" w:hAnsi="Arial"/>
+          <w:sz w:val="22"/>
+          <w:szCs w:val="22"/>
+        </w:rPr>
+        <w:t xml:space="preserve">Last day of sprint: run /run-pipeline product-owner/sprint-demo to prepare the demo package</w:t>
+      </w:r>
+    </w:p>
+    <w:p>
+      <w:pPr>
+        <w:pStyle w:val="ListParagraph"/>
+        <w:numPr>
+          <w:ilvl w:val="0"/>
+          <w:numId w:val="2"/>
+        </w:numPr>
+        <w:spacing w:after="40" w:before="40"/>
+      </w:pPr>
+      <w:r>
+        <w:rPr>
+          <w:rFonts w:ascii="Arial" w:cs="Arial" w:eastAsia="Arial" w:hAnsi="Arial"/>
+          <w:sz w:val="22"/>
+          <w:szCs w:val="22"/>
+        </w:rPr>
+        <w:t xml:space="preserve">During standup: reference /progress-summary daily for objective status</w:t>
+      </w:r>
+    </w:p>
+    <w:p>
+      <w:pPr>
+        <w:pStyle w:val="ListParagraph"/>
+        <w:numPr>
+          <w:ilvl w:val="0"/>
+          <w:numId w:val="2"/>
+        </w:numPr>
+        <w:spacing w:after="40" w:before="40"/>
+      </w:pPr>
+      <w:r>
+        <w:rPr>
+          <w:rFonts w:ascii="Arial" w:cs="Arial" w:eastAsia="Arial" w:hAnsi="Arial"/>
+          <w:sz w:val="22"/>
+          <w:szCs w:val="22"/>
+        </w:rPr>
+        <w:t xml:space="preserve">When blockers are reported: run /codebase-qa to understand the technical context without needing a developer to explain</w:t>
+      </w:r>
+    </w:p>
+    <w:p>
+      <w:pPr>
+        <w:pStyle w:val="Heading3"/>
+        <w:spacing w:after="120" w:before="200"/>
+      </w:pPr>
+      <w:r>
+        <w:rPr>
+          <w:rFonts w:ascii="Arial" w:cs="Arial" w:eastAsia="Arial" w:hAnsi="Arial"/>
+          <w:b/>
+          <w:bCs/>
+          <w:color w:val="444444"/>
+          <w:sz w:val="22"/>
+          <w:szCs w:val="22"/>
+        </w:rPr>
+        <w:t xml:space="preserve">Designer</w:t>
+      </w:r>
+    </w:p>
+    <w:p>
+      <w:pPr>
+        <w:pStyle w:val="ListParagraph"/>
+        <w:numPr>
+          <w:ilvl w:val="0"/>
+          <w:numId w:val="2"/>
+        </w:numPr>
+        <w:spacing w:after="40" w:before="40"/>
+      </w:pPr>
+      <w:r>
+        <w:rPr>
+          <w:rFonts w:ascii="Arial" w:cs="Arial" w:eastAsia="Arial" w:hAnsi="Arial"/>
+          <w:sz w:val="22"/>
+          <w:szCs w:val="22"/>
+        </w:rPr>
+        <w:t xml:space="preserve">When a design is approved in Figma: run /run-pipeline designer/design-handoff to create the spec</w:t>
+      </w:r>
+    </w:p>
+    <w:p>
+      <w:pPr>
+        <w:pStyle w:val="ListParagraph"/>
+        <w:numPr>
+          <w:ilvl w:val="0"/>
+          <w:numId w:val="2"/>
+        </w:numPr>
+        <w:spacing w:after="40" w:before="40"/>
+      </w:pPr>
+      <w:r>
+        <w:rPr>
+          <w:rFonts w:ascii="Arial" w:cs="Arial" w:eastAsia="Arial" w:hAnsi="Arial"/>
+          <w:sz w:val="22"/>
+          <w:szCs w:val="22"/>
+        </w:rPr>
+        <w:t xml:space="preserve">After token updates in Figma: run /run-pipeline designer/design-system-sync</w:t>
+      </w:r>
+    </w:p>
+    <w:p>
+      <w:pPr>
+        <w:pStyle w:val="ListParagraph"/>
+        <w:numPr>
+          <w:ilvl w:val="0"/>
+          <w:numId w:val="2"/>
+        </w:numPr>
+        <w:spacing w:after="40" w:before="40"/>
+      </w:pPr>
+      <w:r>
+        <w:rPr>
+          <w:rFonts w:ascii="Arial" w:cs="Arial" w:eastAsia="Arial" w:hAnsi="Arial"/>
+          <w:sz w:val="22"/>
+          <w:szCs w:val="22"/>
+        </w:rPr>
+        <w:t xml:space="preserve">Before sprint review: run /changelog-plain to understand what was shipped in non-technical terms</w:t>
       </w:r>
     </w:p>
     <w:p>
@@ -1899,22 +3760,7 @@
           <w:sz w:val="26"/>
           <w:szCs w:val="26"/>
         </w:rPr>
-        <w:t xml:space="preserve">3.5 Uninstalling</w:t>
-      </w:r>
-    </w:p>
-    <w:p>
-      <w:pPr>
-        <w:spacing w:after="60" w:before="60"/>
-        <w:ind w:left="360"/>
-      </w:pPr>
-      <w:r>
-        <w:rPr>
-          <w:rFonts w:ascii="Courier New" w:cs="Courier New" w:eastAsia="Courier New" w:hAnsi="Courier New"/>
-          <w:color w:val="444444"/>
-          <w:sz w:val="20"/>
-          <w:szCs w:val="20"/>
-        </w:rPr>
-        <w:t xml:space="preserve">bash setup/uninstall.sh</w:t>
+        <w:t xml:space="preserve">3.7 Bridge Skill Conventions</w:t>
       </w:r>
     </w:p>
     <w:p>
@@ -1927,7 +3773,1082 @@
           <w:sz w:val="22"/>
           <w:szCs w:val="22"/>
         </w:rPr>
-        <w:t xml:space="preserve">Removes skills, pipelines, config, and the tracking file. Preserves CLAUDE.md.</w:t>
+        <w:t xml:space="preserve">Non-technical team members should follow these conventions to reduce interruptions and improve information flow:</w:t>
+      </w:r>
+    </w:p>
+    <w:p>
+      <w:pPr>
+        <w:pStyle w:val="ListParagraph"/>
+        <w:numPr>
+          <w:ilvl w:val="0"/>
+          <w:numId w:val="2"/>
+        </w:numPr>
+        <w:spacing w:after="40" w:before="40"/>
+      </w:pPr>
+      <w:r>
+        <w:rPr>
+          <w:rFonts w:ascii="Arial" w:cs="Arial" w:eastAsia="Arial" w:hAnsi="Arial"/>
+          <w:sz w:val="22"/>
+          <w:szCs w:val="22"/>
+        </w:rPr>
+        <w:t xml:space="preserve">Before asking a developer 'how does X work?': run /codebase-qa first. It answers 80% of questions instantly.</w:t>
+      </w:r>
+    </w:p>
+    <w:p>
+      <w:pPr>
+        <w:pStyle w:val="ListParagraph"/>
+        <w:numPr>
+          <w:ilvl w:val="0"/>
+          <w:numId w:val="2"/>
+        </w:numPr>
+        <w:spacing w:after="40" w:before="40"/>
+      </w:pPr>
+      <w:r>
+        <w:rPr>
+          <w:rFonts w:ascii="Arial" w:cs="Arial" w:eastAsia="Arial" w:hAnsi="Arial"/>
+          <w:sz w:val="22"/>
+          <w:szCs w:val="22"/>
+        </w:rPr>
+        <w:t xml:space="preserve">All bug reports go through /bug-report: no more Slack messages saying 'something is broken.' The structured output goes straight to the issue tracker.</w:t>
+      </w:r>
+    </w:p>
+    <w:p>
+      <w:pPr>
+        <w:pStyle w:val="ListParagraph"/>
+        <w:numPr>
+          <w:ilvl w:val="0"/>
+          <w:numId w:val="2"/>
+        </w:numPr>
+        <w:spacing w:after="40" w:before="40"/>
+      </w:pPr>
+      <w:r>
+        <w:rPr>
+          <w:rFonts w:ascii="Arial" w:cs="Arial" w:eastAsia="Arial" w:hAnsi="Arial"/>
+          <w:sz w:val="22"/>
+          <w:szCs w:val="22"/>
+        </w:rPr>
+        <w:t xml:space="preserve">Stakeholder updates come from /progress-summary, not from memory: this prevents inflated or incomplete status reports.</w:t>
+      </w:r>
+    </w:p>
+    <w:p>
+      <w:pPr>
+        <w:pStyle w:val="ListParagraph"/>
+        <w:numPr>
+          <w:ilvl w:val="0"/>
+          <w:numId w:val="2"/>
+        </w:numPr>
+        <w:spacing w:after="40" w:before="40"/>
+      </w:pPr>
+      <w:r>
+        <w:rPr>
+          <w:rFonts w:ascii="Arial" w:cs="Arial" w:eastAsia="Arial" w:hAnsi="Arial"/>
+          <w:sz w:val="22"/>
+          <w:szCs w:val="22"/>
+        </w:rPr>
+        <w:t xml:space="preserve">Sprint demo scripts come from /demo-prep: the presenter gets a click path, talking points, and landmine warnings — no more awkward live debugging during demos.</w:t>
+      </w:r>
+    </w:p>
+    <w:p>
+      <w:pPr>
+        <w:pStyle w:val="ListParagraph"/>
+        <w:numPr>
+          <w:ilvl w:val="0"/>
+          <w:numId w:val="2"/>
+        </w:numPr>
+        <w:spacing w:after="40" w:before="40"/>
+      </w:pPr>
+      <w:r>
+        <w:rPr>
+          <w:rFonts w:ascii="Arial" w:cs="Arial" w:eastAsia="Arial" w:hAnsi="Arial"/>
+          <w:sz w:val="22"/>
+          <w:szCs w:val="22"/>
+        </w:rPr>
+        <w:t xml:space="preserve">Feature ideas go through /user-story-refiner before discussion: this ensures every idea has a Who/What/Why, acceptance criteria, and scope boundaries before it reaches the backlog refinement meeting.</w:t>
+      </w:r>
+    </w:p>
+    <w:p>
+      <w:pPr>
+        <w:pStyle w:val="Heading2"/>
+        <w:spacing w:after="160" w:before="280"/>
+      </w:pPr>
+      <w:r>
+        <w:rPr>
+          <w:rFonts w:ascii="Arial" w:cs="Arial" w:eastAsia="Arial" w:hAnsi="Arial"/>
+          <w:b/>
+          <w:bCs/>
+          <w:color w:val="2E75B6"/>
+          <w:sz w:val="26"/>
+          <w:szCs w:val="26"/>
+        </w:rPr>
+        <w:t xml:space="preserve">3.8 Review Cadence</w:t>
+      </w:r>
+    </w:p>
+    <w:p>
+      <w:pPr>
+        <w:spacing w:after="80" w:before="80"/>
+      </w:pPr>
+      <w:r>
+        <w:rPr>
+          <w:rFonts w:ascii="Arial" w:cs="Arial" w:eastAsia="Arial" w:hAnsi="Arial"/>
+          <w:sz w:val="22"/>
+          <w:szCs w:val="22"/>
+        </w:rPr>
+        <w:t xml:space="preserve">The following reviews run on a fixed schedule, independent of sprint work:</w:t>
+      </w:r>
+    </w:p>
+    <w:tbl>
+      <w:tblPr>
+        <w:tblW w:type="dxa" w:w="9360"/>
+        <w:tblBorders>
+          <w:top w:val="single" w:color="auto" w:sz="4"/>
+          <w:left w:val="single" w:color="auto" w:sz="4"/>
+          <w:bottom w:val="single" w:color="auto" w:sz="4"/>
+          <w:right w:val="single" w:color="auto" w:sz="4"/>
+          <w:insideH w:val="single" w:color="auto" w:sz="4"/>
+          <w:insideV w:val="single" w:color="auto" w:sz="4"/>
+        </w:tblBorders>
+      </w:tblPr>
+      <w:tblGrid>
+        <w:gridCol w:w="1200"/>
+        <w:gridCol w:w="2600"/>
+        <w:gridCol w:w="2000"/>
+        <w:gridCol w:w="3560"/>
+      </w:tblGrid>
+      <w:tr>
+        <w:tc>
+          <w:tcPr>
+            <w:tcW w:type="dxa" w:w="1200"/>
+            <w:tcBorders>
+              <w:top w:val="single" w:color="2E75B6" w:sz="1"/>
+              <w:left w:val="single" w:color="2E75B6" w:sz="1"/>
+              <w:bottom w:val="single" w:color="2E75B6" w:sz="1"/>
+              <w:right w:val="single" w:color="2E75B6" w:sz="1"/>
+            </w:tcBorders>
+            <w:shd w:fill="2E75B6" w:val="clear"/>
+            <w:tcMar>
+              <w:top w:type="dxa" w:w="60"/>
+              <w:left w:type="dxa" w:w="100"/>
+              <w:bottom w:type="dxa" w:w="60"/>
+              <w:right w:type="dxa" w:w="100"/>
+            </w:tcMar>
+          </w:tcPr>
+          <w:p>
+            <w:pPr>
+              <w:spacing w:after="0" w:before="0"/>
+            </w:pPr>
+            <w:r>
+              <w:rPr>
+                <w:rFonts w:ascii="Arial" w:cs="Arial" w:eastAsia="Arial" w:hAnsi="Arial"/>
+                <w:b/>
+                <w:bCs/>
+                <w:color w:val="FFFFFF"/>
+                <w:sz w:val="18"/>
+                <w:szCs w:val="18"/>
+              </w:rPr>
+              <w:t xml:space="preserve">Cadence</w:t>
+            </w:r>
+          </w:p>
+        </w:tc>
+        <w:tc>
+          <w:tcPr>
+            <w:tcW w:type="dxa" w:w="2600"/>
+            <w:tcBorders>
+              <w:top w:val="single" w:color="2E75B6" w:sz="1"/>
+              <w:left w:val="single" w:color="2E75B6" w:sz="1"/>
+              <w:bottom w:val="single" w:color="2E75B6" w:sz="1"/>
+              <w:right w:val="single" w:color="2E75B6" w:sz="1"/>
+            </w:tcBorders>
+            <w:shd w:fill="2E75B6" w:val="clear"/>
+            <w:tcMar>
+              <w:top w:type="dxa" w:w="60"/>
+              <w:left w:type="dxa" w:w="100"/>
+              <w:bottom w:type="dxa" w:w="60"/>
+              <w:right w:type="dxa" w:w="100"/>
+            </w:tcMar>
+          </w:tcPr>
+          <w:p>
+            <w:pPr>
+              <w:spacing w:after="0" w:before="0"/>
+            </w:pPr>
+            <w:r>
+              <w:rPr>
+                <w:rFonts w:ascii="Arial" w:cs="Arial" w:eastAsia="Arial" w:hAnsi="Arial"/>
+                <w:b/>
+                <w:bCs/>
+                <w:color w:val="FFFFFF"/>
+                <w:sz w:val="18"/>
+                <w:szCs w:val="18"/>
+              </w:rPr>
+              <w:t xml:space="preserve">Skill / Pipeline</w:t>
+            </w:r>
+          </w:p>
+        </w:tc>
+        <w:tc>
+          <w:tcPr>
+            <w:tcW w:type="dxa" w:w="2000"/>
+            <w:tcBorders>
+              <w:top w:val="single" w:color="2E75B6" w:sz="1"/>
+              <w:left w:val="single" w:color="2E75B6" w:sz="1"/>
+              <w:bottom w:val="single" w:color="2E75B6" w:sz="1"/>
+              <w:right w:val="single" w:color="2E75B6" w:sz="1"/>
+            </w:tcBorders>
+            <w:shd w:fill="2E75B6" w:val="clear"/>
+            <w:tcMar>
+              <w:top w:type="dxa" w:w="60"/>
+              <w:left w:type="dxa" w:w="100"/>
+              <w:bottom w:type="dxa" w:w="60"/>
+              <w:right w:type="dxa" w:w="100"/>
+            </w:tcMar>
+          </w:tcPr>
+          <w:p>
+            <w:pPr>
+              <w:spacing w:after="0" w:before="0"/>
+            </w:pPr>
+            <w:r>
+              <w:rPr>
+                <w:rFonts w:ascii="Arial" w:cs="Arial" w:eastAsia="Arial" w:hAnsi="Arial"/>
+                <w:b/>
+                <w:bCs/>
+                <w:color w:val="FFFFFF"/>
+                <w:sz w:val="18"/>
+                <w:szCs w:val="18"/>
+              </w:rPr>
+              <w:t xml:space="preserve">Owner</w:t>
+            </w:r>
+          </w:p>
+        </w:tc>
+        <w:tc>
+          <w:tcPr>
+            <w:tcW w:type="dxa" w:w="3560"/>
+            <w:tcBorders>
+              <w:top w:val="single" w:color="2E75B6" w:sz="1"/>
+              <w:left w:val="single" w:color="2E75B6" w:sz="1"/>
+              <w:bottom w:val="single" w:color="2E75B6" w:sz="1"/>
+              <w:right w:val="single" w:color="2E75B6" w:sz="1"/>
+            </w:tcBorders>
+            <w:shd w:fill="2E75B6" w:val="clear"/>
+            <w:tcMar>
+              <w:top w:type="dxa" w:w="60"/>
+              <w:left w:type="dxa" w:w="100"/>
+              <w:bottom w:type="dxa" w:w="60"/>
+              <w:right w:type="dxa" w:w="100"/>
+            </w:tcMar>
+          </w:tcPr>
+          <w:p>
+            <w:pPr>
+              <w:spacing w:after="0" w:before="0"/>
+            </w:pPr>
+            <w:r>
+              <w:rPr>
+                <w:rFonts w:ascii="Arial" w:cs="Arial" w:eastAsia="Arial" w:hAnsi="Arial"/>
+                <w:b/>
+                <w:bCs/>
+                <w:color w:val="FFFFFF"/>
+                <w:sz w:val="18"/>
+                <w:szCs w:val="18"/>
+              </w:rPr>
+              <w:t xml:space="preserve">Purpose</w:t>
+            </w:r>
+          </w:p>
+        </w:tc>
+      </w:tr>
+      <w:tr>
+        <w:tc>
+          <w:tcPr>
+            <w:tcW w:type="dxa" w:w="1200"/>
+            <w:tcBorders>
+              <w:top w:val="single" w:color="CCCCCC" w:sz="1"/>
+              <w:left w:val="single" w:color="CCCCCC" w:sz="1"/>
+              <w:bottom w:val="single" w:color="CCCCCC" w:sz="1"/>
+              <w:right w:val="single" w:color="CCCCCC" w:sz="1"/>
+            </w:tcBorders>
+            <w:tcMar>
+              <w:top w:type="dxa" w:w="60"/>
+              <w:left w:type="dxa" w:w="100"/>
+              <w:bottom w:type="dxa" w:w="60"/>
+              <w:right w:type="dxa" w:w="100"/>
+            </w:tcMar>
+          </w:tcPr>
+          <w:p>
+            <w:pPr>
+              <w:spacing w:after="0" w:before="0"/>
+            </w:pPr>
+            <w:r>
+              <w:rPr>
+                <w:rFonts w:ascii="Arial" w:cs="Arial" w:eastAsia="Arial" w:hAnsi="Arial"/>
+                <w:color w:val="333333"/>
+                <w:sz w:val="18"/>
+                <w:szCs w:val="18"/>
+              </w:rPr>
+              <w:t xml:space="preserve">Monthly</w:t>
+            </w:r>
+          </w:p>
+        </w:tc>
+        <w:tc>
+          <w:tcPr>
+            <w:tcW w:type="dxa" w:w="2600"/>
+            <w:tcBorders>
+              <w:top w:val="single" w:color="CCCCCC" w:sz="1"/>
+              <w:left w:val="single" w:color="CCCCCC" w:sz="1"/>
+              <w:bottom w:val="single" w:color="CCCCCC" w:sz="1"/>
+              <w:right w:val="single" w:color="CCCCCC" w:sz="1"/>
+            </w:tcBorders>
+            <w:tcMar>
+              <w:top w:type="dxa" w:w="60"/>
+              <w:left w:type="dxa" w:w="100"/>
+              <w:bottom w:type="dxa" w:w="60"/>
+              <w:right w:type="dxa" w:w="100"/>
+            </w:tcMar>
+          </w:tcPr>
+          <w:p>
+            <w:pPr>
+              <w:spacing w:after="0" w:before="0"/>
+            </w:pPr>
+            <w:r>
+              <w:rPr>
+                <w:rFonts w:ascii="Arial" w:cs="Arial" w:eastAsia="Arial" w:hAnsi="Arial"/>
+                <w:color w:val="333333"/>
+                <w:sz w:val="18"/>
+                <w:szCs w:val="18"/>
+              </w:rPr>
+              <w:t xml:space="preserve">/component-audit</w:t>
+            </w:r>
+          </w:p>
+        </w:tc>
+        <w:tc>
+          <w:tcPr>
+            <w:tcW w:type="dxa" w:w="2000"/>
+            <w:tcBorders>
+              <w:top w:val="single" w:color="CCCCCC" w:sz="1"/>
+              <w:left w:val="single" w:color="CCCCCC" w:sz="1"/>
+              <w:bottom w:val="single" w:color="CCCCCC" w:sz="1"/>
+              <w:right w:val="single" w:color="CCCCCC" w:sz="1"/>
+            </w:tcBorders>
+            <w:tcMar>
+              <w:top w:type="dxa" w:w="60"/>
+              <w:left w:type="dxa" w:w="100"/>
+              <w:bottom w:type="dxa" w:w="60"/>
+              <w:right w:type="dxa" w:w="100"/>
+            </w:tcMar>
+          </w:tcPr>
+          <w:p>
+            <w:pPr>
+              <w:spacing w:after="0" w:before="0"/>
+            </w:pPr>
+            <w:r>
+              <w:rPr>
+                <w:rFonts w:ascii="Arial" w:cs="Arial" w:eastAsia="Arial" w:hAnsi="Arial"/>
+                <w:color w:val="333333"/>
+                <w:sz w:val="18"/>
+                <w:szCs w:val="18"/>
+              </w:rPr>
+              <w:t xml:space="preserve">Designer + Architect</w:t>
+            </w:r>
+          </w:p>
+        </w:tc>
+        <w:tc>
+          <w:tcPr>
+            <w:tcW w:type="dxa" w:w="3560"/>
+            <w:tcBorders>
+              <w:top w:val="single" w:color="CCCCCC" w:sz="1"/>
+              <w:left w:val="single" w:color="CCCCCC" w:sz="1"/>
+              <w:bottom w:val="single" w:color="CCCCCC" w:sz="1"/>
+              <w:right w:val="single" w:color="CCCCCC" w:sz="1"/>
+            </w:tcBorders>
+            <w:tcMar>
+              <w:top w:type="dxa" w:w="60"/>
+              <w:left w:type="dxa" w:w="100"/>
+              <w:bottom w:type="dxa" w:w="60"/>
+              <w:right w:type="dxa" w:w="100"/>
+            </w:tcMar>
+          </w:tcPr>
+          <w:p>
+            <w:pPr>
+              <w:spacing w:after="0" w:before="0"/>
+            </w:pPr>
+            <w:r>
+              <w:rPr>
+                <w:rFonts w:ascii="Arial" w:cs="Arial" w:eastAsia="Arial" w:hAnsi="Arial"/>
+                <w:color w:val="333333"/>
+                <w:sz w:val="18"/>
+                <w:szCs w:val="18"/>
+              </w:rPr>
+              <w:t xml:space="preserve">Catch design system drift between Figma and code</w:t>
+            </w:r>
+          </w:p>
+        </w:tc>
+      </w:tr>
+      <w:tr>
+        <w:tc>
+          <w:tcPr>
+            <w:tcW w:type="dxa" w:w="1200"/>
+            <w:tcBorders>
+              <w:top w:val="single" w:color="CCCCCC" w:sz="1"/>
+              <w:left w:val="single" w:color="CCCCCC" w:sz="1"/>
+              <w:bottom w:val="single" w:color="CCCCCC" w:sz="1"/>
+              <w:right w:val="single" w:color="CCCCCC" w:sz="1"/>
+            </w:tcBorders>
+            <w:shd w:fill="F2F7FB" w:val="clear"/>
+            <w:tcMar>
+              <w:top w:type="dxa" w:w="60"/>
+              <w:left w:type="dxa" w:w="100"/>
+              <w:bottom w:type="dxa" w:w="60"/>
+              <w:right w:type="dxa" w:w="100"/>
+            </w:tcMar>
+          </w:tcPr>
+          <w:p>
+            <w:pPr>
+              <w:spacing w:after="0" w:before="0"/>
+            </w:pPr>
+            <w:r>
+              <w:rPr>
+                <w:rFonts w:ascii="Arial" w:cs="Arial" w:eastAsia="Arial" w:hAnsi="Arial"/>
+                <w:color w:val="333333"/>
+                <w:sz w:val="18"/>
+                <w:szCs w:val="18"/>
+              </w:rPr>
+              <w:t xml:space="preserve">Monthly</w:t>
+            </w:r>
+          </w:p>
+        </w:tc>
+        <w:tc>
+          <w:tcPr>
+            <w:tcW w:type="dxa" w:w="2600"/>
+            <w:tcBorders>
+              <w:top w:val="single" w:color="CCCCCC" w:sz="1"/>
+              <w:left w:val="single" w:color="CCCCCC" w:sz="1"/>
+              <w:bottom w:val="single" w:color="CCCCCC" w:sz="1"/>
+              <w:right w:val="single" w:color="CCCCCC" w:sz="1"/>
+            </w:tcBorders>
+            <w:shd w:fill="F2F7FB" w:val="clear"/>
+            <w:tcMar>
+              <w:top w:type="dxa" w:w="60"/>
+              <w:left w:type="dxa" w:w="100"/>
+              <w:bottom w:type="dxa" w:w="60"/>
+              <w:right w:type="dxa" w:w="100"/>
+            </w:tcMar>
+          </w:tcPr>
+          <w:p>
+            <w:pPr>
+              <w:spacing w:after="0" w:before="0"/>
+            </w:pPr>
+            <w:r>
+              <w:rPr>
+                <w:rFonts w:ascii="Arial" w:cs="Arial" w:eastAsia="Arial" w:hAnsi="Arial"/>
+                <w:color w:val="333333"/>
+                <w:sz w:val="18"/>
+                <w:szCs w:val="18"/>
+              </w:rPr>
+              <w:t xml:space="preserve">/design-system-sync --dry-run</w:t>
+            </w:r>
+          </w:p>
+        </w:tc>
+        <w:tc>
+          <w:tcPr>
+            <w:tcW w:type="dxa" w:w="2000"/>
+            <w:tcBorders>
+              <w:top w:val="single" w:color="CCCCCC" w:sz="1"/>
+              <w:left w:val="single" w:color="CCCCCC" w:sz="1"/>
+              <w:bottom w:val="single" w:color="CCCCCC" w:sz="1"/>
+              <w:right w:val="single" w:color="CCCCCC" w:sz="1"/>
+            </w:tcBorders>
+            <w:shd w:fill="F2F7FB" w:val="clear"/>
+            <w:tcMar>
+              <w:top w:type="dxa" w:w="60"/>
+              <w:left w:type="dxa" w:w="100"/>
+              <w:bottom w:type="dxa" w:w="60"/>
+              <w:right w:type="dxa" w:w="100"/>
+            </w:tcMar>
+          </w:tcPr>
+          <w:p>
+            <w:pPr>
+              <w:spacing w:after="0" w:before="0"/>
+            </w:pPr>
+            <w:r>
+              <w:rPr>
+                <w:rFonts w:ascii="Arial" w:cs="Arial" w:eastAsia="Arial" w:hAnsi="Arial"/>
+                <w:color w:val="333333"/>
+                <w:sz w:val="18"/>
+                <w:szCs w:val="18"/>
+              </w:rPr>
+              <w:t xml:space="preserve">Designer</w:t>
+            </w:r>
+          </w:p>
+        </w:tc>
+        <w:tc>
+          <w:tcPr>
+            <w:tcW w:type="dxa" w:w="3560"/>
+            <w:tcBorders>
+              <w:top w:val="single" w:color="CCCCCC" w:sz="1"/>
+              <w:left w:val="single" w:color="CCCCCC" w:sz="1"/>
+              <w:bottom w:val="single" w:color="CCCCCC" w:sz="1"/>
+              <w:right w:val="single" w:color="CCCCCC" w:sz="1"/>
+            </w:tcBorders>
+            <w:shd w:fill="F2F7FB" w:val="clear"/>
+            <w:tcMar>
+              <w:top w:type="dxa" w:w="60"/>
+              <w:left w:type="dxa" w:w="100"/>
+              <w:bottom w:type="dxa" w:w="60"/>
+              <w:right w:type="dxa" w:w="100"/>
+            </w:tcMar>
+          </w:tcPr>
+          <w:p>
+            <w:pPr>
+              <w:spacing w:after="0" w:before="0"/>
+            </w:pPr>
+            <w:r>
+              <w:rPr>
+                <w:rFonts w:ascii="Arial" w:cs="Arial" w:eastAsia="Arial" w:hAnsi="Arial"/>
+                <w:color w:val="333333"/>
+                <w:sz w:val="18"/>
+                <w:szCs w:val="18"/>
+              </w:rPr>
+              <w:t xml:space="preserve">Preview token changes before applying</w:t>
+            </w:r>
+          </w:p>
+        </w:tc>
+      </w:tr>
+      <w:tr>
+        <w:tc>
+          <w:tcPr>
+            <w:tcW w:type="dxa" w:w="1200"/>
+            <w:tcBorders>
+              <w:top w:val="single" w:color="CCCCCC" w:sz="1"/>
+              <w:left w:val="single" w:color="CCCCCC" w:sz="1"/>
+              <w:bottom w:val="single" w:color="CCCCCC" w:sz="1"/>
+              <w:right w:val="single" w:color="CCCCCC" w:sz="1"/>
+            </w:tcBorders>
+            <w:tcMar>
+              <w:top w:type="dxa" w:w="60"/>
+              <w:left w:type="dxa" w:w="100"/>
+              <w:bottom w:type="dxa" w:w="60"/>
+              <w:right w:type="dxa" w:w="100"/>
+            </w:tcMar>
+          </w:tcPr>
+          <w:p>
+            <w:pPr>
+              <w:spacing w:after="0" w:before="0"/>
+            </w:pPr>
+            <w:r>
+              <w:rPr>
+                <w:rFonts w:ascii="Arial" w:cs="Arial" w:eastAsia="Arial" w:hAnsi="Arial"/>
+                <w:color w:val="333333"/>
+                <w:sz w:val="18"/>
+                <w:szCs w:val="18"/>
+              </w:rPr>
+              <w:t xml:space="preserve">End of sprint</w:t>
+            </w:r>
+          </w:p>
+        </w:tc>
+        <w:tc>
+          <w:tcPr>
+            <w:tcW w:type="dxa" w:w="2600"/>
+            <w:tcBorders>
+              <w:top w:val="single" w:color="CCCCCC" w:sz="1"/>
+              <w:left w:val="single" w:color="CCCCCC" w:sz="1"/>
+              <w:bottom w:val="single" w:color="CCCCCC" w:sz="1"/>
+              <w:right w:val="single" w:color="CCCCCC" w:sz="1"/>
+            </w:tcBorders>
+            <w:tcMar>
+              <w:top w:type="dxa" w:w="60"/>
+              <w:left w:type="dxa" w:w="100"/>
+              <w:bottom w:type="dxa" w:w="60"/>
+              <w:right w:type="dxa" w:w="100"/>
+            </w:tcMar>
+          </w:tcPr>
+          <w:p>
+            <w:pPr>
+              <w:spacing w:after="0" w:before="0"/>
+            </w:pPr>
+            <w:r>
+              <w:rPr>
+                <w:rFonts w:ascii="Arial" w:cs="Arial" w:eastAsia="Arial" w:hAnsi="Arial"/>
+                <w:color w:val="333333"/>
+                <w:sz w:val="18"/>
+                <w:szCs w:val="18"/>
+              </w:rPr>
+              <w:t xml:space="preserve">/report-trends</w:t>
+            </w:r>
+          </w:p>
+        </w:tc>
+        <w:tc>
+          <w:tcPr>
+            <w:tcW w:type="dxa" w:w="2000"/>
+            <w:tcBorders>
+              <w:top w:val="single" w:color="CCCCCC" w:sz="1"/>
+              <w:left w:val="single" w:color="CCCCCC" w:sz="1"/>
+              <w:bottom w:val="single" w:color="CCCCCC" w:sz="1"/>
+              <w:right w:val="single" w:color="CCCCCC" w:sz="1"/>
+            </w:tcBorders>
+            <w:tcMar>
+              <w:top w:type="dxa" w:w="60"/>
+              <w:left w:type="dxa" w:w="100"/>
+              <w:bottom w:type="dxa" w:w="60"/>
+              <w:right w:type="dxa" w:w="100"/>
+            </w:tcMar>
+          </w:tcPr>
+          <w:p>
+            <w:pPr>
+              <w:spacing w:after="0" w:before="0"/>
+            </w:pPr>
+            <w:r>
+              <w:rPr>
+                <w:rFonts w:ascii="Arial" w:cs="Arial" w:eastAsia="Arial" w:hAnsi="Arial"/>
+                <w:color w:val="333333"/>
+                <w:sz w:val="18"/>
+                <w:szCs w:val="18"/>
+              </w:rPr>
+              <w:t xml:space="preserve">Scrum Master</w:t>
+            </w:r>
+          </w:p>
+        </w:tc>
+        <w:tc>
+          <w:tcPr>
+            <w:tcW w:type="dxa" w:w="3560"/>
+            <w:tcBorders>
+              <w:top w:val="single" w:color="CCCCCC" w:sz="1"/>
+              <w:left w:val="single" w:color="CCCCCC" w:sz="1"/>
+              <w:bottom w:val="single" w:color="CCCCCC" w:sz="1"/>
+              <w:right w:val="single" w:color="CCCCCC" w:sz="1"/>
+            </w:tcBorders>
+            <w:tcMar>
+              <w:top w:type="dxa" w:w="60"/>
+              <w:left w:type="dxa" w:w="100"/>
+              <w:bottom w:type="dxa" w:w="60"/>
+              <w:right w:type="dxa" w:w="100"/>
+            </w:tcMar>
+          </w:tcPr>
+          <w:p>
+            <w:pPr>
+              <w:spacing w:after="0" w:before="0"/>
+            </w:pPr>
+            <w:r>
+              <w:rPr>
+                <w:rFonts w:ascii="Arial" w:cs="Arial" w:eastAsia="Arial" w:hAnsi="Arial"/>
+                <w:color w:val="333333"/>
+                <w:sz w:val="18"/>
+                <w:szCs w:val="18"/>
+              </w:rPr>
+              <w:t xml:space="preserve">Feed objective data into the retrospective</w:t>
+            </w:r>
+          </w:p>
+        </w:tc>
+      </w:tr>
+      <w:tr>
+        <w:tc>
+          <w:tcPr>
+            <w:tcW w:type="dxa" w:w="1200"/>
+            <w:tcBorders>
+              <w:top w:val="single" w:color="CCCCCC" w:sz="1"/>
+              <w:left w:val="single" w:color="CCCCCC" w:sz="1"/>
+              <w:bottom w:val="single" w:color="CCCCCC" w:sz="1"/>
+              <w:right w:val="single" w:color="CCCCCC" w:sz="1"/>
+            </w:tcBorders>
+            <w:shd w:fill="F2F7FB" w:val="clear"/>
+            <w:tcMar>
+              <w:top w:type="dxa" w:w="60"/>
+              <w:left w:type="dxa" w:w="100"/>
+              <w:bottom w:type="dxa" w:w="60"/>
+              <w:right w:type="dxa" w:w="100"/>
+            </w:tcMar>
+          </w:tcPr>
+          <w:p>
+            <w:pPr>
+              <w:spacing w:after="0" w:before="0"/>
+            </w:pPr>
+            <w:r>
+              <w:rPr>
+                <w:rFonts w:ascii="Arial" w:cs="Arial" w:eastAsia="Arial" w:hAnsi="Arial"/>
+                <w:color w:val="333333"/>
+                <w:sz w:val="18"/>
+                <w:szCs w:val="18"/>
+              </w:rPr>
+              <w:t xml:space="preserve">Quarterly</w:t>
+            </w:r>
+          </w:p>
+        </w:tc>
+        <w:tc>
+          <w:tcPr>
+            <w:tcW w:type="dxa" w:w="2600"/>
+            <w:tcBorders>
+              <w:top w:val="single" w:color="CCCCCC" w:sz="1"/>
+              <w:left w:val="single" w:color="CCCCCC" w:sz="1"/>
+              <w:bottom w:val="single" w:color="CCCCCC" w:sz="1"/>
+              <w:right w:val="single" w:color="CCCCCC" w:sz="1"/>
+            </w:tcBorders>
+            <w:shd w:fill="F2F7FB" w:val="clear"/>
+            <w:tcMar>
+              <w:top w:type="dxa" w:w="60"/>
+              <w:left w:type="dxa" w:w="100"/>
+              <w:bottom w:type="dxa" w:w="60"/>
+              <w:right w:type="dxa" w:w="100"/>
+            </w:tcMar>
+          </w:tcPr>
+          <w:p>
+            <w:pPr>
+              <w:spacing w:after="0" w:before="0"/>
+            </w:pPr>
+            <w:r>
+              <w:rPr>
+                <w:rFonts w:ascii="Arial" w:cs="Arial" w:eastAsia="Arial" w:hAnsi="Arial"/>
+                <w:color w:val="333333"/>
+                <w:sz w:val="18"/>
+                <w:szCs w:val="18"/>
+              </w:rPr>
+              <w:t xml:space="preserve">/tech-debt-audit</w:t>
+            </w:r>
+          </w:p>
+        </w:tc>
+        <w:tc>
+          <w:tcPr>
+            <w:tcW w:type="dxa" w:w="2000"/>
+            <w:tcBorders>
+              <w:top w:val="single" w:color="CCCCCC" w:sz="1"/>
+              <w:left w:val="single" w:color="CCCCCC" w:sz="1"/>
+              <w:bottom w:val="single" w:color="CCCCCC" w:sz="1"/>
+              <w:right w:val="single" w:color="CCCCCC" w:sz="1"/>
+            </w:tcBorders>
+            <w:shd w:fill="F2F7FB" w:val="clear"/>
+            <w:tcMar>
+              <w:top w:type="dxa" w:w="60"/>
+              <w:left w:type="dxa" w:w="100"/>
+              <w:bottom w:type="dxa" w:w="60"/>
+              <w:right w:type="dxa" w:w="100"/>
+            </w:tcMar>
+          </w:tcPr>
+          <w:p>
+            <w:pPr>
+              <w:spacing w:after="0" w:before="0"/>
+            </w:pPr>
+            <w:r>
+              <w:rPr>
+                <w:rFonts w:ascii="Arial" w:cs="Arial" w:eastAsia="Arial" w:hAnsi="Arial"/>
+                <w:color w:val="333333"/>
+                <w:sz w:val="18"/>
+                <w:szCs w:val="18"/>
+              </w:rPr>
+              <w:t xml:space="preserve">Tech Lead</w:t>
+            </w:r>
+          </w:p>
+        </w:tc>
+        <w:tc>
+          <w:tcPr>
+            <w:tcW w:type="dxa" w:w="3560"/>
+            <w:tcBorders>
+              <w:top w:val="single" w:color="CCCCCC" w:sz="1"/>
+              <w:left w:val="single" w:color="CCCCCC" w:sz="1"/>
+              <w:bottom w:val="single" w:color="CCCCCC" w:sz="1"/>
+              <w:right w:val="single" w:color="CCCCCC" w:sz="1"/>
+            </w:tcBorders>
+            <w:shd w:fill="F2F7FB" w:val="clear"/>
+            <w:tcMar>
+              <w:top w:type="dxa" w:w="60"/>
+              <w:left w:type="dxa" w:w="100"/>
+              <w:bottom w:type="dxa" w:w="60"/>
+              <w:right w:type="dxa" w:w="100"/>
+            </w:tcMar>
+          </w:tcPr>
+          <w:p>
+            <w:pPr>
+              <w:spacing w:after="0" w:before="0"/>
+            </w:pPr>
+            <w:r>
+              <w:rPr>
+                <w:rFonts w:ascii="Arial" w:cs="Arial" w:eastAsia="Arial" w:hAnsi="Arial"/>
+                <w:color w:val="333333"/>
+                <w:sz w:val="18"/>
+                <w:szCs w:val="18"/>
+              </w:rPr>
+              <w:t xml:space="preserve">Assess and prioritize technical debt reduction</w:t>
+            </w:r>
+          </w:p>
+        </w:tc>
+      </w:tr>
+      <w:tr>
+        <w:tc>
+          <w:tcPr>
+            <w:tcW w:type="dxa" w:w="1200"/>
+            <w:tcBorders>
+              <w:top w:val="single" w:color="CCCCCC" w:sz="1"/>
+              <w:left w:val="single" w:color="CCCCCC" w:sz="1"/>
+              <w:bottom w:val="single" w:color="CCCCCC" w:sz="1"/>
+              <w:right w:val="single" w:color="CCCCCC" w:sz="1"/>
+            </w:tcBorders>
+            <w:tcMar>
+              <w:top w:type="dxa" w:w="60"/>
+              <w:left w:type="dxa" w:w="100"/>
+              <w:bottom w:type="dxa" w:w="60"/>
+              <w:right w:type="dxa" w:w="100"/>
+            </w:tcMar>
+          </w:tcPr>
+          <w:p>
+            <w:pPr>
+              <w:spacing w:after="0" w:before="0"/>
+            </w:pPr>
+            <w:r>
+              <w:rPr>
+                <w:rFonts w:ascii="Arial" w:cs="Arial" w:eastAsia="Arial" w:hAnsi="Arial"/>
+                <w:color w:val="333333"/>
+                <w:sz w:val="18"/>
+                <w:szCs w:val="18"/>
+              </w:rPr>
+              <w:t xml:space="preserve">Quarterly</w:t>
+            </w:r>
+          </w:p>
+        </w:tc>
+        <w:tc>
+          <w:tcPr>
+            <w:tcW w:type="dxa" w:w="2600"/>
+            <w:tcBorders>
+              <w:top w:val="single" w:color="CCCCCC" w:sz="1"/>
+              <w:left w:val="single" w:color="CCCCCC" w:sz="1"/>
+              <w:bottom w:val="single" w:color="CCCCCC" w:sz="1"/>
+              <w:right w:val="single" w:color="CCCCCC" w:sz="1"/>
+            </w:tcBorders>
+            <w:tcMar>
+              <w:top w:type="dxa" w:w="60"/>
+              <w:left w:type="dxa" w:w="100"/>
+              <w:bottom w:type="dxa" w:w="60"/>
+              <w:right w:type="dxa" w:w="100"/>
+            </w:tcMar>
+          </w:tcPr>
+          <w:p>
+            <w:pPr>
+              <w:spacing w:after="0" w:before="0"/>
+            </w:pPr>
+            <w:r>
+              <w:rPr>
+                <w:rFonts w:ascii="Arial" w:cs="Arial" w:eastAsia="Arial" w:hAnsi="Arial"/>
+                <w:color w:val="333333"/>
+                <w:sz w:val="18"/>
+                <w:szCs w:val="18"/>
+              </w:rPr>
+              <w:t xml:space="preserve">/license-compliance-audit</w:t>
+            </w:r>
+          </w:p>
+        </w:tc>
+        <w:tc>
+          <w:tcPr>
+            <w:tcW w:type="dxa" w:w="2000"/>
+            <w:tcBorders>
+              <w:top w:val="single" w:color="CCCCCC" w:sz="1"/>
+              <w:left w:val="single" w:color="CCCCCC" w:sz="1"/>
+              <w:bottom w:val="single" w:color="CCCCCC" w:sz="1"/>
+              <w:right w:val="single" w:color="CCCCCC" w:sz="1"/>
+            </w:tcBorders>
+            <w:tcMar>
+              <w:top w:type="dxa" w:w="60"/>
+              <w:left w:type="dxa" w:w="100"/>
+              <w:bottom w:type="dxa" w:w="60"/>
+              <w:right w:type="dxa" w:w="100"/>
+            </w:tcMar>
+          </w:tcPr>
+          <w:p>
+            <w:pPr>
+              <w:spacing w:after="0" w:before="0"/>
+            </w:pPr>
+            <w:r>
+              <w:rPr>
+                <w:rFonts w:ascii="Arial" w:cs="Arial" w:eastAsia="Arial" w:hAnsi="Arial"/>
+                <w:color w:val="333333"/>
+                <w:sz w:val="18"/>
+                <w:szCs w:val="18"/>
+              </w:rPr>
+              <w:t xml:space="preserve">DevOps/SRE</w:t>
+            </w:r>
+          </w:p>
+        </w:tc>
+        <w:tc>
+          <w:tcPr>
+            <w:tcW w:type="dxa" w:w="3560"/>
+            <w:tcBorders>
+              <w:top w:val="single" w:color="CCCCCC" w:sz="1"/>
+              <w:left w:val="single" w:color="CCCCCC" w:sz="1"/>
+              <w:bottom w:val="single" w:color="CCCCCC" w:sz="1"/>
+              <w:right w:val="single" w:color="CCCCCC" w:sz="1"/>
+            </w:tcBorders>
+            <w:tcMar>
+              <w:top w:type="dxa" w:w="60"/>
+              <w:left w:type="dxa" w:w="100"/>
+              <w:bottom w:type="dxa" w:w="60"/>
+              <w:right w:type="dxa" w:w="100"/>
+            </w:tcMar>
+          </w:tcPr>
+          <w:p>
+            <w:pPr>
+              <w:spacing w:after="0" w:before="0"/>
+            </w:pPr>
+            <w:r>
+              <w:rPr>
+                <w:rFonts w:ascii="Arial" w:cs="Arial" w:eastAsia="Arial" w:hAnsi="Arial"/>
+                <w:color w:val="333333"/>
+                <w:sz w:val="18"/>
+                <w:szCs w:val="18"/>
+              </w:rPr>
+              <w:t xml:space="preserve">Ensure dependency licenses remain compliant</w:t>
+            </w:r>
+          </w:p>
+        </w:tc>
+      </w:tr>
+      <w:tr>
+        <w:tc>
+          <w:tcPr>
+            <w:tcW w:type="dxa" w:w="1200"/>
+            <w:tcBorders>
+              <w:top w:val="single" w:color="CCCCCC" w:sz="1"/>
+              <w:left w:val="single" w:color="CCCCCC" w:sz="1"/>
+              <w:bottom w:val="single" w:color="CCCCCC" w:sz="1"/>
+              <w:right w:val="single" w:color="CCCCCC" w:sz="1"/>
+            </w:tcBorders>
+            <w:shd w:fill="F2F7FB" w:val="clear"/>
+            <w:tcMar>
+              <w:top w:type="dxa" w:w="60"/>
+              <w:left w:type="dxa" w:w="100"/>
+              <w:bottom w:type="dxa" w:w="60"/>
+              <w:right w:type="dxa" w:w="100"/>
+            </w:tcMar>
+          </w:tcPr>
+          <w:p>
+            <w:pPr>
+              <w:spacing w:after="0" w:before="0"/>
+            </w:pPr>
+            <w:r>
+              <w:rPr>
+                <w:rFonts w:ascii="Arial" w:cs="Arial" w:eastAsia="Arial" w:hAnsi="Arial"/>
+                <w:color w:val="333333"/>
+                <w:sz w:val="18"/>
+                <w:szCs w:val="18"/>
+              </w:rPr>
+              <w:t xml:space="preserve">Before release</w:t>
+            </w:r>
+          </w:p>
+        </w:tc>
+        <w:tc>
+          <w:tcPr>
+            <w:tcW w:type="dxa" w:w="2600"/>
+            <w:tcBorders>
+              <w:top w:val="single" w:color="CCCCCC" w:sz="1"/>
+              <w:left w:val="single" w:color="CCCCCC" w:sz="1"/>
+              <w:bottom w:val="single" w:color="CCCCCC" w:sz="1"/>
+              <w:right w:val="single" w:color="CCCCCC" w:sz="1"/>
+            </w:tcBorders>
+            <w:shd w:fill="F2F7FB" w:val="clear"/>
+            <w:tcMar>
+              <w:top w:type="dxa" w:w="60"/>
+              <w:left w:type="dxa" w:w="100"/>
+              <w:bottom w:type="dxa" w:w="60"/>
+              <w:right w:type="dxa" w:w="100"/>
+            </w:tcMar>
+          </w:tcPr>
+          <w:p>
+            <w:pPr>
+              <w:spacing w:after="0" w:before="0"/>
+            </w:pPr>
+            <w:r>
+              <w:rPr>
+                <w:rFonts w:ascii="Arial" w:cs="Arial" w:eastAsia="Arial" w:hAnsi="Arial"/>
+                <w:color w:val="333333"/>
+                <w:sz w:val="18"/>
+                <w:szCs w:val="18"/>
+              </w:rPr>
+              <w:t xml:space="preserve">/release-validation</w:t>
+            </w:r>
+          </w:p>
+        </w:tc>
+        <w:tc>
+          <w:tcPr>
+            <w:tcW w:type="dxa" w:w="2000"/>
+            <w:tcBorders>
+              <w:top w:val="single" w:color="CCCCCC" w:sz="1"/>
+              <w:left w:val="single" w:color="CCCCCC" w:sz="1"/>
+              <w:bottom w:val="single" w:color="CCCCCC" w:sz="1"/>
+              <w:right w:val="single" w:color="CCCCCC" w:sz="1"/>
+            </w:tcBorders>
+            <w:shd w:fill="F2F7FB" w:val="clear"/>
+            <w:tcMar>
+              <w:top w:type="dxa" w:w="60"/>
+              <w:left w:type="dxa" w:w="100"/>
+              <w:bottom w:type="dxa" w:w="60"/>
+              <w:right w:type="dxa" w:w="100"/>
+            </w:tcMar>
+          </w:tcPr>
+          <w:p>
+            <w:pPr>
+              <w:spacing w:after="0" w:before="0"/>
+            </w:pPr>
+            <w:r>
+              <w:rPr>
+                <w:rFonts w:ascii="Arial" w:cs="Arial" w:eastAsia="Arial" w:hAnsi="Arial"/>
+                <w:color w:val="333333"/>
+                <w:sz w:val="18"/>
+                <w:szCs w:val="18"/>
+              </w:rPr>
+              <w:t xml:space="preserve">QA</w:t>
+            </w:r>
+          </w:p>
+        </w:tc>
+        <w:tc>
+          <w:tcPr>
+            <w:tcW w:type="dxa" w:w="3560"/>
+            <w:tcBorders>
+              <w:top w:val="single" w:color="CCCCCC" w:sz="1"/>
+              <w:left w:val="single" w:color="CCCCCC" w:sz="1"/>
+              <w:bottom w:val="single" w:color="CCCCCC" w:sz="1"/>
+              <w:right w:val="single" w:color="CCCCCC" w:sz="1"/>
+            </w:tcBorders>
+            <w:shd w:fill="F2F7FB" w:val="clear"/>
+            <w:tcMar>
+              <w:top w:type="dxa" w:w="60"/>
+              <w:left w:type="dxa" w:w="100"/>
+              <w:bottom w:type="dxa" w:w="60"/>
+              <w:right w:type="dxa" w:w="100"/>
+            </w:tcMar>
+          </w:tcPr>
+          <w:p>
+            <w:pPr>
+              <w:spacing w:after="0" w:before="0"/>
+            </w:pPr>
+            <w:r>
+              <w:rPr>
+                <w:rFonts w:ascii="Arial" w:cs="Arial" w:eastAsia="Arial" w:hAnsi="Arial"/>
+                <w:color w:val="333333"/>
+                <w:sz w:val="18"/>
+                <w:szCs w:val="18"/>
+              </w:rPr>
+              <w:t xml:space="preserve">Final quality gate before production deployment</w:t>
+            </w:r>
+          </w:p>
+        </w:tc>
+      </w:tr>
+    </w:tbl>
+    <w:p>
+      <w:pPr>
+        <w:pStyle w:val="Heading2"/>
+        <w:spacing w:after="160" w:before="280"/>
+      </w:pPr>
+      <w:r>
+        <w:rPr>
+          <w:rFonts w:ascii="Arial" w:cs="Arial" w:eastAsia="Arial" w:hAnsi="Arial"/>
+          <w:b/>
+          <w:bCs/>
+          <w:color w:val="2E75B6"/>
+          <w:sz w:val="26"/>
+          <w:szCs w:val="26"/>
+        </w:rPr>
+        <w:t xml:space="preserve">3.9 Adapting These Conventions</w:t>
+      </w:r>
+    </w:p>
+    <w:p>
+      <w:pPr>
+        <w:spacing w:after="80" w:before="80"/>
+      </w:pPr>
+      <w:r>
+        <w:rPr>
+          <w:rFonts w:ascii="Arial" w:cs="Arial" w:eastAsia="Arial" w:hAnsi="Arial"/>
+          <w:sz w:val="22"/>
+          <w:szCs w:val="22"/>
+        </w:rPr>
+        <w:t xml:space="preserve">These conventions are a starting point, not a straitjacket. Teams should review them at the end of their first month and adjust based on their actual experience. The key principle is: every convention should reduce ambiguity. If a rule creates more confusion than it resolves, change it. Document changes in the project CLAUDE.md so the AI agents follow the same conventions as the human team members.</w:t>
       </w:r>
     </w:p>
     <w:p>
@@ -1949,20 +4870,7 @@
           <w:sz w:val="32"/>
           <w:szCs w:val="32"/>
         </w:rPr>
-        <w:t xml:space="preserve">4. Skills Reference</w:t>
-      </w:r>
-    </w:p>
-    <w:p>
-      <w:pPr>
-        <w:spacing w:after="80" w:before="80"/>
-      </w:pPr>
-      <w:r>
-        <w:rPr>
-          <w:rFonts w:ascii="Arial" w:cs="Arial" w:eastAsia="Arial" w:hAnsi="Arial"/>
-          <w:sz w:val="22"/>
-          <w:szCs w:val="22"/>
-        </w:rPr>
-        <w:t xml:space="preserve">SDLC Central includes 60 skills organized into 13 categories. Each skill is invoked as a slash command with optional arguments.</w:t>
+        <w:t xml:space="preserve">4. Installation</w:t>
       </w:r>
     </w:p>
     <w:p>
@@ -1979,7 +4887,403 @@
           <w:sz w:val="26"/>
           <w:szCs w:val="26"/>
         </w:rPr>
-        <w:t xml:space="preserve">4.1 Skill Categories</w:t>
+        <w:t xml:space="preserve">4.1 Interactive Installer</w:t>
+      </w:r>
+    </w:p>
+    <w:p>
+      <w:pPr>
+        <w:spacing w:after="80" w:before="80"/>
+      </w:pPr>
+      <w:r>
+        <w:rPr>
+          <w:rFonts w:ascii="Arial" w:cs="Arial" w:eastAsia="Arial" w:hAnsi="Arial"/>
+          <w:sz w:val="22"/>
+          <w:szCs w:val="22"/>
+        </w:rPr>
+        <w:t xml:space="preserve">Run the interactive installer from any project directory:</w:t>
+      </w:r>
+    </w:p>
+    <w:p>
+      <w:pPr>
+        <w:spacing w:after="60" w:before="60"/>
+        <w:ind w:left="360"/>
+      </w:pPr>
+      <w:r>
+        <w:rPr>
+          <w:rFonts w:ascii="Courier New" w:cs="Courier New" w:eastAsia="Courier New" w:hAnsi="Courier New"/>
+          <w:color w:val="444444"/>
+          <w:sz w:val="20"/>
+          <w:szCs w:val="20"/>
+        </w:rPr>
+        <w:t xml:space="preserve">bash /path/to/sdlc_central/setup/install.sh</w:t>
+      </w:r>
+    </w:p>
+    <w:p>
+      <w:pPr>
+        <w:spacing w:after="80" w:before="80"/>
+      </w:pPr>
+      <w:r>
+        <w:rPr>
+          <w:rFonts w:ascii="Arial" w:cs="Arial" w:eastAsia="Arial" w:hAnsi="Arial"/>
+          <w:sz w:val="22"/>
+          <w:szCs w:val="22"/>
+        </w:rPr>
+        <w:t xml:space="preserve">The installer auto-detects your agent from project markers (.claude/, .cursor/, etc.), then presents menus for agent selection and role selection. It delegates to install-role.sh for individual roles or install-all.sh for the full suite.</w:t>
+      </w:r>
+    </w:p>
+    <w:p>
+      <w:pPr>
+        <w:pStyle w:val="Heading2"/>
+        <w:spacing w:after="160" w:before="280"/>
+      </w:pPr>
+      <w:r>
+        <w:rPr>
+          <w:rFonts w:ascii="Arial" w:cs="Arial" w:eastAsia="Arial" w:hAnsi="Arial"/>
+          <w:b/>
+          <w:bCs/>
+          <w:color w:val="2E75B6"/>
+          <w:sz w:val="26"/>
+          <w:szCs w:val="26"/>
+        </w:rPr>
+        <w:t xml:space="preserve">4.2 Non-Interactive Install</w:t>
+      </w:r>
+    </w:p>
+    <w:p>
+      <w:pPr>
+        <w:spacing w:after="80" w:before="80"/>
+      </w:pPr>
+      <w:r>
+        <w:rPr>
+          <w:rFonts w:ascii="Arial" w:cs="Arial" w:eastAsia="Arial" w:hAnsi="Arial"/>
+          <w:sz w:val="22"/>
+          <w:szCs w:val="22"/>
+        </w:rPr>
+        <w:t xml:space="preserve">Install for a specific role and agent directly:</w:t>
+      </w:r>
+    </w:p>
+    <w:p>
+      <w:pPr>
+        <w:spacing w:after="60" w:before="60"/>
+        <w:ind w:left="360"/>
+      </w:pPr>
+      <w:r>
+        <w:rPr>
+          <w:rFonts w:ascii="Courier New" w:cs="Courier New" w:eastAsia="Courier New" w:hAnsi="Courier New"/>
+          <w:color w:val="444444"/>
+          <w:sz w:val="20"/>
+          <w:szCs w:val="20"/>
+        </w:rPr>
+        <w:t xml:space="preserve">bash setup/install-role.sh developer --agent cursor</w:t>
+      </w:r>
+    </w:p>
+    <w:p>
+      <w:pPr>
+        <w:spacing w:after="60" w:before="60"/>
+        <w:ind w:left="360"/>
+      </w:pPr>
+      <w:r>
+        <w:rPr>
+          <w:rFonts w:ascii="Courier New" w:cs="Courier New" w:eastAsia="Courier New" w:hAnsi="Courier New"/>
+          <w:color w:val="444444"/>
+          <w:sz w:val="20"/>
+          <w:szCs w:val="20"/>
+        </w:rPr>
+        <w:t xml:space="preserve">bash setup/install-role.sh designer --agent claude-code</w:t>
+      </w:r>
+    </w:p>
+    <w:p>
+      <w:pPr>
+        <w:spacing w:after="80" w:before="80"/>
+      </w:pPr>
+      <w:r>
+        <w:rPr>
+          <w:rFonts w:ascii="Arial" w:cs="Arial" w:eastAsia="Arial" w:hAnsi="Arial"/>
+          <w:sz w:val="22"/>
+          <w:szCs w:val="22"/>
+        </w:rPr>
+        <w:t xml:space="preserve">To install all 60 skills:</w:t>
+      </w:r>
+    </w:p>
+    <w:p>
+      <w:pPr>
+        <w:spacing w:after="60" w:before="60"/>
+        <w:ind w:left="360"/>
+      </w:pPr>
+      <w:r>
+        <w:rPr>
+          <w:rFonts w:ascii="Courier New" w:cs="Courier New" w:eastAsia="Courier New" w:hAnsi="Courier New"/>
+          <w:color w:val="444444"/>
+          <w:sz w:val="20"/>
+          <w:szCs w:val="20"/>
+        </w:rPr>
+        <w:t xml:space="preserve">bash setup/install-all.sh --agent claude-code</w:t>
+      </w:r>
+    </w:p>
+    <w:p>
+      <w:pPr>
+        <w:pStyle w:val="Heading2"/>
+        <w:spacing w:after="160" w:before="280"/>
+      </w:pPr>
+      <w:r>
+        <w:rPr>
+          <w:rFonts w:ascii="Arial" w:cs="Arial" w:eastAsia="Arial" w:hAnsi="Arial"/>
+          <w:b/>
+          <w:bCs/>
+          <w:color w:val="2E75B6"/>
+          <w:sz w:val="26"/>
+          <w:szCs w:val="26"/>
+        </w:rPr>
+        <w:t xml:space="preserve">4.3 What Gets Installed</w:t>
+      </w:r>
+    </w:p>
+    <w:p>
+      <w:pPr>
+        <w:pStyle w:val="ListParagraph"/>
+        <w:numPr>
+          <w:ilvl w:val="0"/>
+          <w:numId w:val="2"/>
+        </w:numPr>
+        <w:spacing w:after="40" w:before="40"/>
+      </w:pPr>
+      <w:r>
+        <w:rPr>
+          <w:rFonts w:ascii="Arial" w:cs="Arial" w:eastAsia="Arial" w:hAnsi="Arial"/>
+          <w:sz w:val="22"/>
+          <w:szCs w:val="22"/>
+        </w:rPr>
+        <w:t xml:space="preserve">Skill files — transformed by the adapter into agent-native format</w:t>
+      </w:r>
+    </w:p>
+    <w:p>
+      <w:pPr>
+        <w:pStyle w:val="ListParagraph"/>
+        <w:numPr>
+          <w:ilvl w:val="0"/>
+          <w:numId w:val="2"/>
+        </w:numPr>
+        <w:spacing w:after="40" w:before="40"/>
+      </w:pPr>
+      <w:r>
+        <w:rPr>
+          <w:rFonts w:ascii="Arial" w:cs="Arial" w:eastAsia="Arial" w:hAnsi="Arial"/>
+          <w:sz w:val="22"/>
+          <w:szCs w:val="22"/>
+        </w:rPr>
+        <w:t xml:space="preserve">Pipeline YAMLs — copied to the agent’s pipelines/ directory (agent-agnostic)</w:t>
+      </w:r>
+    </w:p>
+    <w:p>
+      <w:pPr>
+        <w:pStyle w:val="ListParagraph"/>
+        <w:numPr>
+          <w:ilvl w:val="0"/>
+          <w:numId w:val="2"/>
+        </w:numPr>
+        <w:spacing w:after="40" w:before="40"/>
+      </w:pPr>
+      <w:r>
+        <w:rPr>
+          <w:rFonts w:ascii="Arial" w:cs="Arial" w:eastAsia="Arial" w:hAnsi="Arial"/>
+          <w:sz w:val="22"/>
+          <w:szCs w:val="22"/>
+        </w:rPr>
+        <w:t xml:space="preserve">Pipeline engine — PIPELINE-RUNNER.md and PROGRESS-TEMPLATE.md</w:t>
+      </w:r>
+    </w:p>
+    <w:p>
+      <w:pPr>
+        <w:pStyle w:val="ListParagraph"/>
+        <w:numPr>
+          <w:ilvl w:val="0"/>
+          <w:numId w:val="2"/>
+        </w:numPr>
+        <w:spacing w:after="40" w:before="40"/>
+      </w:pPr>
+      <w:r>
+        <w:rPr>
+          <w:rFonts w:ascii="Arial" w:cs="Arial" w:eastAsia="Arial" w:hAnsi="Arial"/>
+          <w:sz w:val="22"/>
+          <w:szCs w:val="22"/>
+        </w:rPr>
+        <w:t xml:space="preserve">Configuration — gate-config.json and balance-sheet-config.json (never overwritten)</w:t>
+      </w:r>
+    </w:p>
+    <w:p>
+      <w:pPr>
+        <w:pStyle w:val="ListParagraph"/>
+        <w:numPr>
+          <w:ilvl w:val="0"/>
+          <w:numId w:val="2"/>
+        </w:numPr>
+        <w:spacing w:after="40" w:before="40"/>
+      </w:pPr>
+      <w:r>
+        <w:rPr>
+          <w:rFonts w:ascii="Arial" w:cs="Arial" w:eastAsia="Arial" w:hAnsi="Arial"/>
+          <w:sz w:val="22"/>
+          <w:szCs w:val="22"/>
+        </w:rPr>
+        <w:t xml:space="preserve">Tracking file — .sdlc-installed.json records installed roles, agent, and version</w:t>
+      </w:r>
+    </w:p>
+    <w:p>
+      <w:pPr>
+        <w:pStyle w:val="ListParagraph"/>
+        <w:numPr>
+          <w:ilvl w:val="0"/>
+          <w:numId w:val="2"/>
+        </w:numPr>
+        <w:spacing w:after="40" w:before="40"/>
+      </w:pPr>
+      <w:r>
+        <w:rPr>
+          <w:rFonts w:ascii="Arial" w:cs="Arial" w:eastAsia="Arial" w:hAnsi="Arial"/>
+          <w:sz w:val="22"/>
+          <w:szCs w:val="22"/>
+        </w:rPr>
+        <w:t xml:space="preserve">MCP config — .mcp.json for Figma integration (designer role)</w:t>
+      </w:r>
+    </w:p>
+    <w:p>
+      <w:pPr>
+        <w:pStyle w:val="Heading2"/>
+        <w:spacing w:after="160" w:before="280"/>
+      </w:pPr>
+      <w:r>
+        <w:rPr>
+          <w:rFonts w:ascii="Arial" w:cs="Arial" w:eastAsia="Arial" w:hAnsi="Arial"/>
+          <w:b/>
+          <w:bCs/>
+          <w:color w:val="2E75B6"/>
+          <w:sz w:val="26"/>
+          <w:szCs w:val="26"/>
+        </w:rPr>
+        <w:t xml:space="preserve">4.4 Updating</w:t>
+      </w:r>
+    </w:p>
+    <w:p>
+      <w:pPr>
+        <w:spacing w:after="60" w:before="60"/>
+        <w:ind w:left="360"/>
+      </w:pPr>
+      <w:r>
+        <w:rPr>
+          <w:rFonts w:ascii="Courier New" w:cs="Courier New" w:eastAsia="Courier New" w:hAnsi="Courier New"/>
+          <w:color w:val="444444"/>
+          <w:sz w:val="20"/>
+          <w:szCs w:val="20"/>
+        </w:rPr>
+        <w:t xml:space="preserve">bash setup/update.sh</w:t>
+      </w:r>
+    </w:p>
+    <w:p>
+      <w:pPr>
+        <w:spacing w:after="80" w:before="80"/>
+      </w:pPr>
+      <w:r>
+        <w:rPr>
+          <w:rFonts w:ascii="Arial" w:cs="Arial" w:eastAsia="Arial" w:hAnsi="Arial"/>
+          <w:sz w:val="22"/>
+          <w:szCs w:val="22"/>
+        </w:rPr>
+        <w:t xml:space="preserve">Reads the tracking file, re-runs the installer, and preserves existing configuration files.</w:t>
+      </w:r>
+    </w:p>
+    <w:p>
+      <w:pPr>
+        <w:pStyle w:val="Heading2"/>
+        <w:spacing w:after="160" w:before="280"/>
+      </w:pPr>
+      <w:r>
+        <w:rPr>
+          <w:rFonts w:ascii="Arial" w:cs="Arial" w:eastAsia="Arial" w:hAnsi="Arial"/>
+          <w:b/>
+          <w:bCs/>
+          <w:color w:val="2E75B6"/>
+          <w:sz w:val="26"/>
+          <w:szCs w:val="26"/>
+        </w:rPr>
+        <w:t xml:space="preserve">4.5 Uninstalling</w:t>
+      </w:r>
+    </w:p>
+    <w:p>
+      <w:pPr>
+        <w:spacing w:after="60" w:before="60"/>
+        <w:ind w:left="360"/>
+      </w:pPr>
+      <w:r>
+        <w:rPr>
+          <w:rFonts w:ascii="Courier New" w:cs="Courier New" w:eastAsia="Courier New" w:hAnsi="Courier New"/>
+          <w:color w:val="444444"/>
+          <w:sz w:val="20"/>
+          <w:szCs w:val="20"/>
+        </w:rPr>
+        <w:t xml:space="preserve">bash setup/uninstall.sh</w:t>
+      </w:r>
+    </w:p>
+    <w:p>
+      <w:pPr>
+        <w:spacing w:after="80" w:before="80"/>
+      </w:pPr>
+      <w:r>
+        <w:rPr>
+          <w:rFonts w:ascii="Arial" w:cs="Arial" w:eastAsia="Arial" w:hAnsi="Arial"/>
+          <w:sz w:val="22"/>
+          <w:szCs w:val="22"/>
+        </w:rPr>
+        <w:t xml:space="preserve">Removes skills, pipelines, config, and the tracking file. Preserves CLAUDE.md.</w:t>
+      </w:r>
+    </w:p>
+    <w:p>
+      <w:r>
+        <w:br w:type="page"/>
+      </w:r>
+    </w:p>
+    <w:p>
+      <w:pPr>
+        <w:pStyle w:val="Heading1"/>
+        <w:spacing w:after="200" w:before="360"/>
+      </w:pPr>
+      <w:r>
+        <w:rPr>
+          <w:rFonts w:ascii="Arial" w:cs="Arial" w:eastAsia="Arial" w:hAnsi="Arial"/>
+          <w:b/>
+          <w:bCs/>
+          <w:color w:val="1A3E5C"/>
+          <w:sz w:val="32"/>
+          <w:szCs w:val="32"/>
+        </w:rPr>
+        <w:t xml:space="preserve">5. Skills Reference</w:t>
+      </w:r>
+    </w:p>
+    <w:p>
+      <w:pPr>
+        <w:spacing w:after="80" w:before="80"/>
+      </w:pPr>
+      <w:r>
+        <w:rPr>
+          <w:rFonts w:ascii="Arial" w:cs="Arial" w:eastAsia="Arial" w:hAnsi="Arial"/>
+          <w:sz w:val="22"/>
+          <w:szCs w:val="22"/>
+        </w:rPr>
+        <w:t xml:space="preserve">SDLC Central includes 60 skills organized into 13 categories. Each skill is invoked as a slash command with optional arguments.</w:t>
+      </w:r>
+    </w:p>
+    <w:p>
+      <w:pPr>
+        <w:pStyle w:val="Heading2"/>
+        <w:spacing w:after="160" w:before="280"/>
+      </w:pPr>
+      <w:r>
+        <w:rPr>
+          <w:rFonts w:ascii="Arial" w:cs="Arial" w:eastAsia="Arial" w:hAnsi="Arial"/>
+          <w:b/>
+          <w:bCs/>
+          <w:color w:val="2E75B6"/>
+          <w:sz w:val="26"/>
+          <w:szCs w:val="26"/>
+        </w:rPr>
+        <w:t xml:space="preserve">5.1 Skill Categories</w:t>
       </w:r>
     </w:p>
     <w:tbl>
@@ -3371,7 +6675,7 @@
           <w:sz w:val="26"/>
           <w:szCs w:val="26"/>
         </w:rPr>
-        <w:t xml:space="preserve">4.2 Skill Anatomy</w:t>
+        <w:t xml:space="preserve">5.2 Skill Anatomy</w:t>
       </w:r>
     </w:p>
     <w:p>
@@ -3473,7 +6777,7 @@
           <w:sz w:val="26"/>
           <w:szCs w:val="26"/>
         </w:rPr>
-        <w:t xml:space="preserve">4.3 Designer Skills (MCP-Backed)</w:t>
+        <w:t xml:space="preserve">5.3 Designer Skills (MCP-Backed)</w:t>
       </w:r>
     </w:p>
     <w:p>
@@ -3899,7 +7203,7 @@
           <w:sz w:val="26"/>
           <w:szCs w:val="26"/>
         </w:rPr>
-        <w:t xml:space="preserve">4.4 Non-Technical Bridge Skills</w:t>
+        <w:t xml:space="preserve">5.4 Non-Technical Bridge Skills</w:t>
       </w:r>
     </w:p>
     <w:p>
@@ -4390,7 +7694,7 @@
           <w:sz w:val="32"/>
           <w:szCs w:val="32"/>
         </w:rPr>
-        <w:t xml:space="preserve">5. Pipelines</w:t>
+        <w:t xml:space="preserve">6. Pipelines</w:t>
       </w:r>
     </w:p>
     <w:p>
@@ -4435,7 +7739,7 @@
           <w:sz w:val="26"/>
           <w:szCs w:val="26"/>
         </w:rPr>
-        <w:t xml:space="preserve">5.1 Pipeline Catalog</w:t>
+        <w:t xml:space="preserve">6.1 Pipeline Catalog</w:t>
       </w:r>
     </w:p>
     <w:tbl>
@@ -8449,7 +11753,7 @@
           <w:sz w:val="26"/>
           <w:szCs w:val="26"/>
         </w:rPr>
-        <w:t xml:space="preserve">5.2 Designer Pipelines</w:t>
+        <w:t xml:space="preserve">6.2 Designer Pipelines</w:t>
       </w:r>
     </w:p>
     <w:p>
@@ -8638,7 +11942,7 @@
           <w:sz w:val="26"/>
           <w:szCs w:val="26"/>
         </w:rPr>
-        <w:t xml:space="preserve">5.3 Product Owner &amp; QA Pipelines</w:t>
+        <w:t xml:space="preserve">6.3 Product Owner &amp; QA Pipelines</w:t>
       </w:r>
     </w:p>
     <w:p>
@@ -8880,7 +12184,7 @@
           <w:sz w:val="26"/>
           <w:szCs w:val="26"/>
         </w:rPr>
-        <w:t xml:space="preserve">5.4 Pipeline Execution Model</w:t>
+        <w:t xml:space="preserve">6.4 Pipeline Execution Model</w:t>
       </w:r>
     </w:p>
     <w:p>
@@ -8969,7 +12273,7 @@
           <w:sz w:val="26"/>
           <w:szCs w:val="26"/>
         </w:rPr>
-        <w:t xml:space="preserve">5.5 Gate Types</w:t>
+        <w:t xml:space="preserve">6.5 Gate Types</w:t>
       </w:r>
     </w:p>
     <w:tbl>
@@ -9396,7 +12700,7 @@
           <w:sz w:val="26"/>
           <w:szCs w:val="26"/>
         </w:rPr>
-        <w:t xml:space="preserve">5.6 Dry Run Mode</w:t>
+        <w:t xml:space="preserve">6.6 Dry Run Mode</w:t>
       </w:r>
     </w:p>
     <w:p>
@@ -9446,7 +12750,7 @@
           <w:sz w:val="32"/>
           <w:szCs w:val="32"/>
         </w:rPr>
-        <w:t xml:space="preserve">6. Roles and Skill Assignments</w:t>
+        <w:t xml:space="preserve">7. Roles and Skill Assignments</w:t>
       </w:r>
     </w:p>
     <w:p>
@@ -10657,7 +13961,7 @@
           <w:sz w:val="26"/>
           <w:szCs w:val="26"/>
         </w:rPr>
-        <w:t xml:space="preserve">6.1 Designer Role Deep Dive</w:t>
+        <w:t xml:space="preserve">7.1 Designer Role Deep Dive</w:t>
       </w:r>
     </w:p>
     <w:p>
@@ -10754,7 +14058,7 @@
           <w:sz w:val="26"/>
           <w:szCs w:val="26"/>
         </w:rPr>
-        <w:t xml:space="preserve">6.2 Non-Technical Role Expansion</w:t>
+        <w:t xml:space="preserve">7.2 Non-Technical Role Expansion</w:t>
       </w:r>
     </w:p>
     <w:p>
@@ -10856,7 +14160,7 @@
           <w:sz w:val="26"/>
           <w:szCs w:val="26"/>
         </w:rPr>
-        <w:t xml:space="preserve">6.3 Cross-Role Skill Sharing</w:t>
+        <w:t xml:space="preserve">7.3 Cross-Role Skill Sharing</w:t>
       </w:r>
     </w:p>
     <w:p>
@@ -11071,7 +14375,7 @@
           <w:sz w:val="32"/>
           <w:szCs w:val="32"/>
         </w:rPr>
-        <w:t xml:space="preserve">7. Quality Gates</w:t>
+        <w:t xml:space="preserve">8. Quality Gates</w:t>
       </w:r>
     </w:p>
     <w:p>
@@ -11101,7 +14405,7 @@
           <w:sz w:val="26"/>
           <w:szCs w:val="26"/>
         </w:rPr>
-        <w:t xml:space="preserve">7.1 Gate Profiles</w:t>
+        <w:t xml:space="preserve">8.1 Gate Profiles</w:t>
       </w:r>
     </w:p>
     <w:tbl>
@@ -11786,7 +15090,7 @@
           <w:sz w:val="26"/>
           <w:szCs w:val="26"/>
         </w:rPr>
-        <w:t xml:space="preserve">7.2 Transition Requirements (Standard)</w:t>
+        <w:t xml:space="preserve">8.2 Transition Requirements (Standard)</w:t>
       </w:r>
     </w:p>
     <w:tbl>
@@ -12150,7 +15454,7 @@
           <w:sz w:val="26"/>
           <w:szCs w:val="26"/>
         </w:rPr>
-        <w:t xml:space="preserve">7.3 Balance Sheet Scoring</w:t>
+        <w:t xml:space="preserve">8.3 Balance Sheet Scoring</w:t>
       </w:r>
     </w:p>
     <w:p>
@@ -12234,7 +15538,7 @@
           <w:sz w:val="32"/>
           <w:szCs w:val="32"/>
         </w:rPr>
-        <w:t xml:space="preserve">8. Registry and Catalog</w:t>
+        <w:t xml:space="preserve">9. Registry and Catalog</w:t>
       </w:r>
     </w:p>
     <w:p>
@@ -12331,7 +15635,7 @@
           <w:sz w:val="26"/>
           <w:szCs w:val="26"/>
         </w:rPr>
-        <w:t xml:space="preserve">8.1 Tool Mappings (Claude Code)</w:t>
+        <w:t xml:space="preserve">9.1 Tool Mappings (Claude Code)</w:t>
       </w:r>
     </w:p>
     <w:p>
@@ -12433,7 +15737,7 @@
           <w:sz w:val="32"/>
           <w:szCs w:val="32"/>
         </w:rPr>
-        <w:t xml:space="preserve">9. Adapter Deep Dive</w:t>
+        <w:t xml:space="preserve">10. Adapter Deep Dive</w:t>
       </w:r>
     </w:p>
     <w:p>
@@ -12450,7 +15754,7 @@
           <w:sz w:val="26"/>
           <w:szCs w:val="26"/>
         </w:rPr>
-        <w:t xml:space="preserve">9.1 Claude Code Adapter</w:t>
+        <w:t xml:space="preserve">10.1 Claude Code Adapter</w:t>
       </w:r>
     </w:p>
     <w:p>
@@ -12480,7 +15784,7 @@
           <w:sz w:val="26"/>
           <w:szCs w:val="26"/>
         </w:rPr>
-        <w:t xml:space="preserve">9.2 Cursor Adapter</w:t>
+        <w:t xml:space="preserve">10.2 Cursor Adapter</w:t>
       </w:r>
     </w:p>
     <w:p>
@@ -12510,7 +15814,7 @@
           <w:sz w:val="26"/>
           <w:szCs w:val="26"/>
         </w:rPr>
-        <w:t xml:space="preserve">9.3 Copilot Adapter</w:t>
+        <w:t xml:space="preserve">10.3 Copilot Adapter</w:t>
       </w:r>
     </w:p>
     <w:p>
@@ -12540,7 +15844,7 @@
           <w:sz w:val="26"/>
           <w:szCs w:val="26"/>
         </w:rPr>
-        <w:t xml:space="preserve">9.4 Adding a New Adapter</w:t>
+        <w:t xml:space="preserve">10.4 Adding a New Adapter</w:t>
       </w:r>
     </w:p>
     <w:p>
@@ -12652,7 +15956,7 @@
           <w:sz w:val="32"/>
           <w:szCs w:val="32"/>
         </w:rPr>
-        <w:t xml:space="preserve">10. Common Workflows</w:t>
+        <w:t xml:space="preserve">11. Common Workflows</w:t>
       </w:r>
     </w:p>
     <w:p>
@@ -12669,7 +15973,7 @@
           <w:sz w:val="26"/>
           <w:szCs w:val="26"/>
         </w:rPr>
-        <w:t xml:space="preserve">10.1 Spec-Driven Development</w:t>
+        <w:t xml:space="preserve">11.1 Spec-Driven Development</w:t>
       </w:r>
     </w:p>
     <w:p>
@@ -12771,7 +16075,7 @@
           <w:sz w:val="26"/>
           <w:szCs w:val="26"/>
         </w:rPr>
-        <w:t xml:space="preserve">10.2 Feature Build Pipeline</w:t>
+        <w:t xml:space="preserve">11.2 Feature Build Pipeline</w:t>
       </w:r>
     </w:p>
     <w:p>
@@ -12816,7 +16120,7 @@
           <w:sz w:val="26"/>
           <w:szCs w:val="26"/>
         </w:rPr>
-        <w:t xml:space="preserve">10.3 Incident Response</w:t>
+        <w:t xml:space="preserve">11.3 Incident Response</w:t>
       </w:r>
     </w:p>
     <w:p>
@@ -12861,7 +16165,7 @@
           <w:sz w:val="26"/>
           <w:szCs w:val="26"/>
         </w:rPr>
-        <w:t xml:space="preserve">10.4 Design-to-Code</w:t>
+        <w:t xml:space="preserve">11.4 Design-to-Code</w:t>
       </w:r>
     </w:p>
     <w:p>
@@ -12906,7 +16210,7 @@
           <w:sz w:val="26"/>
           <w:szCs w:val="26"/>
         </w:rPr>
-        <w:t xml:space="preserve">10.5 Design System Sync</w:t>
+        <w:t xml:space="preserve">11.5 Design System Sync</w:t>
       </w:r>
     </w:p>
     <w:p>
@@ -12951,7 +16255,7 @@
           <w:sz w:val="26"/>
           <w:szCs w:val="26"/>
         </w:rPr>
-        <w:t xml:space="preserve">10.6 Design Handoff</w:t>
+        <w:t xml:space="preserve">11.6 Design Handoff</w:t>
       </w:r>
     </w:p>
     <w:p>
@@ -12996,7 +16300,7 @@
           <w:sz w:val="26"/>
           <w:szCs w:val="26"/>
         </w:rPr>
-        <w:t xml:space="preserve">10.7 Stakeholder Update</w:t>
+        <w:t xml:space="preserve">11.7 Stakeholder Update</w:t>
       </w:r>
     </w:p>
     <w:p>
@@ -13041,7 +16345,7 @@
           <w:sz w:val="26"/>
           <w:szCs w:val="26"/>
         </w:rPr>
-        <w:t xml:space="preserve">10.8 Idea to Spec</w:t>
+        <w:t xml:space="preserve">11.8 Idea to Spec</w:t>
       </w:r>
     </w:p>
     <w:p>
@@ -13086,7 +16390,7 @@
           <w:sz w:val="26"/>
           <w:szCs w:val="26"/>
         </w:rPr>
-        <w:t xml:space="preserve">10.9 Sprint Demo</w:t>
+        <w:t xml:space="preserve">11.9 Sprint Demo</w:t>
       </w:r>
     </w:p>
     <w:p>
@@ -13131,7 +16435,7 @@
           <w:sz w:val="26"/>
           <w:szCs w:val="26"/>
         </w:rPr>
-        <w:t xml:space="preserve">10.10 Bug to Fix</w:t>
+        <w:t xml:space="preserve">11.10 Bug to Fix</w:t>
       </w:r>
     </w:p>
     <w:p>
@@ -13176,7 +16480,7 @@
           <w:sz w:val="26"/>
           <w:szCs w:val="26"/>
         </w:rPr>
-        <w:t xml:space="preserve">10.11 Resume a Pipeline</w:t>
+        <w:t xml:space="preserve">11.11 Resume a Pipeline</w:t>
       </w:r>
     </w:p>
     <w:p>
@@ -13226,7 +16530,7 @@
           <w:sz w:val="32"/>
           <w:szCs w:val="32"/>
         </w:rPr>
-        <w:t xml:space="preserve">11. Configuration</w:t>
+        <w:t xml:space="preserve">12. Configuration</w:t>
       </w:r>
     </w:p>
     <w:p>
@@ -13243,7 +16547,7 @@
           <w:sz w:val="26"/>
           <w:szCs w:val="26"/>
         </w:rPr>
-        <w:t xml:space="preserve">11.1 Gate Configuration</w:t>
+        <w:t xml:space="preserve">12.1 Gate Configuration</w:t>
       </w:r>
     </w:p>
     <w:p>
@@ -13279,7 +16583,7 @@
           <w:sz w:val="22"/>
           <w:szCs w:val="22"/>
         </w:rPr>
-        <w:t xml:space="preserve">Quality gate thresholds per profile and transition. See Chapter 7.</w:t>
+        <w:t xml:space="preserve">Quality gate thresholds per profile and transition. See Chapter 8.</w:t>
       </w:r>
     </w:p>
     <w:p>
@@ -13296,7 +16600,7 @@
           <w:sz w:val="26"/>
           <w:szCs w:val="26"/>
         </w:rPr>
-        <w:t xml:space="preserve">11.2 Balance Sheet Configuration</w:t>
+        <w:t xml:space="preserve">12.2 Balance Sheet Configuration</w:t>
       </w:r>
     </w:p>
     <w:p>
@@ -13332,7 +16636,7 @@
           <w:sz w:val="22"/>
           <w:szCs w:val="22"/>
         </w:rPr>
-        <w:t xml:space="preserve">Benefit and cost dimension weights for feature scoring. See Chapter 7.3.</w:t>
+        <w:t xml:space="preserve">Benefit and cost dimension weights for feature scoring. See Chapter 8.3.</w:t>
       </w:r>
     </w:p>
     <w:p>
@@ -13349,7 +16653,7 @@
           <w:sz w:val="26"/>
           <w:szCs w:val="26"/>
         </w:rPr>
-        <w:t xml:space="preserve">11.3 Project Template</w:t>
+        <w:t xml:space="preserve">12.3 Project Template</w:t>
       </w:r>
     </w:p>
     <w:p>
@@ -13402,7 +16706,7 @@
           <w:sz w:val="26"/>
           <w:szCs w:val="26"/>
         </w:rPr>
-        <w:t xml:space="preserve">11.4 MCP Configuration</w:t>
+        <w:t xml:space="preserve">12.4 MCP Configuration</w:t>
       </w:r>
     </w:p>
     <w:p>
@@ -13483,7 +16787,7 @@
           <w:sz w:val="26"/>
           <w:szCs w:val="26"/>
         </w:rPr>
-        <w:t xml:space="preserve">11.5 Tool Mappings</w:t>
+        <w:t xml:space="preserve">12.5 Tool Mappings</w:t>
       </w:r>
     </w:p>
     <w:p>
@@ -13541,7 +16845,7 @@
           <w:sz w:val="32"/>
           <w:szCs w:val="32"/>
         </w:rPr>
-        <w:t xml:space="preserve">12. Recommended Git Branching Strategy</w:t>
+        <w:t xml:space="preserve">13. Recommended Git Branching Strategy</w:t>
       </w:r>
     </w:p>
     <w:p>
@@ -13554,7 +16858,7 @@
           <w:sz w:val="22"/>
           <w:szCs w:val="22"/>
         </w:rPr>
-        <w:t xml:space="preserve">For teams using SDLC Central, we recommend trunk-based development with short-lived feature branches.</w:t>
+        <w:t xml:space="preserve">For teams using SDLC Central, we recommend trunk-based development with short-lived feature branches. See Chapter 3.5 for branch naming conventions tied to work tiers.</w:t>
       </w:r>
     </w:p>
     <w:p>
@@ -13571,7 +16875,7 @@
           <w:sz w:val="26"/>
           <w:szCs w:val="26"/>
         </w:rPr>
-        <w:t xml:space="preserve">12.1 Branch Structure</w:t>
+        <w:t xml:space="preserve">13.1 Branch Structure</w:t>
       </w:r>
     </w:p>
     <w:tbl>
@@ -13916,7 +17220,7 @@
                 <w:sz w:val="18"/>
                 <w:szCs w:val="18"/>
               </w:rPr>
-              <w:t xml:space="preserve">feat/&lt;spec-id&gt;-&lt;slug&gt;</w:t>
+              <w:t xml:space="preserve">feat/T2-&lt;spec-id&gt;-&lt;slug&gt;</w:t>
             </w:r>
           </w:p>
         </w:tc>
@@ -13947,7 +17251,7 @@
                 <w:sz w:val="18"/>
                 <w:szCs w:val="18"/>
               </w:rPr>
-              <w:t xml:space="preserve">Feature work driven by a spec</w:t>
+              <w:t xml:space="preserve">Tier 2 feature work driven by a spec</w:t>
             </w:r>
           </w:p>
         </w:tc>
@@ -14012,7 +17316,7 @@
                 <w:sz w:val="18"/>
                 <w:szCs w:val="18"/>
               </w:rPr>
-              <w:t xml:space="preserve">fix/&lt;issue-id&gt;-&lt;slug&gt;</w:t>
+              <w:t xml:space="preserve">feat/T3-&lt;spec-id&gt;-&lt;slug&gt;</w:t>
             </w:r>
           </w:p>
         </w:tc>
@@ -14044,7 +17348,7 @@
                 <w:sz w:val="18"/>
                 <w:szCs w:val="18"/>
               </w:rPr>
-              <w:t xml:space="preserve">Bug fixes</w:t>
+              <w:t xml:space="preserve">Tier 3 significant feature work</w:t>
             </w:r>
           </w:p>
         </w:tc>
@@ -14076,7 +17380,7 @@
                 <w:sz w:val="18"/>
                 <w:szCs w:val="18"/>
               </w:rPr>
-              <w:t xml:space="preserve">Hours to days</w:t>
+              <w:t xml:space="preserve">Days to weeks</w:t>
             </w:r>
           </w:p>
         </w:tc>
@@ -14109,6 +17413,102 @@
                 <w:sz w:val="18"/>
                 <w:szCs w:val="18"/>
               </w:rPr>
+              <w:t xml:space="preserve">fix/&lt;issue-id&gt;-&lt;slug&gt;</w:t>
+            </w:r>
+          </w:p>
+        </w:tc>
+        <w:tc>
+          <w:tcPr>
+            <w:tcW w:type="dxa" w:w="4360"/>
+            <w:tcBorders>
+              <w:top w:val="single" w:color="CCCCCC" w:sz="1"/>
+              <w:left w:val="single" w:color="CCCCCC" w:sz="1"/>
+              <w:bottom w:val="single" w:color="CCCCCC" w:sz="1"/>
+              <w:right w:val="single" w:color="CCCCCC" w:sz="1"/>
+            </w:tcBorders>
+            <w:tcMar>
+              <w:top w:type="dxa" w:w="60"/>
+              <w:left w:type="dxa" w:w="100"/>
+              <w:bottom w:type="dxa" w:w="60"/>
+              <w:right w:type="dxa" w:w="100"/>
+            </w:tcMar>
+          </w:tcPr>
+          <w:p>
+            <w:pPr>
+              <w:spacing w:after="0" w:before="0"/>
+            </w:pPr>
+            <w:r>
+              <w:rPr>
+                <w:rFonts w:ascii="Arial" w:cs="Arial" w:eastAsia="Arial" w:hAnsi="Arial"/>
+                <w:color w:val="333333"/>
+                <w:sz w:val="18"/>
+                <w:szCs w:val="18"/>
+              </w:rPr>
+              <w:t xml:space="preserve">Tier 1 bug fixes and trivial changes</w:t>
+            </w:r>
+          </w:p>
+        </w:tc>
+        <w:tc>
+          <w:tcPr>
+            <w:tcW w:type="dxa" w:w="2500"/>
+            <w:tcBorders>
+              <w:top w:val="single" w:color="CCCCCC" w:sz="1"/>
+              <w:left w:val="single" w:color="CCCCCC" w:sz="1"/>
+              <w:bottom w:val="single" w:color="CCCCCC" w:sz="1"/>
+              <w:right w:val="single" w:color="CCCCCC" w:sz="1"/>
+            </w:tcBorders>
+            <w:tcMar>
+              <w:top w:type="dxa" w:w="60"/>
+              <w:left w:type="dxa" w:w="100"/>
+              <w:bottom w:type="dxa" w:w="60"/>
+              <w:right w:type="dxa" w:w="100"/>
+            </w:tcMar>
+          </w:tcPr>
+          <w:p>
+            <w:pPr>
+              <w:spacing w:after="0" w:before="0"/>
+            </w:pPr>
+            <w:r>
+              <w:rPr>
+                <w:rFonts w:ascii="Arial" w:cs="Arial" w:eastAsia="Arial" w:hAnsi="Arial"/>
+                <w:color w:val="333333"/>
+                <w:sz w:val="18"/>
+                <w:szCs w:val="18"/>
+              </w:rPr>
+              <w:t xml:space="preserve">Hours to days</w:t>
+            </w:r>
+          </w:p>
+        </w:tc>
+      </w:tr>
+      <w:tr>
+        <w:tc>
+          <w:tcPr>
+            <w:tcW w:type="dxa" w:w="2500"/>
+            <w:tcBorders>
+              <w:top w:val="single" w:color="CCCCCC" w:sz="1"/>
+              <w:left w:val="single" w:color="CCCCCC" w:sz="1"/>
+              <w:bottom w:val="single" w:color="CCCCCC" w:sz="1"/>
+              <w:right w:val="single" w:color="CCCCCC" w:sz="1"/>
+            </w:tcBorders>
+            <w:shd w:fill="F2F7FB" w:val="clear"/>
+            <w:tcMar>
+              <w:top w:type="dxa" w:w="60"/>
+              <w:left w:type="dxa" w:w="100"/>
+              <w:bottom w:type="dxa" w:w="60"/>
+              <w:right w:type="dxa" w:w="100"/>
+            </w:tcMar>
+          </w:tcPr>
+          <w:p>
+            <w:pPr>
+              <w:spacing w:after="0" w:before="0"/>
+            </w:pPr>
+            <w:r>
+              <w:rPr>
+                <w:rFonts w:ascii="Arial" w:cs="Arial" w:eastAsia="Arial" w:hAnsi="Arial"/>
+                <w:color w:val="333333"/>
+                <w:sz w:val="18"/>
+                <w:szCs w:val="18"/>
+              </w:rPr>
               <w:t xml:space="preserve">spike/&lt;topic&gt;</w:t>
             </w:r>
           </w:p>
@@ -14122,6 +17522,7 @@
               <w:bottom w:val="single" w:color="CCCCCC" w:sz="1"/>
               <w:right w:val="single" w:color="CCCCCC" w:sz="1"/>
             </w:tcBorders>
+            <w:shd w:fill="F2F7FB" w:val="clear"/>
             <w:tcMar>
               <w:top w:type="dxa" w:w="60"/>
               <w:left w:type="dxa" w:w="100"/>
@@ -14153,6 +17554,7 @@
               <w:bottom w:val="single" w:color="CCCCCC" w:sz="1"/>
               <w:right w:val="single" w:color="CCCCCC" w:sz="1"/>
             </w:tcBorders>
+            <w:shd w:fill="F2F7FB" w:val="clear"/>
             <w:tcMar>
               <w:top w:type="dxa" w:w="60"/>
               <w:left w:type="dxa" w:w="100"/>
@@ -14191,7 +17593,7 @@
           <w:sz w:val="26"/>
           <w:szCs w:val="26"/>
         </w:rPr>
-        <w:t xml:space="preserve">12.2 Workflow</w:t>
+        <w:t xml:space="preserve">13.2 Workflow</w:t>
       </w:r>
     </w:p>
     <w:p>
@@ -14227,7 +17629,7 @@
           <w:sz w:val="22"/>
           <w:szCs w:val="22"/>
         </w:rPr>
-        <w:t xml:space="preserve">Branch to feat/&lt;spec-id&gt;-&lt;slug&gt; and run the full pipeline</w:t>
+        <w:t xml:space="preserve">Branch to feat/&lt;tier&gt;-&lt;spec-id&gt;-&lt;slug&gt; and run the appropriate pipeline</w:t>
       </w:r>
     </w:p>
     <w:p>
@@ -14298,7 +17700,7 @@
           <w:sz w:val="26"/>
           <w:szCs w:val="26"/>
         </w:rPr>
-        <w:t xml:space="preserve">12.3 Conventions</w:t>
+        <w:t xml:space="preserve">13.3 Conventions</w:t>
       </w:r>
     </w:p>
     <w:p>
@@ -14410,7 +17812,7 @@
           <w:sz w:val="32"/>
           <w:szCs w:val="32"/>
         </w:rPr>
-        <w:t xml:space="preserve">13. Troubleshooting</w:t>
+        <w:t xml:space="preserve">14. Troubleshooting</w:t>
       </w:r>
     </w:p>
     <w:p>
@@ -14427,7 +17829,7 @@
           <w:sz w:val="26"/>
           <w:szCs w:val="26"/>
         </w:rPr>
-        <w:t xml:space="preserve">13.1 Common Issues</w:t>
+        <w:t xml:space="preserve">14.1 Common Issues</w:t>
       </w:r>
     </w:p>
     <w:tbl>
@@ -15433,7 +18835,7 @@
           <w:sz w:val="26"/>
           <w:szCs w:val="26"/>
         </w:rPr>
-        <w:t xml:space="preserve">13.2 Verifying Installation</w:t>
+        <w:t xml:space="preserve">14.2 Verifying Installation</w:t>
       </w:r>
     </w:p>
     <w:p>
@@ -15478,7 +18880,7 @@
           <w:sz w:val="26"/>
           <w:szCs w:val="26"/>
         </w:rPr>
-        <w:t xml:space="preserve">13.3 Checking MCP Configuration</w:t>
+        <w:t xml:space="preserve">14.3 Checking MCP Configuration</w:t>
       </w:r>
     </w:p>
     <w:p>
@@ -15523,7 +18925,7 @@
           <w:sz w:val="26"/>
           <w:szCs w:val="26"/>
         </w:rPr>
-        <w:t xml:space="preserve">13.4 Testing a Skill</w:t>
+        <w:t xml:space="preserve">14.4 Testing a Skill</w:t>
       </w:r>
     </w:p>
     <w:p>
@@ -15600,7 +19002,7 @@
           <w:sz w:val="26"/>
           <w:szCs w:val="26"/>
         </w:rPr>
-        <w:t xml:space="preserve">13.5 Testing a Pipeline</w:t>
+        <w:t xml:space="preserve">14.5 Testing a Pipeline</w:t>
       </w:r>
     </w:p>
     <w:p>
@@ -15667,7 +19069,7 @@
           <w:sz w:val="32"/>
           <w:szCs w:val="32"/>
         </w:rPr>
-        <w:t xml:space="preserve">14. Appendix</w:t>
+        <w:t xml:space="preserve">15. Appendix</w:t>
       </w:r>
     </w:p>
     <w:p>
@@ -15684,7 +19086,7 @@
           <w:sz w:val="26"/>
           <w:szCs w:val="26"/>
         </w:rPr>
-        <w:t xml:space="preserve">14.1 Full Skill List (60 Skills)</w:t>
+        <w:t xml:space="preserve">15.1 Full Skill List (60 Skills)</w:t>
       </w:r>
     </w:p>
     <w:tbl>
@@ -23538,7 +26940,7 @@
           <w:sz w:val="26"/>
           <w:szCs w:val="26"/>
         </w:rPr>
-        <w:t xml:space="preserve">14.2 Pipeline YAML Schema</w:t>
+        <w:t xml:space="preserve">15.2 Pipeline YAML Schema</w:t>
       </w:r>
     </w:p>
     <w:p>
@@ -23600,7 +27002,7 @@
           <w:sz w:val="26"/>
           <w:szCs w:val="26"/>
         </w:rPr>
-        <w:t xml:space="preserve">14.3 MCP Tool Reference (Figma)</w:t>
+        <w:t xml:space="preserve">15.3 MCP Tool Reference (Figma)</w:t>
       </w:r>
     </w:p>
     <w:tbl>
@@ -24318,7 +27720,7 @@
           <w:sz w:val="26"/>
           <w:szCs w:val="26"/>
         </w:rPr>
-        <w:t xml:space="preserve">14.4 Plugin Package</w:t>
+        <w:t xml:space="preserve">15.4 Plugin Package</w:t>
       </w:r>
     </w:p>
     <w:p>
@@ -24467,7 +27869,7 @@
         <w:sz w:val="18"/>
         <w:szCs w:val="18"/>
       </w:rPr>
-      <w:t xml:space="preserve">SDLC Central — Technical User Guide v1.2</w:t>
+      <w:t xml:space="preserve">SDLC Central — Technical User Guide v1.3</w:t>
     </w:r>
   </w:p>
 </w:hdr>

</xml_diff>

<commit_message>
Add security-audit-deep skill and upgrade both audits to OWASP 2025 + Agentic 2026
Split security audit into fast (per-PR gate, ~5 min) and deep (release/monthly,
~15–25 min) variants. Both align findings to OWASP Top 10:2025 with
edition-stamped codes; deep scan additionally runs OWASP Top 10 for Agentic
Applications 2026 (ASI01–ASI10) when LLM/MCP/vector-DB surface is detected.
Deep scan adds IaC/container/SBOM/runtime checks, CVSS+CWE scoring, SARIF
output, compliance mapping, STRIDE prompt, and a scanner-DB staleness gate.
User guide Section 5.5 and registry catalog updated to match.
</commit_message>
<xml_diff>
--- a/SDLC-Central-Technical-User-Guide.docx
+++ b/SDLC-Central-Technical-User-Guide.docx
@@ -5266,7 +5266,7 @@
           <w:sz w:val="22"/>
           <w:szCs w:val="22"/>
         </w:rPr>
-        <w:t xml:space="preserve">SDLC Central includes 60 skills organized into 13 categories. Each skill is invoked as a slash command with optional arguments.</w:t>
+        <w:t>SDLC Central includes 61 skills organized into 13 categories. Each skill is invoked as a slash command with optional arguments.</w:t>
       </w:r>
     </w:p>
     <w:p>
@@ -5466,7 +5466,7 @@
                 <w:sz w:val="18"/>
                 <w:szCs w:val="18"/>
               </w:rPr>
-              <w:t xml:space="preserve">10</w:t>
+              <w:t>11</w:t>
             </w:r>
           </w:p>
         </w:tc>
@@ -5497,7 +5497,7 @@
                 <w:sz w:val="18"/>
                 <w:szCs w:val="18"/>
               </w:rPr>
-              <w:t xml:space="preserve">review, security-audit, test-gen, doc-gen, design-review, review-fix, spec-fix, pr-orchestrator, design-to-code, design-token-sync</w:t>
+              <w:t>review, security-audit, test-gen, doc-gen, design-review, review-fix, spec-fix, pr-orchestrator, design-to-code, design-token-sync, security-audit-deep</w:t>
             </w:r>
           </w:p>
         </w:tc>
@@ -7678,6 +7678,106 @@
     <w:p>
       <w:r>
         <w:br w:type="page"/>
+      </w:r>
+    </w:p>
+    <w:p>
+      <w:pPr>
+        <w:pStyle w:val="Heading2"/>
+        <w:spacing w:after="160" w:before="280"/>
+      </w:pPr>
+      <w:r>
+        <w:t xml:space="preserve">5.5 Security Audit Skills</w:t>
+      </w:r>
+    </w:p>
+    <w:p>
+      <w:pPr>
+        <w:spacing w:after="80" w:before="80"/>
+      </w:pPr>
+      <w:r>
+        <w:t>Two complementary skills cover security scanning across the SDLC, aligned to OWASP Top 10:2025 (8th edition) with additional OWASP Top 10 for Agentic Applications 2026 coverage in the deep scan for repositories with LLM or agent surface area. The fast skill is a per-PR gate completing in ~5 minutes; the deep skill is a release-gate / monthly audit running in ~15–25 minutes. Both produce timestamped reports under reports/ with YAML front-matter and a hard pass/fail gate signal.</w:t>
+      </w:r>
+    </w:p>
+    <w:p>
+      <w:pPr>
+        <w:pStyle w:val="Heading3"/>
+        <w:spacing w:after="120" w:before="200"/>
+      </w:pPr>
+      <w:r>
+        <w:t xml:space="preserve">security-audit</w:t>
+      </w:r>
+    </w:p>
+    <w:p>
+      <w:pPr>
+        <w:spacing w:after="80" w:before="80"/>
+      </w:pPr>
+      <w:r>
+        <w:t xml:space="preserve">Command: /security-audit [scope-label]</w:t>
+      </w:r>
+    </w:p>
+    <w:p>
+      <w:pPr>
+        <w:spacing w:after="80" w:before="80"/>
+      </w:pPr>
+      <w:r>
+        <w:t xml:space="preserve">Category: Development  |  Roles: Developer, DevOps/SRE, Tech Lead</w:t>
+      </w:r>
+    </w:p>
+    <w:p>
+      <w:pPr>
+        <w:spacing w:after="80" w:before="80"/>
+      </w:pPr>
+      <w:r>
+        <w:t>Fast full-repo security scan designed as a per-PR gate. Runs semgrep (OWASP Top Ten rule-pack, auto-tracks the currently published edition), gitleaks (secret scanning), and language-specific dependency audits (npm audit, pip-audit, govulncheck, cargo audit, bundle-audit). Targeted grep-based checks cover OWASP Top 10:2025 — the 8th-edition ordering published November 2025 — including the new A03:2025 Software Supply Chain Failures, A10:2025 Mishandling of Exceptional Conditions, SSRF absorbed into A01:2025 Broken Access Control, and Security Misconfiguration promoted from #5 to #2. Every finding is tagged with the edition-stamped OWASP code (e.g., A05:2025), severity, and remediation effort. Produces a Vulnerability Summary table plus detailed findings. Emits a hard FAILED gate if any critical or more than three high-severity issues are found — CI should treat the banner as a block signal. Suppression via '# security-audit: ignore' annotations, logged separately.</w:t>
+      </w:r>
+    </w:p>
+    <w:p>
+      <w:pPr>
+        <w:pStyle w:val="Heading3"/>
+        <w:spacing w:after="120" w:before="200"/>
+      </w:pPr>
+      <w:r>
+        <w:t xml:space="preserve">security-audit-deep</w:t>
+      </w:r>
+    </w:p>
+    <w:p>
+      <w:pPr>
+        <w:spacing w:after="80" w:before="80"/>
+      </w:pPr>
+      <w:r>
+        <w:t xml:space="preserve">Command: /security-audit-deep [scope-label]</w:t>
+      </w:r>
+    </w:p>
+    <w:p>
+      <w:pPr>
+        <w:spacing w:after="80" w:before="80"/>
+      </w:pPr>
+      <w:r>
+        <w:t xml:space="preserve">Category: Development  |  Roles: Developer, QA, DevOps/SRE, Tech Lead</w:t>
+      </w:r>
+    </w:p>
+    <w:p>
+      <w:pPr>
+        <w:spacing w:after="80" w:before="80"/>
+      </w:pPr>
+      <w:r>
+        <w:t>Full-depth security audit for release gates, monthly compliance cadence, or post-incident review. Includes everything in the fast variant plus: IaC scanning (tfsec, Checkov, kubesec), container image scanning (Trivy, Grype), SBOM generation (Syft, CycloneDX/SPDX), live runtime checks (TLS via testssl.sh, HTTP security headers, cookie attributes, GraphQL introspection), CSP strength analysis, OAuth flow review, business-logic checks (mass assignment, path traversal, ReDoS, timing attacks, TOCTOU), CWE + CVSS 3.1 scoring, SARIF output (.audit/findings.sarif), compliance mapping (PCI-DSS, HIPAA, SOC2, GDPR), and a STRIDE threat model prompt. Findings are tagged with the OWASP Top 10:2025 edition — including post-quantum readiness under A04:2025 Cryptographic Failures, SBOM-driven supply chain analysis under A03:2025, and the new A10:2025 Mishandling of Exceptional Conditions (fail-open on auth, stack-trace leakage, panic-on-input, transaction rollback correctness). When the repository contains agentic-AI surface area (LLM SDKs, MCP servers, vector databases, multi-agent frameworks), the deep skill additionally runs the OWASP Top 10 for Agentic Applications 2026 (ASI01–ASI10) covering prompt injection, tool misuse, identity and privilege abuse, agentic supply chain (MCP servers, prompt-template provenance, model-weight integrity), unexpected code execution, memory/context poisoning, insecure inter-agent communication, cascading failures, human-agent trust exploitation, and rogue-agent detection — anchored on the Least-Agency and Strong Observability principles. A pre-flight vulnerability-DB freshness gate aborts the scan if any offline scanner database (Trivy, Grype, cargo-audit, bundler-audit) is more than 7 days old, preventing silent false-cleans from stale data.</w:t>
+      </w:r>
+    </w:p>
+    <w:p>
+      <w:pPr>
+        <w:pStyle w:val="Heading3"/>
+        <w:spacing w:after="120" w:before="200"/>
+      </w:pPr>
+      <w:r>
+        <w:t xml:space="preserve">When to use which</w:t>
+      </w:r>
+    </w:p>
+    <w:p>
+      <w:pPr>
+        <w:spacing w:after="80" w:before="80"/>
+      </w:pPr>
+      <w:r>
+        <w:t xml:space="preserve">Use /security-audit on every PR and before merge to main. Use /security-audit-deep before release, monthly for compliance, after incidents, and when changes touch auth, payment, or PII. Escalate from fast to deep if the fast scan reports more than three high-severity findings. Both skills produce SARIF output that can feed dashboards, GitHub Advanced Security, or the compliance evidence trail.</w:t>
       </w:r>
     </w:p>
     <w:p>
@@ -13237,7 +13337,7 @@
                 <w:sz w:val="18"/>
                 <w:szCs w:val="18"/>
               </w:rPr>
-              <w:t xml:space="preserve">22</w:t>
+              <w:t>23</w:t>
             </w:r>
           </w:p>
         </w:tc>
@@ -13365,7 +13465,7 @@
                 <w:sz w:val="18"/>
                 <w:szCs w:val="18"/>
               </w:rPr>
-              <w:t xml:space="preserve">13</w:t>
+              <w:t>14</w:t>
             </w:r>
           </w:p>
         </w:tc>
@@ -13493,7 +13593,7 @@
                 <w:sz w:val="18"/>
                 <w:szCs w:val="18"/>
               </w:rPr>
-              <w:t xml:space="preserve">14</w:t>
+              <w:t>15</w:t>
             </w:r>
           </w:p>
         </w:tc>
@@ -13621,7 +13721,7 @@
                 <w:sz w:val="18"/>
                 <w:szCs w:val="18"/>
               </w:rPr>
-              <w:t xml:space="preserve">60</w:t>
+              <w:t>61</w:t>
             </w:r>
           </w:p>
         </w:tc>
@@ -19086,7 +19186,7 @@
           <w:sz w:val="26"/>
           <w:szCs w:val="26"/>
         </w:rPr>
-        <w:t xml:space="preserve">15.1 Full Skill List (60 Skills)</w:t>
+        <w:t>15.1 Full Skill List (61 Skills)</w:t>
       </w:r>
     </w:p>
     <w:tbl>
@@ -25269,26 +25369,25 @@
               <w:bottom w:val="single" w:color="CCCCCC" w:sz="1"/>
               <w:right w:val="single" w:color="CCCCCC" w:sz="1"/>
             </w:tcBorders>
-            <w:shd w:fill="F2F7FB" w:val="clear"/>
-            <w:tcMar>
-              <w:top w:type="dxa" w:w="60"/>
-              <w:left w:type="dxa" w:w="100"/>
-              <w:bottom w:type="dxa" w:w="60"/>
-              <w:right w:type="dxa" w:w="100"/>
-            </w:tcMar>
-          </w:tcPr>
-          <w:p>
-            <w:pPr>
-              <w:spacing w:after="0" w:before="0"/>
-            </w:pPr>
-            <w:r>
-              <w:rPr>
-                <w:rFonts w:ascii="Arial" w:cs="Arial" w:eastAsia="Arial" w:hAnsi="Arial"/>
-                <w:color w:val="333333"/>
-                <w:sz w:val="18"/>
-                <w:szCs w:val="18"/>
-              </w:rPr>
-              <w:t xml:space="preserve">48</w:t>
+            <w:tcMar>
+              <w:top w:type="dxa" w:w="60"/>
+              <w:left w:type="dxa" w:w="100"/>
+              <w:bottom w:type="dxa" w:w="60"/>
+              <w:right w:type="dxa" w:w="100"/>
+            </w:tcMar>
+          </w:tcPr>
+          <w:p>
+            <w:pPr>
+              <w:spacing w:after="0" w:before="0"/>
+            </w:pPr>
+            <w:r>
+              <w:rPr>
+                <w:rFonts w:ascii="Arial" w:cs="Arial" w:eastAsia="Arial" w:hAnsi="Arial"/>
+                <w:color w:val="333333"/>
+                <w:sz w:val="18"/>
+                <w:szCs w:val="18"/>
+              </w:rPr>
+              <w:t>48</w:t>
             </w:r>
           </w:p>
         </w:tc>
@@ -25301,26 +25400,25 @@
               <w:bottom w:val="single" w:color="CCCCCC" w:sz="1"/>
               <w:right w:val="single" w:color="CCCCCC" w:sz="1"/>
             </w:tcBorders>
-            <w:shd w:fill="F2F7FB" w:val="clear"/>
-            <w:tcMar>
-              <w:top w:type="dxa" w:w="60"/>
-              <w:left w:type="dxa" w:w="100"/>
-              <w:bottom w:type="dxa" w:w="60"/>
-              <w:right w:type="dxa" w:w="100"/>
-            </w:tcMar>
-          </w:tcPr>
-          <w:p>
-            <w:pPr>
-              <w:spacing w:after="0" w:before="0"/>
-            </w:pPr>
-            <w:r>
-              <w:rPr>
-                <w:rFonts w:ascii="Arial" w:cs="Arial" w:eastAsia="Arial" w:hAnsi="Arial"/>
-                <w:color w:val="333333"/>
-                <w:sz w:val="18"/>
-                <w:szCs w:val="18"/>
-              </w:rPr>
-              <w:t xml:space="preserve">skill-gap-analyzer</w:t>
+            <w:tcMar>
+              <w:top w:type="dxa" w:w="60"/>
+              <w:left w:type="dxa" w:w="100"/>
+              <w:bottom w:type="dxa" w:w="60"/>
+              <w:right w:type="dxa" w:w="100"/>
+            </w:tcMar>
+          </w:tcPr>
+          <w:p>
+            <w:pPr>
+              <w:spacing w:after="0" w:before="0"/>
+            </w:pPr>
+            <w:r>
+              <w:rPr>
+                <w:rFonts w:ascii="Arial" w:cs="Arial" w:eastAsia="Arial" w:hAnsi="Arial"/>
+                <w:color w:val="333333"/>
+                <w:sz w:val="18"/>
+                <w:szCs w:val="18"/>
+              </w:rPr>
+              <w:t>security-audit-deep</w:t>
             </w:r>
           </w:p>
         </w:tc>
@@ -25333,26 +25431,25 @@
               <w:bottom w:val="single" w:color="CCCCCC" w:sz="1"/>
               <w:right w:val="single" w:color="CCCCCC" w:sz="1"/>
             </w:tcBorders>
-            <w:shd w:fill="F2F7FB" w:val="clear"/>
-            <w:tcMar>
-              <w:top w:type="dxa" w:w="60"/>
-              <w:left w:type="dxa" w:w="100"/>
-              <w:bottom w:type="dxa" w:w="60"/>
-              <w:right w:type="dxa" w:w="100"/>
-            </w:tcMar>
-          </w:tcPr>
-          <w:p>
-            <w:pPr>
-              <w:spacing w:after="0" w:before="0"/>
-            </w:pPr>
-            <w:r>
-              <w:rPr>
-                <w:rFonts w:ascii="Arial" w:cs="Arial" w:eastAsia="Arial" w:hAnsi="Arial"/>
-                <w:color w:val="333333"/>
-                <w:sz w:val="18"/>
-                <w:szCs w:val="18"/>
-              </w:rPr>
-              <w:t xml:space="preserve">governance</w:t>
+            <w:tcMar>
+              <w:top w:type="dxa" w:w="60"/>
+              <w:left w:type="dxa" w:w="100"/>
+              <w:bottom w:type="dxa" w:w="60"/>
+              <w:right w:type="dxa" w:w="100"/>
+            </w:tcMar>
+          </w:tcPr>
+          <w:p>
+            <w:pPr>
+              <w:spacing w:after="0" w:before="0"/>
+            </w:pPr>
+            <w:r>
+              <w:rPr>
+                <w:rFonts w:ascii="Arial" w:cs="Arial" w:eastAsia="Arial" w:hAnsi="Arial"/>
+                <w:color w:val="333333"/>
+                <w:sz w:val="18"/>
+                <w:szCs w:val="18"/>
+              </w:rPr>
+              <w:t>development</w:t>
             </w:r>
           </w:p>
         </w:tc>
@@ -25365,26 +25462,25 @@
               <w:bottom w:val="single" w:color="CCCCCC" w:sz="1"/>
               <w:right w:val="single" w:color="CCCCCC" w:sz="1"/>
             </w:tcBorders>
-            <w:shd w:fill="F2F7FB" w:val="clear"/>
-            <w:tcMar>
-              <w:top w:type="dxa" w:w="60"/>
-              <w:left w:type="dxa" w:w="100"/>
-              <w:bottom w:type="dxa" w:w="60"/>
-              <w:right w:type="dxa" w:w="100"/>
-            </w:tcMar>
-          </w:tcPr>
-          <w:p>
-            <w:pPr>
-              <w:spacing w:after="0" w:before="0"/>
-            </w:pPr>
-            <w:r>
-              <w:rPr>
-                <w:rFonts w:ascii="Arial" w:cs="Arial" w:eastAsia="Arial" w:hAnsi="Arial"/>
-                <w:color w:val="333333"/>
-                <w:sz w:val="18"/>
-                <w:szCs w:val="18"/>
-              </w:rPr>
-              <w:t xml:space="preserve">tech-lead</w:t>
+            <w:tcMar>
+              <w:top w:type="dxa" w:w="60"/>
+              <w:left w:type="dxa" w:w="100"/>
+              <w:bottom w:type="dxa" w:w="60"/>
+              <w:right w:type="dxa" w:w="100"/>
+            </w:tcMar>
+          </w:tcPr>
+          <w:p>
+            <w:pPr>
+              <w:spacing w:after="0" w:before="0"/>
+            </w:pPr>
+            <w:r>
+              <w:rPr>
+                <w:rFonts w:ascii="Arial" w:cs="Arial" w:eastAsia="Arial" w:hAnsi="Arial"/>
+                <w:color w:val="333333"/>
+                <w:sz w:val="18"/>
+                <w:szCs w:val="18"/>
+              </w:rPr>
+              <w:t>developer, qa, devops-sre, tech-lead</w:t>
             </w:r>
           </w:p>
         </w:tc>
@@ -25399,25 +25495,26 @@
               <w:bottom w:val="single" w:color="CCCCCC" w:sz="1"/>
               <w:right w:val="single" w:color="CCCCCC" w:sz="1"/>
             </w:tcBorders>
-            <w:tcMar>
-              <w:top w:type="dxa" w:w="60"/>
-              <w:left w:type="dxa" w:w="100"/>
-              <w:bottom w:type="dxa" w:w="60"/>
-              <w:right w:type="dxa" w:w="100"/>
-            </w:tcMar>
-          </w:tcPr>
-          <w:p>
-            <w:pPr>
-              <w:spacing w:after="0" w:before="0"/>
-            </w:pPr>
-            <w:r>
-              <w:rPr>
-                <w:rFonts w:ascii="Arial" w:cs="Arial" w:eastAsia="Arial" w:hAnsi="Arial"/>
-                <w:color w:val="333333"/>
-                <w:sz w:val="18"/>
-                <w:szCs w:val="18"/>
-              </w:rPr>
-              <w:t xml:space="preserve">49</w:t>
+            <w:shd w:fill="F2F7FB" w:val="clear"/>
+            <w:tcMar>
+              <w:top w:type="dxa" w:w="60"/>
+              <w:left w:type="dxa" w:w="100"/>
+              <w:bottom w:type="dxa" w:w="60"/>
+              <w:right w:type="dxa" w:w="100"/>
+            </w:tcMar>
+          </w:tcPr>
+          <w:p>
+            <w:pPr>
+              <w:spacing w:after="0" w:before="0"/>
+            </w:pPr>
+            <w:r>
+              <w:rPr>
+                <w:rFonts w:ascii="Arial" w:cs="Arial" w:eastAsia="Arial" w:hAnsi="Arial"/>
+                <w:color w:val="333333"/>
+                <w:sz w:val="18"/>
+                <w:szCs w:val="18"/>
+              </w:rPr>
+              <w:t>49</w:t>
             </w:r>
           </w:p>
         </w:tc>
@@ -25430,25 +25527,26 @@
               <w:bottom w:val="single" w:color="CCCCCC" w:sz="1"/>
               <w:right w:val="single" w:color="CCCCCC" w:sz="1"/>
             </w:tcBorders>
-            <w:tcMar>
-              <w:top w:type="dxa" w:w="60"/>
-              <w:left w:type="dxa" w:w="100"/>
-              <w:bottom w:type="dxa" w:w="60"/>
-              <w:right w:type="dxa" w:w="100"/>
-            </w:tcMar>
-          </w:tcPr>
-          <w:p>
-            <w:pPr>
-              <w:spacing w:after="0" w:before="0"/>
-            </w:pPr>
-            <w:r>
-              <w:rPr>
-                <w:rFonts w:ascii="Arial" w:cs="Arial" w:eastAsia="Arial" w:hAnsi="Arial"/>
-                <w:color w:val="333333"/>
-                <w:sz w:val="18"/>
-                <w:szCs w:val="18"/>
-              </w:rPr>
-              <w:t xml:space="preserve">slo-sla-tracker</w:t>
+            <w:shd w:fill="F2F7FB" w:val="clear"/>
+            <w:tcMar>
+              <w:top w:type="dxa" w:w="60"/>
+              <w:left w:type="dxa" w:w="100"/>
+              <w:bottom w:type="dxa" w:w="60"/>
+              <w:right w:type="dxa" w:w="100"/>
+            </w:tcMar>
+          </w:tcPr>
+          <w:p>
+            <w:pPr>
+              <w:spacing w:after="0" w:before="0"/>
+            </w:pPr>
+            <w:r>
+              <w:rPr>
+                <w:rFonts w:ascii="Arial" w:cs="Arial" w:eastAsia="Arial" w:hAnsi="Arial"/>
+                <w:color w:val="333333"/>
+                <w:sz w:val="18"/>
+                <w:szCs w:val="18"/>
+              </w:rPr>
+              <w:t xml:space="preserve">skill-gap-analyzer</w:t>
             </w:r>
           </w:p>
         </w:tc>
@@ -25461,25 +25559,26 @@
               <w:bottom w:val="single" w:color="CCCCCC" w:sz="1"/>
               <w:right w:val="single" w:color="CCCCCC" w:sz="1"/>
             </w:tcBorders>
-            <w:tcMar>
-              <w:top w:type="dxa" w:w="60"/>
-              <w:left w:type="dxa" w:w="100"/>
-              <w:bottom w:type="dxa" w:w="60"/>
-              <w:right w:type="dxa" w:w="100"/>
-            </w:tcMar>
-          </w:tcPr>
-          <w:p>
-            <w:pPr>
-              <w:spacing w:after="0" w:before="0"/>
-            </w:pPr>
-            <w:r>
-              <w:rPr>
-                <w:rFonts w:ascii="Arial" w:cs="Arial" w:eastAsia="Arial" w:hAnsi="Arial"/>
-                <w:color w:val="333333"/>
-                <w:sz w:val="18"/>
-                <w:szCs w:val="18"/>
-              </w:rPr>
-              <w:t xml:space="preserve">reporting</w:t>
+            <w:shd w:fill="F2F7FB" w:val="clear"/>
+            <w:tcMar>
+              <w:top w:type="dxa" w:w="60"/>
+              <w:left w:type="dxa" w:w="100"/>
+              <w:bottom w:type="dxa" w:w="60"/>
+              <w:right w:type="dxa" w:w="100"/>
+            </w:tcMar>
+          </w:tcPr>
+          <w:p>
+            <w:pPr>
+              <w:spacing w:after="0" w:before="0"/>
+            </w:pPr>
+            <w:r>
+              <w:rPr>
+                <w:rFonts w:ascii="Arial" w:cs="Arial" w:eastAsia="Arial" w:hAnsi="Arial"/>
+                <w:color w:val="333333"/>
+                <w:sz w:val="18"/>
+                <w:szCs w:val="18"/>
+              </w:rPr>
+              <w:t xml:space="preserve">governance</w:t>
             </w:r>
           </w:p>
         </w:tc>
@@ -25492,25 +25591,26 @@
               <w:bottom w:val="single" w:color="CCCCCC" w:sz="1"/>
               <w:right w:val="single" w:color="CCCCCC" w:sz="1"/>
             </w:tcBorders>
-            <w:tcMar>
-              <w:top w:type="dxa" w:w="60"/>
-              <w:left w:type="dxa" w:w="100"/>
-              <w:bottom w:type="dxa" w:w="60"/>
-              <w:right w:type="dxa" w:w="100"/>
-            </w:tcMar>
-          </w:tcPr>
-          <w:p>
-            <w:pPr>
-              <w:spacing w:after="0" w:before="0"/>
-            </w:pPr>
-            <w:r>
-              <w:rPr>
-                <w:rFonts w:ascii="Arial" w:cs="Arial" w:eastAsia="Arial" w:hAnsi="Arial"/>
-                <w:color w:val="333333"/>
-                <w:sz w:val="18"/>
-                <w:szCs w:val="18"/>
-              </w:rPr>
-              <w:t xml:space="preserve">devops-sre, tech-lead</w:t>
+            <w:shd w:fill="F2F7FB" w:val="clear"/>
+            <w:tcMar>
+              <w:top w:type="dxa" w:w="60"/>
+              <w:left w:type="dxa" w:w="100"/>
+              <w:bottom w:type="dxa" w:w="60"/>
+              <w:right w:type="dxa" w:w="100"/>
+            </w:tcMar>
+          </w:tcPr>
+          <w:p>
+            <w:pPr>
+              <w:spacing w:after="0" w:before="0"/>
+            </w:pPr>
+            <w:r>
+              <w:rPr>
+                <w:rFonts w:ascii="Arial" w:cs="Arial" w:eastAsia="Arial" w:hAnsi="Arial"/>
+                <w:color w:val="333333"/>
+                <w:sz w:val="18"/>
+                <w:szCs w:val="18"/>
+              </w:rPr>
+              <w:t xml:space="preserve">tech-lead</w:t>
             </w:r>
           </w:p>
         </w:tc>
@@ -25525,26 +25625,25 @@
               <w:bottom w:val="single" w:color="CCCCCC" w:sz="1"/>
               <w:right w:val="single" w:color="CCCCCC" w:sz="1"/>
             </w:tcBorders>
-            <w:shd w:fill="F2F7FB" w:val="clear"/>
-            <w:tcMar>
-              <w:top w:type="dxa" w:w="60"/>
-              <w:left w:type="dxa" w:w="100"/>
-              <w:bottom w:type="dxa" w:w="60"/>
-              <w:right w:type="dxa" w:w="100"/>
-            </w:tcMar>
-          </w:tcPr>
-          <w:p>
-            <w:pPr>
-              <w:spacing w:after="0" w:before="0"/>
-            </w:pPr>
-            <w:r>
-              <w:rPr>
-                <w:rFonts w:ascii="Arial" w:cs="Arial" w:eastAsia="Arial" w:hAnsi="Arial"/>
-                <w:color w:val="333333"/>
-                <w:sz w:val="18"/>
-                <w:szCs w:val="18"/>
-              </w:rPr>
-              <w:t xml:space="preserve">50</w:t>
+            <w:tcMar>
+              <w:top w:type="dxa" w:w="60"/>
+              <w:left w:type="dxa" w:w="100"/>
+              <w:bottom w:type="dxa" w:w="60"/>
+              <w:right w:type="dxa" w:w="100"/>
+            </w:tcMar>
+          </w:tcPr>
+          <w:p>
+            <w:pPr>
+              <w:spacing w:after="0" w:before="0"/>
+            </w:pPr>
+            <w:r>
+              <w:rPr>
+                <w:rFonts w:ascii="Arial" w:cs="Arial" w:eastAsia="Arial" w:hAnsi="Arial"/>
+                <w:color w:val="333333"/>
+                <w:sz w:val="18"/>
+                <w:szCs w:val="18"/>
+              </w:rPr>
+              <w:t>50</w:t>
             </w:r>
           </w:p>
         </w:tc>
@@ -25557,26 +25656,25 @@
               <w:bottom w:val="single" w:color="CCCCCC" w:sz="1"/>
               <w:right w:val="single" w:color="CCCCCC" w:sz="1"/>
             </w:tcBorders>
-            <w:shd w:fill="F2F7FB" w:val="clear"/>
-            <w:tcMar>
-              <w:top w:type="dxa" w:w="60"/>
-              <w:left w:type="dxa" w:w="100"/>
-              <w:bottom w:type="dxa" w:w="60"/>
-              <w:right w:type="dxa" w:w="100"/>
-            </w:tcMar>
-          </w:tcPr>
-          <w:p>
-            <w:pPr>
-              <w:spacing w:after="0" w:before="0"/>
-            </w:pPr>
-            <w:r>
-              <w:rPr>
-                <w:rFonts w:ascii="Arial" w:cs="Arial" w:eastAsia="Arial" w:hAnsi="Arial"/>
-                <w:color w:val="333333"/>
-                <w:sz w:val="18"/>
-                <w:szCs w:val="18"/>
-              </w:rPr>
-              <w:t xml:space="preserve">spec-evolve</w:t>
+            <w:tcMar>
+              <w:top w:type="dxa" w:w="60"/>
+              <w:left w:type="dxa" w:w="100"/>
+              <w:bottom w:type="dxa" w:w="60"/>
+              <w:right w:type="dxa" w:w="100"/>
+            </w:tcMar>
+          </w:tcPr>
+          <w:p>
+            <w:pPr>
+              <w:spacing w:after="0" w:before="0"/>
+            </w:pPr>
+            <w:r>
+              <w:rPr>
+                <w:rFonts w:ascii="Arial" w:cs="Arial" w:eastAsia="Arial" w:hAnsi="Arial"/>
+                <w:color w:val="333333"/>
+                <w:sz w:val="18"/>
+                <w:szCs w:val="18"/>
+              </w:rPr>
+              <w:t xml:space="preserve">slo-sla-tracker</w:t>
             </w:r>
           </w:p>
         </w:tc>
@@ -25589,26 +25687,25 @@
               <w:bottom w:val="single" w:color="CCCCCC" w:sz="1"/>
               <w:right w:val="single" w:color="CCCCCC" w:sz="1"/>
             </w:tcBorders>
-            <w:shd w:fill="F2F7FB" w:val="clear"/>
-            <w:tcMar>
-              <w:top w:type="dxa" w:w="60"/>
-              <w:left w:type="dxa" w:w="100"/>
-              <w:bottom w:type="dxa" w:w="60"/>
-              <w:right w:type="dxa" w:w="100"/>
-            </w:tcMar>
-          </w:tcPr>
-          <w:p>
-            <w:pPr>
-              <w:spacing w:after="0" w:before="0"/>
-            </w:pPr>
-            <w:r>
-              <w:rPr>
-                <w:rFonts w:ascii="Arial" w:cs="Arial" w:eastAsia="Arial" w:hAnsi="Arial"/>
-                <w:color w:val="333333"/>
-                <w:sz w:val="18"/>
-                <w:szCs w:val="18"/>
-              </w:rPr>
-              <w:t xml:space="preserve">spec-lifecycle</w:t>
+            <w:tcMar>
+              <w:top w:type="dxa" w:w="60"/>
+              <w:left w:type="dxa" w:w="100"/>
+              <w:bottom w:type="dxa" w:w="60"/>
+              <w:right w:type="dxa" w:w="100"/>
+            </w:tcMar>
+          </w:tcPr>
+          <w:p>
+            <w:pPr>
+              <w:spacing w:after="0" w:before="0"/>
+            </w:pPr>
+            <w:r>
+              <w:rPr>
+                <w:rFonts w:ascii="Arial" w:cs="Arial" w:eastAsia="Arial" w:hAnsi="Arial"/>
+                <w:color w:val="333333"/>
+                <w:sz w:val="18"/>
+                <w:szCs w:val="18"/>
+              </w:rPr>
+              <w:t xml:space="preserve">reporting</w:t>
             </w:r>
           </w:p>
         </w:tc>
@@ -25621,26 +25718,25 @@
               <w:bottom w:val="single" w:color="CCCCCC" w:sz="1"/>
               <w:right w:val="single" w:color="CCCCCC" w:sz="1"/>
             </w:tcBorders>
-            <w:shd w:fill="F2F7FB" w:val="clear"/>
-            <w:tcMar>
-              <w:top w:type="dxa" w:w="60"/>
-              <w:left w:type="dxa" w:w="100"/>
-              <w:bottom w:type="dxa" w:w="60"/>
-              <w:right w:type="dxa" w:w="100"/>
-            </w:tcMar>
-          </w:tcPr>
-          <w:p>
-            <w:pPr>
-              <w:spacing w:after="0" w:before="0"/>
-            </w:pPr>
-            <w:r>
-              <w:rPr>
-                <w:rFonts w:ascii="Arial" w:cs="Arial" w:eastAsia="Arial" w:hAnsi="Arial"/>
-                <w:color w:val="333333"/>
-                <w:sz w:val="18"/>
-                <w:szCs w:val="18"/>
-              </w:rPr>
-              <w:t xml:space="preserve">architect, developer, tech-lead</w:t>
+            <w:tcMar>
+              <w:top w:type="dxa" w:w="60"/>
+              <w:left w:type="dxa" w:w="100"/>
+              <w:bottom w:type="dxa" w:w="60"/>
+              <w:right w:type="dxa" w:w="100"/>
+            </w:tcMar>
+          </w:tcPr>
+          <w:p>
+            <w:pPr>
+              <w:spacing w:after="0" w:before="0"/>
+            </w:pPr>
+            <w:r>
+              <w:rPr>
+                <w:rFonts w:ascii="Arial" w:cs="Arial" w:eastAsia="Arial" w:hAnsi="Arial"/>
+                <w:color w:val="333333"/>
+                <w:sz w:val="18"/>
+                <w:szCs w:val="18"/>
+              </w:rPr>
+              <w:t xml:space="preserve">devops-sre, tech-lead</w:t>
             </w:r>
           </w:p>
         </w:tc>
@@ -25655,25 +25751,26 @@
               <w:bottom w:val="single" w:color="CCCCCC" w:sz="1"/>
               <w:right w:val="single" w:color="CCCCCC" w:sz="1"/>
             </w:tcBorders>
-            <w:tcMar>
-              <w:top w:type="dxa" w:w="60"/>
-              <w:left w:type="dxa" w:w="100"/>
-              <w:bottom w:type="dxa" w:w="60"/>
-              <w:right w:type="dxa" w:w="100"/>
-            </w:tcMar>
-          </w:tcPr>
-          <w:p>
-            <w:pPr>
-              <w:spacing w:after="0" w:before="0"/>
-            </w:pPr>
-            <w:r>
-              <w:rPr>
-                <w:rFonts w:ascii="Arial" w:cs="Arial" w:eastAsia="Arial" w:hAnsi="Arial"/>
-                <w:color w:val="333333"/>
-                <w:sz w:val="18"/>
-                <w:szCs w:val="18"/>
-              </w:rPr>
-              <w:t xml:space="preserve">51</w:t>
+            <w:shd w:fill="F2F7FB" w:val="clear"/>
+            <w:tcMar>
+              <w:top w:type="dxa" w:w="60"/>
+              <w:left w:type="dxa" w:w="100"/>
+              <w:bottom w:type="dxa" w:w="60"/>
+              <w:right w:type="dxa" w:w="100"/>
+            </w:tcMar>
+          </w:tcPr>
+          <w:p>
+            <w:pPr>
+              <w:spacing w:after="0" w:before="0"/>
+            </w:pPr>
+            <w:r>
+              <w:rPr>
+                <w:rFonts w:ascii="Arial" w:cs="Arial" w:eastAsia="Arial" w:hAnsi="Arial"/>
+                <w:color w:val="333333"/>
+                <w:sz w:val="18"/>
+                <w:szCs w:val="18"/>
+              </w:rPr>
+              <w:t>51</w:t>
             </w:r>
           </w:p>
         </w:tc>
@@ -25686,25 +25783,26 @@
               <w:bottom w:val="single" w:color="CCCCCC" w:sz="1"/>
               <w:right w:val="single" w:color="CCCCCC" w:sz="1"/>
             </w:tcBorders>
-            <w:tcMar>
-              <w:top w:type="dxa" w:w="60"/>
-              <w:left w:type="dxa" w:w="100"/>
-              <w:bottom w:type="dxa" w:w="60"/>
-              <w:right w:type="dxa" w:w="100"/>
-            </w:tcMar>
-          </w:tcPr>
-          <w:p>
-            <w:pPr>
-              <w:spacing w:after="0" w:before="0"/>
-            </w:pPr>
-            <w:r>
-              <w:rPr>
-                <w:rFonts w:ascii="Arial" w:cs="Arial" w:eastAsia="Arial" w:hAnsi="Arial"/>
-                <w:color w:val="333333"/>
-                <w:sz w:val="18"/>
-                <w:szCs w:val="18"/>
-              </w:rPr>
-              <w:t xml:space="preserve">spec-fix</w:t>
+            <w:shd w:fill="F2F7FB" w:val="clear"/>
+            <w:tcMar>
+              <w:top w:type="dxa" w:w="60"/>
+              <w:left w:type="dxa" w:w="100"/>
+              <w:bottom w:type="dxa" w:w="60"/>
+              <w:right w:type="dxa" w:w="100"/>
+            </w:tcMar>
+          </w:tcPr>
+          <w:p>
+            <w:pPr>
+              <w:spacing w:after="0" w:before="0"/>
+            </w:pPr>
+            <w:r>
+              <w:rPr>
+                <w:rFonts w:ascii="Arial" w:cs="Arial" w:eastAsia="Arial" w:hAnsi="Arial"/>
+                <w:color w:val="333333"/>
+                <w:sz w:val="18"/>
+                <w:szCs w:val="18"/>
+              </w:rPr>
+              <w:t xml:space="preserve">spec-evolve</w:t>
             </w:r>
           </w:p>
         </w:tc>
@@ -25717,6 +25815,7 @@
               <w:bottom w:val="single" w:color="CCCCCC" w:sz="1"/>
               <w:right w:val="single" w:color="CCCCCC" w:sz="1"/>
             </w:tcBorders>
+            <w:shd w:fill="F2F7FB" w:val="clear"/>
             <w:tcMar>
               <w:top w:type="dxa" w:w="60"/>
               <w:left w:type="dxa" w:w="100"/>
@@ -25748,25 +25847,26 @@
               <w:bottom w:val="single" w:color="CCCCCC" w:sz="1"/>
               <w:right w:val="single" w:color="CCCCCC" w:sz="1"/>
             </w:tcBorders>
-            <w:tcMar>
-              <w:top w:type="dxa" w:w="60"/>
-              <w:left w:type="dxa" w:w="100"/>
-              <w:bottom w:type="dxa" w:w="60"/>
-              <w:right w:type="dxa" w:w="100"/>
-            </w:tcMar>
-          </w:tcPr>
-          <w:p>
-            <w:pPr>
-              <w:spacing w:after="0" w:before="0"/>
-            </w:pPr>
-            <w:r>
-              <w:rPr>
-                <w:rFonts w:ascii="Arial" w:cs="Arial" w:eastAsia="Arial" w:hAnsi="Arial"/>
-                <w:color w:val="333333"/>
-                <w:sz w:val="18"/>
-                <w:szCs w:val="18"/>
-              </w:rPr>
-              <w:t xml:space="preserve">developer, tech-lead</w:t>
+            <w:shd w:fill="F2F7FB" w:val="clear"/>
+            <w:tcMar>
+              <w:top w:type="dxa" w:w="60"/>
+              <w:left w:type="dxa" w:w="100"/>
+              <w:bottom w:type="dxa" w:w="60"/>
+              <w:right w:type="dxa" w:w="100"/>
+            </w:tcMar>
+          </w:tcPr>
+          <w:p>
+            <w:pPr>
+              <w:spacing w:after="0" w:before="0"/>
+            </w:pPr>
+            <w:r>
+              <w:rPr>
+                <w:rFonts w:ascii="Arial" w:cs="Arial" w:eastAsia="Arial" w:hAnsi="Arial"/>
+                <w:color w:val="333333"/>
+                <w:sz w:val="18"/>
+                <w:szCs w:val="18"/>
+              </w:rPr>
+              <w:t xml:space="preserve">architect, developer, tech-lead</w:t>
             </w:r>
           </w:p>
         </w:tc>
@@ -25781,26 +25881,25 @@
               <w:bottom w:val="single" w:color="CCCCCC" w:sz="1"/>
               <w:right w:val="single" w:color="CCCCCC" w:sz="1"/>
             </w:tcBorders>
-            <w:shd w:fill="F2F7FB" w:val="clear"/>
-            <w:tcMar>
-              <w:top w:type="dxa" w:w="60"/>
-              <w:left w:type="dxa" w:w="100"/>
-              <w:bottom w:type="dxa" w:w="60"/>
-              <w:right w:type="dxa" w:w="100"/>
-            </w:tcMar>
-          </w:tcPr>
-          <w:p>
-            <w:pPr>
-              <w:spacing w:after="0" w:before="0"/>
-            </w:pPr>
-            <w:r>
-              <w:rPr>
-                <w:rFonts w:ascii="Arial" w:cs="Arial" w:eastAsia="Arial" w:hAnsi="Arial"/>
-                <w:color w:val="333333"/>
-                <w:sz w:val="18"/>
-                <w:szCs w:val="18"/>
-              </w:rPr>
-              <w:t xml:space="preserve">52</w:t>
+            <w:tcMar>
+              <w:top w:type="dxa" w:w="60"/>
+              <w:left w:type="dxa" w:w="100"/>
+              <w:bottom w:type="dxa" w:w="60"/>
+              <w:right w:type="dxa" w:w="100"/>
+            </w:tcMar>
+          </w:tcPr>
+          <w:p>
+            <w:pPr>
+              <w:spacing w:after="0" w:before="0"/>
+            </w:pPr>
+            <w:r>
+              <w:rPr>
+                <w:rFonts w:ascii="Arial" w:cs="Arial" w:eastAsia="Arial" w:hAnsi="Arial"/>
+                <w:color w:val="333333"/>
+                <w:sz w:val="18"/>
+                <w:szCs w:val="18"/>
+              </w:rPr>
+              <w:t>52</w:t>
             </w:r>
           </w:p>
         </w:tc>
@@ -25813,26 +25912,25 @@
               <w:bottom w:val="single" w:color="CCCCCC" w:sz="1"/>
               <w:right w:val="single" w:color="CCCCCC" w:sz="1"/>
             </w:tcBorders>
-            <w:shd w:fill="F2F7FB" w:val="clear"/>
-            <w:tcMar>
-              <w:top w:type="dxa" w:w="60"/>
-              <w:left w:type="dxa" w:w="100"/>
-              <w:bottom w:type="dxa" w:w="60"/>
-              <w:right w:type="dxa" w:w="100"/>
-            </w:tcMar>
-          </w:tcPr>
-          <w:p>
-            <w:pPr>
-              <w:spacing w:after="0" w:before="0"/>
-            </w:pPr>
-            <w:r>
-              <w:rPr>
-                <w:rFonts w:ascii="Arial" w:cs="Arial" w:eastAsia="Arial" w:hAnsi="Arial"/>
-                <w:color w:val="333333"/>
-                <w:sz w:val="18"/>
-                <w:szCs w:val="18"/>
-              </w:rPr>
-              <w:t xml:space="preserve">spec-gen</w:t>
+            <w:tcMar>
+              <w:top w:type="dxa" w:w="60"/>
+              <w:left w:type="dxa" w:w="100"/>
+              <w:bottom w:type="dxa" w:w="60"/>
+              <w:right w:type="dxa" w:w="100"/>
+            </w:tcMar>
+          </w:tcPr>
+          <w:p>
+            <w:pPr>
+              <w:spacing w:after="0" w:before="0"/>
+            </w:pPr>
+            <w:r>
+              <w:rPr>
+                <w:rFonts w:ascii="Arial" w:cs="Arial" w:eastAsia="Arial" w:hAnsi="Arial"/>
+                <w:color w:val="333333"/>
+                <w:sz w:val="18"/>
+                <w:szCs w:val="18"/>
+              </w:rPr>
+              <w:t xml:space="preserve">spec-fix</w:t>
             </w:r>
           </w:p>
         </w:tc>
@@ -25845,26 +25943,25 @@
               <w:bottom w:val="single" w:color="CCCCCC" w:sz="1"/>
               <w:right w:val="single" w:color="CCCCCC" w:sz="1"/>
             </w:tcBorders>
-            <w:shd w:fill="F2F7FB" w:val="clear"/>
-            <w:tcMar>
-              <w:top w:type="dxa" w:w="60"/>
-              <w:left w:type="dxa" w:w="100"/>
-              <w:bottom w:type="dxa" w:w="60"/>
-              <w:right w:type="dxa" w:w="100"/>
-            </w:tcMar>
-          </w:tcPr>
-          <w:p>
-            <w:pPr>
-              <w:spacing w:after="0" w:before="0"/>
-            </w:pPr>
-            <w:r>
-              <w:rPr>
-                <w:rFonts w:ascii="Arial" w:cs="Arial" w:eastAsia="Arial" w:hAnsi="Arial"/>
-                <w:color w:val="333333"/>
-                <w:sz w:val="18"/>
-                <w:szCs w:val="18"/>
-              </w:rPr>
-              <w:t xml:space="preserve">planning</w:t>
+            <w:tcMar>
+              <w:top w:type="dxa" w:w="60"/>
+              <w:left w:type="dxa" w:w="100"/>
+              <w:bottom w:type="dxa" w:w="60"/>
+              <w:right w:type="dxa" w:w="100"/>
+            </w:tcMar>
+          </w:tcPr>
+          <w:p>
+            <w:pPr>
+              <w:spacing w:after="0" w:before="0"/>
+            </w:pPr>
+            <w:r>
+              <w:rPr>
+                <w:rFonts w:ascii="Arial" w:cs="Arial" w:eastAsia="Arial" w:hAnsi="Arial"/>
+                <w:color w:val="333333"/>
+                <w:sz w:val="18"/>
+                <w:szCs w:val="18"/>
+              </w:rPr>
+              <w:t xml:space="preserve">spec-lifecycle</w:t>
             </w:r>
           </w:p>
         </w:tc>
@@ -25877,26 +25974,25 @@
               <w:bottom w:val="single" w:color="CCCCCC" w:sz="1"/>
               <w:right w:val="single" w:color="CCCCCC" w:sz="1"/>
             </w:tcBorders>
-            <w:shd w:fill="F2F7FB" w:val="clear"/>
-            <w:tcMar>
-              <w:top w:type="dxa" w:w="60"/>
-              <w:left w:type="dxa" w:w="100"/>
-              <w:bottom w:type="dxa" w:w="60"/>
-              <w:right w:type="dxa" w:w="100"/>
-            </w:tcMar>
-          </w:tcPr>
-          <w:p>
-            <w:pPr>
-              <w:spacing w:after="0" w:before="0"/>
-            </w:pPr>
-            <w:r>
-              <w:rPr>
-                <w:rFonts w:ascii="Arial" w:cs="Arial" w:eastAsia="Arial" w:hAnsi="Arial"/>
-                <w:color w:val="333333"/>
-                <w:sz w:val="18"/>
-                <w:szCs w:val="18"/>
-              </w:rPr>
-              <w:t xml:space="preserve">product-owner, architect, developer, designer, tech-lead</w:t>
+            <w:tcMar>
+              <w:top w:type="dxa" w:w="60"/>
+              <w:left w:type="dxa" w:w="100"/>
+              <w:bottom w:type="dxa" w:w="60"/>
+              <w:right w:type="dxa" w:w="100"/>
+            </w:tcMar>
+          </w:tcPr>
+          <w:p>
+            <w:pPr>
+              <w:spacing w:after="0" w:before="0"/>
+            </w:pPr>
+            <w:r>
+              <w:rPr>
+                <w:rFonts w:ascii="Arial" w:cs="Arial" w:eastAsia="Arial" w:hAnsi="Arial"/>
+                <w:color w:val="333333"/>
+                <w:sz w:val="18"/>
+                <w:szCs w:val="18"/>
+              </w:rPr>
+              <w:t xml:space="preserve">developer, tech-lead</w:t>
             </w:r>
           </w:p>
         </w:tc>
@@ -25911,25 +26007,26 @@
               <w:bottom w:val="single" w:color="CCCCCC" w:sz="1"/>
               <w:right w:val="single" w:color="CCCCCC" w:sz="1"/>
             </w:tcBorders>
-            <w:tcMar>
-              <w:top w:type="dxa" w:w="60"/>
-              <w:left w:type="dxa" w:w="100"/>
-              <w:bottom w:type="dxa" w:w="60"/>
-              <w:right w:type="dxa" w:w="100"/>
-            </w:tcMar>
-          </w:tcPr>
-          <w:p>
-            <w:pPr>
-              <w:spacing w:after="0" w:before="0"/>
-            </w:pPr>
-            <w:r>
-              <w:rPr>
-                <w:rFonts w:ascii="Arial" w:cs="Arial" w:eastAsia="Arial" w:hAnsi="Arial"/>
-                <w:color w:val="333333"/>
-                <w:sz w:val="18"/>
-                <w:szCs w:val="18"/>
-              </w:rPr>
-              <w:t xml:space="preserve">53</w:t>
+            <w:shd w:fill="F2F7FB" w:val="clear"/>
+            <w:tcMar>
+              <w:top w:type="dxa" w:w="60"/>
+              <w:left w:type="dxa" w:w="100"/>
+              <w:bottom w:type="dxa" w:w="60"/>
+              <w:right w:type="dxa" w:w="100"/>
+            </w:tcMar>
+          </w:tcPr>
+          <w:p>
+            <w:pPr>
+              <w:spacing w:after="0" w:before="0"/>
+            </w:pPr>
+            <w:r>
+              <w:rPr>
+                <w:rFonts w:ascii="Arial" w:cs="Arial" w:eastAsia="Arial" w:hAnsi="Arial"/>
+                <w:color w:val="333333"/>
+                <w:sz w:val="18"/>
+                <w:szCs w:val="18"/>
+              </w:rPr>
+              <w:t>53</w:t>
             </w:r>
           </w:p>
         </w:tc>
@@ -25942,25 +26039,26 @@
               <w:bottom w:val="single" w:color="CCCCCC" w:sz="1"/>
               <w:right w:val="single" w:color="CCCCCC" w:sz="1"/>
             </w:tcBorders>
-            <w:tcMar>
-              <w:top w:type="dxa" w:w="60"/>
-              <w:left w:type="dxa" w:w="100"/>
-              <w:bottom w:type="dxa" w:w="60"/>
-              <w:right w:type="dxa" w:w="100"/>
-            </w:tcMar>
-          </w:tcPr>
-          <w:p>
-            <w:pPr>
-              <w:spacing w:after="0" w:before="0"/>
-            </w:pPr>
-            <w:r>
-              <w:rPr>
-                <w:rFonts w:ascii="Arial" w:cs="Arial" w:eastAsia="Arial" w:hAnsi="Arial"/>
-                <w:color w:val="333333"/>
-                <w:sz w:val="18"/>
-                <w:szCs w:val="18"/>
-              </w:rPr>
-              <w:t xml:space="preserve">spec-review</w:t>
+            <w:shd w:fill="F2F7FB" w:val="clear"/>
+            <w:tcMar>
+              <w:top w:type="dxa" w:w="60"/>
+              <w:left w:type="dxa" w:w="100"/>
+              <w:bottom w:type="dxa" w:w="60"/>
+              <w:right w:type="dxa" w:w="100"/>
+            </w:tcMar>
+          </w:tcPr>
+          <w:p>
+            <w:pPr>
+              <w:spacing w:after="0" w:before="0"/>
+            </w:pPr>
+            <w:r>
+              <w:rPr>
+                <w:rFonts w:ascii="Arial" w:cs="Arial" w:eastAsia="Arial" w:hAnsi="Arial"/>
+                <w:color w:val="333333"/>
+                <w:sz w:val="18"/>
+                <w:szCs w:val="18"/>
+              </w:rPr>
+              <w:t xml:space="preserve">spec-gen</w:t>
             </w:r>
           </w:p>
         </w:tc>
@@ -25973,25 +26071,26 @@
               <w:bottom w:val="single" w:color="CCCCCC" w:sz="1"/>
               <w:right w:val="single" w:color="CCCCCC" w:sz="1"/>
             </w:tcBorders>
-            <w:tcMar>
-              <w:top w:type="dxa" w:w="60"/>
-              <w:left w:type="dxa" w:w="100"/>
-              <w:bottom w:type="dxa" w:w="60"/>
-              <w:right w:type="dxa" w:w="100"/>
-            </w:tcMar>
-          </w:tcPr>
-          <w:p>
-            <w:pPr>
-              <w:spacing w:after="0" w:before="0"/>
-            </w:pPr>
-            <w:r>
-              <w:rPr>
-                <w:rFonts w:ascii="Arial" w:cs="Arial" w:eastAsia="Arial" w:hAnsi="Arial"/>
-                <w:color w:val="333333"/>
-                <w:sz w:val="18"/>
-                <w:szCs w:val="18"/>
-              </w:rPr>
-              <w:t xml:space="preserve">spec-lifecycle</w:t>
+            <w:shd w:fill="F2F7FB" w:val="clear"/>
+            <w:tcMar>
+              <w:top w:type="dxa" w:w="60"/>
+              <w:left w:type="dxa" w:w="100"/>
+              <w:bottom w:type="dxa" w:w="60"/>
+              <w:right w:type="dxa" w:w="100"/>
+            </w:tcMar>
+          </w:tcPr>
+          <w:p>
+            <w:pPr>
+              <w:spacing w:after="0" w:before="0"/>
+            </w:pPr>
+            <w:r>
+              <w:rPr>
+                <w:rFonts w:ascii="Arial" w:cs="Arial" w:eastAsia="Arial" w:hAnsi="Arial"/>
+                <w:color w:val="333333"/>
+                <w:sz w:val="18"/>
+                <w:szCs w:val="18"/>
+              </w:rPr>
+              <w:t xml:space="preserve">planning</w:t>
             </w:r>
           </w:p>
         </w:tc>
@@ -26004,25 +26103,26 @@
               <w:bottom w:val="single" w:color="CCCCCC" w:sz="1"/>
               <w:right w:val="single" w:color="CCCCCC" w:sz="1"/>
             </w:tcBorders>
-            <w:tcMar>
-              <w:top w:type="dxa" w:w="60"/>
-              <w:left w:type="dxa" w:w="100"/>
-              <w:bottom w:type="dxa" w:w="60"/>
-              <w:right w:type="dxa" w:w="100"/>
-            </w:tcMar>
-          </w:tcPr>
-          <w:p>
-            <w:pPr>
-              <w:spacing w:after="0" w:before="0"/>
-            </w:pPr>
-            <w:r>
-              <w:rPr>
-                <w:rFonts w:ascii="Arial" w:cs="Arial" w:eastAsia="Arial" w:hAnsi="Arial"/>
-                <w:color w:val="333333"/>
-                <w:sz w:val="18"/>
-                <w:szCs w:val="18"/>
-              </w:rPr>
-              <w:t xml:space="preserve">architect, qa, tech-lead</w:t>
+            <w:shd w:fill="F2F7FB" w:val="clear"/>
+            <w:tcMar>
+              <w:top w:type="dxa" w:w="60"/>
+              <w:left w:type="dxa" w:w="100"/>
+              <w:bottom w:type="dxa" w:w="60"/>
+              <w:right w:type="dxa" w:w="100"/>
+            </w:tcMar>
+          </w:tcPr>
+          <w:p>
+            <w:pPr>
+              <w:spacing w:after="0" w:before="0"/>
+            </w:pPr>
+            <w:r>
+              <w:rPr>
+                <w:rFonts w:ascii="Arial" w:cs="Arial" w:eastAsia="Arial" w:hAnsi="Arial"/>
+                <w:color w:val="333333"/>
+                <w:sz w:val="18"/>
+                <w:szCs w:val="18"/>
+              </w:rPr>
+              <w:t xml:space="preserve">product-owner, architect, developer, designer, tech-lead</w:t>
             </w:r>
           </w:p>
         </w:tc>
@@ -26037,26 +26137,25 @@
               <w:bottom w:val="single" w:color="CCCCCC" w:sz="1"/>
               <w:right w:val="single" w:color="CCCCCC" w:sz="1"/>
             </w:tcBorders>
-            <w:shd w:fill="F2F7FB" w:val="clear"/>
-            <w:tcMar>
-              <w:top w:type="dxa" w:w="60"/>
-              <w:left w:type="dxa" w:w="100"/>
-              <w:bottom w:type="dxa" w:w="60"/>
-              <w:right w:type="dxa" w:w="100"/>
-            </w:tcMar>
-          </w:tcPr>
-          <w:p>
-            <w:pPr>
-              <w:spacing w:after="0" w:before="0"/>
-            </w:pPr>
-            <w:r>
-              <w:rPr>
-                <w:rFonts w:ascii="Arial" w:cs="Arial" w:eastAsia="Arial" w:hAnsi="Arial"/>
-                <w:color w:val="333333"/>
-                <w:sz w:val="18"/>
-                <w:szCs w:val="18"/>
-              </w:rPr>
-              <w:t xml:space="preserve">54</w:t>
+            <w:tcMar>
+              <w:top w:type="dxa" w:w="60"/>
+              <w:left w:type="dxa" w:w="100"/>
+              <w:bottom w:type="dxa" w:w="60"/>
+              <w:right w:type="dxa" w:w="100"/>
+            </w:tcMar>
+          </w:tcPr>
+          <w:p>
+            <w:pPr>
+              <w:spacing w:after="0" w:before="0"/>
+            </w:pPr>
+            <w:r>
+              <w:rPr>
+                <w:rFonts w:ascii="Arial" w:cs="Arial" w:eastAsia="Arial" w:hAnsi="Arial"/>
+                <w:color w:val="333333"/>
+                <w:sz w:val="18"/>
+                <w:szCs w:val="18"/>
+              </w:rPr>
+              <w:t>54</w:t>
             </w:r>
           </w:p>
         </w:tc>
@@ -26069,26 +26168,25 @@
               <w:bottom w:val="single" w:color="CCCCCC" w:sz="1"/>
               <w:right w:val="single" w:color="CCCCCC" w:sz="1"/>
             </w:tcBorders>
-            <w:shd w:fill="F2F7FB" w:val="clear"/>
-            <w:tcMar>
-              <w:top w:type="dxa" w:w="60"/>
-              <w:left w:type="dxa" w:w="100"/>
-              <w:bottom w:type="dxa" w:w="60"/>
-              <w:right w:type="dxa" w:w="100"/>
-            </w:tcMar>
-          </w:tcPr>
-          <w:p>
-            <w:pPr>
-              <w:spacing w:after="0" w:before="0"/>
-            </w:pPr>
-            <w:r>
-              <w:rPr>
-                <w:rFonts w:ascii="Arial" w:cs="Arial" w:eastAsia="Arial" w:hAnsi="Arial"/>
-                <w:color w:val="333333"/>
-                <w:sz w:val="18"/>
-                <w:szCs w:val="18"/>
-              </w:rPr>
-              <w:t xml:space="preserve">task-gen</w:t>
+            <w:tcMar>
+              <w:top w:type="dxa" w:w="60"/>
+              <w:left w:type="dxa" w:w="100"/>
+              <w:bottom w:type="dxa" w:w="60"/>
+              <w:right w:type="dxa" w:w="100"/>
+            </w:tcMar>
+          </w:tcPr>
+          <w:p>
+            <w:pPr>
+              <w:spacing w:after="0" w:before="0"/>
+            </w:pPr>
+            <w:r>
+              <w:rPr>
+                <w:rFonts w:ascii="Arial" w:cs="Arial" w:eastAsia="Arial" w:hAnsi="Arial"/>
+                <w:color w:val="333333"/>
+                <w:sz w:val="18"/>
+                <w:szCs w:val="18"/>
+              </w:rPr>
+              <w:t xml:space="preserve">spec-review</w:t>
             </w:r>
           </w:p>
         </w:tc>
@@ -26101,26 +26199,25 @@
               <w:bottom w:val="single" w:color="CCCCCC" w:sz="1"/>
               <w:right w:val="single" w:color="CCCCCC" w:sz="1"/>
             </w:tcBorders>
-            <w:shd w:fill="F2F7FB" w:val="clear"/>
-            <w:tcMar>
-              <w:top w:type="dxa" w:w="60"/>
-              <w:left w:type="dxa" w:w="100"/>
-              <w:bottom w:type="dxa" w:w="60"/>
-              <w:right w:type="dxa" w:w="100"/>
-            </w:tcMar>
-          </w:tcPr>
-          <w:p>
-            <w:pPr>
-              <w:spacing w:after="0" w:before="0"/>
-            </w:pPr>
-            <w:r>
-              <w:rPr>
-                <w:rFonts w:ascii="Arial" w:cs="Arial" w:eastAsia="Arial" w:hAnsi="Arial"/>
-                <w:color w:val="333333"/>
-                <w:sz w:val="18"/>
-                <w:szCs w:val="18"/>
-              </w:rPr>
-              <w:t xml:space="preserve">planning</w:t>
+            <w:tcMar>
+              <w:top w:type="dxa" w:w="60"/>
+              <w:left w:type="dxa" w:w="100"/>
+              <w:bottom w:type="dxa" w:w="60"/>
+              <w:right w:type="dxa" w:w="100"/>
+            </w:tcMar>
+          </w:tcPr>
+          <w:p>
+            <w:pPr>
+              <w:spacing w:after="0" w:before="0"/>
+            </w:pPr>
+            <w:r>
+              <w:rPr>
+                <w:rFonts w:ascii="Arial" w:cs="Arial" w:eastAsia="Arial" w:hAnsi="Arial"/>
+                <w:color w:val="333333"/>
+                <w:sz w:val="18"/>
+                <w:szCs w:val="18"/>
+              </w:rPr>
+              <w:t xml:space="preserve">spec-lifecycle</w:t>
             </w:r>
           </w:p>
         </w:tc>
@@ -26133,26 +26230,25 @@
               <w:bottom w:val="single" w:color="CCCCCC" w:sz="1"/>
               <w:right w:val="single" w:color="CCCCCC" w:sz="1"/>
             </w:tcBorders>
-            <w:shd w:fill="F2F7FB" w:val="clear"/>
-            <w:tcMar>
-              <w:top w:type="dxa" w:w="60"/>
-              <w:left w:type="dxa" w:w="100"/>
-              <w:bottom w:type="dxa" w:w="60"/>
-              <w:right w:type="dxa" w:w="100"/>
-            </w:tcMar>
-          </w:tcPr>
-          <w:p>
-            <w:pPr>
-              <w:spacing w:after="0" w:before="0"/>
-            </w:pPr>
-            <w:r>
-              <w:rPr>
-                <w:rFonts w:ascii="Arial" w:cs="Arial" w:eastAsia="Arial" w:hAnsi="Arial"/>
-                <w:color w:val="333333"/>
-                <w:sz w:val="18"/>
-                <w:szCs w:val="18"/>
-              </w:rPr>
-              <w:t xml:space="preserve">developer, architect, tech-lead</w:t>
+            <w:tcMar>
+              <w:top w:type="dxa" w:w="60"/>
+              <w:left w:type="dxa" w:w="100"/>
+              <w:bottom w:type="dxa" w:w="60"/>
+              <w:right w:type="dxa" w:w="100"/>
+            </w:tcMar>
+          </w:tcPr>
+          <w:p>
+            <w:pPr>
+              <w:spacing w:after="0" w:before="0"/>
+            </w:pPr>
+            <w:r>
+              <w:rPr>
+                <w:rFonts w:ascii="Arial" w:cs="Arial" w:eastAsia="Arial" w:hAnsi="Arial"/>
+                <w:color w:val="333333"/>
+                <w:sz w:val="18"/>
+                <w:szCs w:val="18"/>
+              </w:rPr>
+              <w:t xml:space="preserve">architect, qa, tech-lead</w:t>
             </w:r>
           </w:p>
         </w:tc>
@@ -26167,25 +26263,26 @@
               <w:bottom w:val="single" w:color="CCCCCC" w:sz="1"/>
               <w:right w:val="single" w:color="CCCCCC" w:sz="1"/>
             </w:tcBorders>
-            <w:tcMar>
-              <w:top w:type="dxa" w:w="60"/>
-              <w:left w:type="dxa" w:w="100"/>
-              <w:bottom w:type="dxa" w:w="60"/>
-              <w:right w:type="dxa" w:w="100"/>
-            </w:tcMar>
-          </w:tcPr>
-          <w:p>
-            <w:pPr>
-              <w:spacing w:after="0" w:before="0"/>
-            </w:pPr>
-            <w:r>
-              <w:rPr>
-                <w:rFonts w:ascii="Arial" w:cs="Arial" w:eastAsia="Arial" w:hAnsi="Arial"/>
-                <w:color w:val="333333"/>
-                <w:sz w:val="18"/>
-                <w:szCs w:val="18"/>
-              </w:rPr>
-              <w:t xml:space="preserve">55</w:t>
+            <w:shd w:fill="F2F7FB" w:val="clear"/>
+            <w:tcMar>
+              <w:top w:type="dxa" w:w="60"/>
+              <w:left w:type="dxa" w:w="100"/>
+              <w:bottom w:type="dxa" w:w="60"/>
+              <w:right w:type="dxa" w:w="100"/>
+            </w:tcMar>
+          </w:tcPr>
+          <w:p>
+            <w:pPr>
+              <w:spacing w:after="0" w:before="0"/>
+            </w:pPr>
+            <w:r>
+              <w:rPr>
+                <w:rFonts w:ascii="Arial" w:cs="Arial" w:eastAsia="Arial" w:hAnsi="Arial"/>
+                <w:color w:val="333333"/>
+                <w:sz w:val="18"/>
+                <w:szCs w:val="18"/>
+              </w:rPr>
+              <w:t>55</w:t>
             </w:r>
           </w:p>
         </w:tc>
@@ -26198,25 +26295,26 @@
               <w:bottom w:val="single" w:color="CCCCCC" w:sz="1"/>
               <w:right w:val="single" w:color="CCCCCC" w:sz="1"/>
             </w:tcBorders>
-            <w:tcMar>
-              <w:top w:type="dxa" w:w="60"/>
-              <w:left w:type="dxa" w:w="100"/>
-              <w:bottom w:type="dxa" w:w="60"/>
-              <w:right w:type="dxa" w:w="100"/>
-            </w:tcMar>
-          </w:tcPr>
-          <w:p>
-            <w:pPr>
-              <w:spacing w:after="0" w:before="0"/>
-            </w:pPr>
-            <w:r>
-              <w:rPr>
-                <w:rFonts w:ascii="Arial" w:cs="Arial" w:eastAsia="Arial" w:hAnsi="Arial"/>
-                <w:color w:val="333333"/>
-                <w:sz w:val="18"/>
-                <w:szCs w:val="18"/>
-              </w:rPr>
-              <w:t xml:space="preserve">task-implementer</w:t>
+            <w:shd w:fill="F2F7FB" w:val="clear"/>
+            <w:tcMar>
+              <w:top w:type="dxa" w:w="60"/>
+              <w:left w:type="dxa" w:w="100"/>
+              <w:bottom w:type="dxa" w:w="60"/>
+              <w:right w:type="dxa" w:w="100"/>
+            </w:tcMar>
+          </w:tcPr>
+          <w:p>
+            <w:pPr>
+              <w:spacing w:after="0" w:before="0"/>
+            </w:pPr>
+            <w:r>
+              <w:rPr>
+                <w:rFonts w:ascii="Arial" w:cs="Arial" w:eastAsia="Arial" w:hAnsi="Arial"/>
+                <w:color w:val="333333"/>
+                <w:sz w:val="18"/>
+                <w:szCs w:val="18"/>
+              </w:rPr>
+              <w:t xml:space="preserve">task-gen</w:t>
             </w:r>
           </w:p>
         </w:tc>
@@ -26229,25 +26327,26 @@
               <w:bottom w:val="single" w:color="CCCCCC" w:sz="1"/>
               <w:right w:val="single" w:color="CCCCCC" w:sz="1"/>
             </w:tcBorders>
-            <w:tcMar>
-              <w:top w:type="dxa" w:w="60"/>
-              <w:left w:type="dxa" w:w="100"/>
-              <w:bottom w:type="dxa" w:w="60"/>
-              <w:right w:type="dxa" w:w="100"/>
-            </w:tcMar>
-          </w:tcPr>
-          <w:p>
-            <w:pPr>
-              <w:spacing w:after="0" w:before="0"/>
-            </w:pPr>
-            <w:r>
-              <w:rPr>
-                <w:rFonts w:ascii="Arial" w:cs="Arial" w:eastAsia="Arial" w:hAnsi="Arial"/>
-                <w:color w:val="333333"/>
-                <w:sz w:val="18"/>
-                <w:szCs w:val="18"/>
-              </w:rPr>
-              <w:t xml:space="preserve">integration</w:t>
+            <w:shd w:fill="F2F7FB" w:val="clear"/>
+            <w:tcMar>
+              <w:top w:type="dxa" w:w="60"/>
+              <w:left w:type="dxa" w:w="100"/>
+              <w:bottom w:type="dxa" w:w="60"/>
+              <w:right w:type="dxa" w:w="100"/>
+            </w:tcMar>
+          </w:tcPr>
+          <w:p>
+            <w:pPr>
+              <w:spacing w:after="0" w:before="0"/>
+            </w:pPr>
+            <w:r>
+              <w:rPr>
+                <w:rFonts w:ascii="Arial" w:cs="Arial" w:eastAsia="Arial" w:hAnsi="Arial"/>
+                <w:color w:val="333333"/>
+                <w:sz w:val="18"/>
+                <w:szCs w:val="18"/>
+              </w:rPr>
+              <w:t xml:space="preserve">planning</w:t>
             </w:r>
           </w:p>
         </w:tc>
@@ -26260,25 +26359,26 @@
               <w:bottom w:val="single" w:color="CCCCCC" w:sz="1"/>
               <w:right w:val="single" w:color="CCCCCC" w:sz="1"/>
             </w:tcBorders>
-            <w:tcMar>
-              <w:top w:type="dxa" w:w="60"/>
-              <w:left w:type="dxa" w:w="100"/>
-              <w:bottom w:type="dxa" w:w="60"/>
-              <w:right w:type="dxa" w:w="100"/>
-            </w:tcMar>
-          </w:tcPr>
-          <w:p>
-            <w:pPr>
-              <w:spacing w:after="0" w:before="0"/>
-            </w:pPr>
-            <w:r>
-              <w:rPr>
-                <w:rFonts w:ascii="Arial" w:cs="Arial" w:eastAsia="Arial" w:hAnsi="Arial"/>
-                <w:color w:val="333333"/>
-                <w:sz w:val="18"/>
-                <w:szCs w:val="18"/>
-              </w:rPr>
-              <w:t xml:space="preserve">developer, tech-lead</w:t>
+            <w:shd w:fill="F2F7FB" w:val="clear"/>
+            <w:tcMar>
+              <w:top w:type="dxa" w:w="60"/>
+              <w:left w:type="dxa" w:w="100"/>
+              <w:bottom w:type="dxa" w:w="60"/>
+              <w:right w:type="dxa" w:w="100"/>
+            </w:tcMar>
+          </w:tcPr>
+          <w:p>
+            <w:pPr>
+              <w:spacing w:after="0" w:before="0"/>
+            </w:pPr>
+            <w:r>
+              <w:rPr>
+                <w:rFonts w:ascii="Arial" w:cs="Arial" w:eastAsia="Arial" w:hAnsi="Arial"/>
+                <w:color w:val="333333"/>
+                <w:sz w:val="18"/>
+                <w:szCs w:val="18"/>
+              </w:rPr>
+              <w:t xml:space="preserve">developer, architect, tech-lead</w:t>
             </w:r>
           </w:p>
         </w:tc>
@@ -26293,26 +26393,25 @@
               <w:bottom w:val="single" w:color="CCCCCC" w:sz="1"/>
               <w:right w:val="single" w:color="CCCCCC" w:sz="1"/>
             </w:tcBorders>
-            <w:shd w:fill="F2F7FB" w:val="clear"/>
-            <w:tcMar>
-              <w:top w:type="dxa" w:w="60"/>
-              <w:left w:type="dxa" w:w="100"/>
-              <w:bottom w:type="dxa" w:w="60"/>
-              <w:right w:type="dxa" w:w="100"/>
-            </w:tcMar>
-          </w:tcPr>
-          <w:p>
-            <w:pPr>
-              <w:spacing w:after="0" w:before="0"/>
-            </w:pPr>
-            <w:r>
-              <w:rPr>
-                <w:rFonts w:ascii="Arial" w:cs="Arial" w:eastAsia="Arial" w:hAnsi="Arial"/>
-                <w:color w:val="333333"/>
-                <w:sz w:val="18"/>
-                <w:szCs w:val="18"/>
-              </w:rPr>
-              <w:t xml:space="preserve">56</w:t>
+            <w:tcMar>
+              <w:top w:type="dxa" w:w="60"/>
+              <w:left w:type="dxa" w:w="100"/>
+              <w:bottom w:type="dxa" w:w="60"/>
+              <w:right w:type="dxa" w:w="100"/>
+            </w:tcMar>
+          </w:tcPr>
+          <w:p>
+            <w:pPr>
+              <w:spacing w:after="0" w:before="0"/>
+            </w:pPr>
+            <w:r>
+              <w:rPr>
+                <w:rFonts w:ascii="Arial" w:cs="Arial" w:eastAsia="Arial" w:hAnsi="Arial"/>
+                <w:color w:val="333333"/>
+                <w:sz w:val="18"/>
+                <w:szCs w:val="18"/>
+              </w:rPr>
+              <w:t>56</w:t>
             </w:r>
           </w:p>
         </w:tc>
@@ -26325,26 +26424,25 @@
               <w:bottom w:val="single" w:color="CCCCCC" w:sz="1"/>
               <w:right w:val="single" w:color="CCCCCC" w:sz="1"/>
             </w:tcBorders>
-            <w:shd w:fill="F2F7FB" w:val="clear"/>
-            <w:tcMar>
-              <w:top w:type="dxa" w:w="60"/>
-              <w:left w:type="dxa" w:w="100"/>
-              <w:bottom w:type="dxa" w:w="60"/>
-              <w:right w:type="dxa" w:w="100"/>
-            </w:tcMar>
-          </w:tcPr>
-          <w:p>
-            <w:pPr>
-              <w:spacing w:after="0" w:before="0"/>
-            </w:pPr>
-            <w:r>
-              <w:rPr>
-                <w:rFonts w:ascii="Arial" w:cs="Arial" w:eastAsia="Arial" w:hAnsi="Arial"/>
-                <w:color w:val="333333"/>
-                <w:sz w:val="18"/>
-                <w:szCs w:val="18"/>
-              </w:rPr>
-              <w:t xml:space="preserve">tech-debt-audit</w:t>
+            <w:tcMar>
+              <w:top w:type="dxa" w:w="60"/>
+              <w:left w:type="dxa" w:w="100"/>
+              <w:bottom w:type="dxa" w:w="60"/>
+              <w:right w:type="dxa" w:w="100"/>
+            </w:tcMar>
+          </w:tcPr>
+          <w:p>
+            <w:pPr>
+              <w:spacing w:after="0" w:before="0"/>
+            </w:pPr>
+            <w:r>
+              <w:rPr>
+                <w:rFonts w:ascii="Arial" w:cs="Arial" w:eastAsia="Arial" w:hAnsi="Arial"/>
+                <w:color w:val="333333"/>
+                <w:sz w:val="18"/>
+                <w:szCs w:val="18"/>
+              </w:rPr>
+              <w:t xml:space="preserve">task-implementer</w:t>
             </w:r>
           </w:p>
         </w:tc>
@@ -26357,26 +26455,25 @@
               <w:bottom w:val="single" w:color="CCCCCC" w:sz="1"/>
               <w:right w:val="single" w:color="CCCCCC" w:sz="1"/>
             </w:tcBorders>
-            <w:shd w:fill="F2F7FB" w:val="clear"/>
-            <w:tcMar>
-              <w:top w:type="dxa" w:w="60"/>
-              <w:left w:type="dxa" w:w="100"/>
-              <w:bottom w:type="dxa" w:w="60"/>
-              <w:right w:type="dxa" w:w="100"/>
-            </w:tcMar>
-          </w:tcPr>
-          <w:p>
-            <w:pPr>
-              <w:spacing w:after="0" w:before="0"/>
-            </w:pPr>
-            <w:r>
-              <w:rPr>
-                <w:rFonts w:ascii="Arial" w:cs="Arial" w:eastAsia="Arial" w:hAnsi="Arial"/>
-                <w:color w:val="333333"/>
-                <w:sz w:val="18"/>
-                <w:szCs w:val="18"/>
-              </w:rPr>
-              <w:t xml:space="preserve">maintenance</w:t>
+            <w:tcMar>
+              <w:top w:type="dxa" w:w="60"/>
+              <w:left w:type="dxa" w:w="100"/>
+              <w:bottom w:type="dxa" w:w="60"/>
+              <w:right w:type="dxa" w:w="100"/>
+            </w:tcMar>
+          </w:tcPr>
+          <w:p>
+            <w:pPr>
+              <w:spacing w:after="0" w:before="0"/>
+            </w:pPr>
+            <w:r>
+              <w:rPr>
+                <w:rFonts w:ascii="Arial" w:cs="Arial" w:eastAsia="Arial" w:hAnsi="Arial"/>
+                <w:color w:val="333333"/>
+                <w:sz w:val="18"/>
+                <w:szCs w:val="18"/>
+              </w:rPr>
+              <w:t xml:space="preserve">integration</w:t>
             </w:r>
           </w:p>
         </w:tc>
@@ -26389,26 +26486,25 @@
               <w:bottom w:val="single" w:color="CCCCCC" w:sz="1"/>
               <w:right w:val="single" w:color="CCCCCC" w:sz="1"/>
             </w:tcBorders>
-            <w:shd w:fill="F2F7FB" w:val="clear"/>
-            <w:tcMar>
-              <w:top w:type="dxa" w:w="60"/>
-              <w:left w:type="dxa" w:w="100"/>
-              <w:bottom w:type="dxa" w:w="60"/>
-              <w:right w:type="dxa" w:w="100"/>
-            </w:tcMar>
-          </w:tcPr>
-          <w:p>
-            <w:pPr>
-              <w:spacing w:after="0" w:before="0"/>
-            </w:pPr>
-            <w:r>
-              <w:rPr>
-                <w:rFonts w:ascii="Arial" w:cs="Arial" w:eastAsia="Arial" w:hAnsi="Arial"/>
-                <w:color w:val="333333"/>
-                <w:sz w:val="18"/>
-                <w:szCs w:val="18"/>
-              </w:rPr>
-              <w:t xml:space="preserve">architect, developer, tech-lead</w:t>
+            <w:tcMar>
+              <w:top w:type="dxa" w:w="60"/>
+              <w:left w:type="dxa" w:w="100"/>
+              <w:bottom w:type="dxa" w:w="60"/>
+              <w:right w:type="dxa" w:w="100"/>
+            </w:tcMar>
+          </w:tcPr>
+          <w:p>
+            <w:pPr>
+              <w:spacing w:after="0" w:before="0"/>
+            </w:pPr>
+            <w:r>
+              <w:rPr>
+                <w:rFonts w:ascii="Arial" w:cs="Arial" w:eastAsia="Arial" w:hAnsi="Arial"/>
+                <w:color w:val="333333"/>
+                <w:sz w:val="18"/>
+                <w:szCs w:val="18"/>
+              </w:rPr>
+              <w:t xml:space="preserve">developer, tech-lead</w:t>
             </w:r>
           </w:p>
         </w:tc>
@@ -26423,25 +26519,26 @@
               <w:bottom w:val="single" w:color="CCCCCC" w:sz="1"/>
               <w:right w:val="single" w:color="CCCCCC" w:sz="1"/>
             </w:tcBorders>
-            <w:tcMar>
-              <w:top w:type="dxa" w:w="60"/>
-              <w:left w:type="dxa" w:w="100"/>
-              <w:bottom w:type="dxa" w:w="60"/>
-              <w:right w:type="dxa" w:w="100"/>
-            </w:tcMar>
-          </w:tcPr>
-          <w:p>
-            <w:pPr>
-              <w:spacing w:after="0" w:before="0"/>
-            </w:pPr>
-            <w:r>
-              <w:rPr>
-                <w:rFonts w:ascii="Arial" w:cs="Arial" w:eastAsia="Arial" w:hAnsi="Arial"/>
-                <w:color w:val="333333"/>
-                <w:sz w:val="18"/>
-                <w:szCs w:val="18"/>
-              </w:rPr>
-              <w:t xml:space="preserve">57</w:t>
+            <w:shd w:fill="F2F7FB" w:val="clear"/>
+            <w:tcMar>
+              <w:top w:type="dxa" w:w="60"/>
+              <w:left w:type="dxa" w:w="100"/>
+              <w:bottom w:type="dxa" w:w="60"/>
+              <w:right w:type="dxa" w:w="100"/>
+            </w:tcMar>
+          </w:tcPr>
+          <w:p>
+            <w:pPr>
+              <w:spacing w:after="0" w:before="0"/>
+            </w:pPr>
+            <w:r>
+              <w:rPr>
+                <w:rFonts w:ascii="Arial" w:cs="Arial" w:eastAsia="Arial" w:hAnsi="Arial"/>
+                <w:color w:val="333333"/>
+                <w:sz w:val="18"/>
+                <w:szCs w:val="18"/>
+              </w:rPr>
+              <w:t>57</w:t>
             </w:r>
           </w:p>
         </w:tc>
@@ -26454,25 +26551,26 @@
               <w:bottom w:val="single" w:color="CCCCCC" w:sz="1"/>
               <w:right w:val="single" w:color="CCCCCC" w:sz="1"/>
             </w:tcBorders>
-            <w:tcMar>
-              <w:top w:type="dxa" w:w="60"/>
-              <w:left w:type="dxa" w:w="100"/>
-              <w:bottom w:type="dxa" w:w="60"/>
-              <w:right w:type="dxa" w:w="100"/>
-            </w:tcMar>
-          </w:tcPr>
-          <w:p>
-            <w:pPr>
-              <w:spacing w:after="0" w:before="0"/>
-            </w:pPr>
-            <w:r>
-              <w:rPr>
-                <w:rFonts w:ascii="Arial" w:cs="Arial" w:eastAsia="Arial" w:hAnsi="Arial"/>
-                <w:color w:val="333333"/>
-                <w:sz w:val="18"/>
-                <w:szCs w:val="18"/>
-              </w:rPr>
-              <w:t xml:space="preserve">test-gen</w:t>
+            <w:shd w:fill="F2F7FB" w:val="clear"/>
+            <w:tcMar>
+              <w:top w:type="dxa" w:w="60"/>
+              <w:left w:type="dxa" w:w="100"/>
+              <w:bottom w:type="dxa" w:w="60"/>
+              <w:right w:type="dxa" w:w="100"/>
+            </w:tcMar>
+          </w:tcPr>
+          <w:p>
+            <w:pPr>
+              <w:spacing w:after="0" w:before="0"/>
+            </w:pPr>
+            <w:r>
+              <w:rPr>
+                <w:rFonts w:ascii="Arial" w:cs="Arial" w:eastAsia="Arial" w:hAnsi="Arial"/>
+                <w:color w:val="333333"/>
+                <w:sz w:val="18"/>
+                <w:szCs w:val="18"/>
+              </w:rPr>
+              <w:t xml:space="preserve">tech-debt-audit</w:t>
             </w:r>
           </w:p>
         </w:tc>
@@ -26485,25 +26583,26 @@
               <w:bottom w:val="single" w:color="CCCCCC" w:sz="1"/>
               <w:right w:val="single" w:color="CCCCCC" w:sz="1"/>
             </w:tcBorders>
-            <w:tcMar>
-              <w:top w:type="dxa" w:w="60"/>
-              <w:left w:type="dxa" w:w="100"/>
-              <w:bottom w:type="dxa" w:w="60"/>
-              <w:right w:type="dxa" w:w="100"/>
-            </w:tcMar>
-          </w:tcPr>
-          <w:p>
-            <w:pPr>
-              <w:spacing w:after="0" w:before="0"/>
-            </w:pPr>
-            <w:r>
-              <w:rPr>
-                <w:rFonts w:ascii="Arial" w:cs="Arial" w:eastAsia="Arial" w:hAnsi="Arial"/>
-                <w:color w:val="333333"/>
-                <w:sz w:val="18"/>
-                <w:szCs w:val="18"/>
-              </w:rPr>
-              <w:t xml:space="preserve">development</w:t>
+            <w:shd w:fill="F2F7FB" w:val="clear"/>
+            <w:tcMar>
+              <w:top w:type="dxa" w:w="60"/>
+              <w:left w:type="dxa" w:w="100"/>
+              <w:bottom w:type="dxa" w:w="60"/>
+              <w:right w:type="dxa" w:w="100"/>
+            </w:tcMar>
+          </w:tcPr>
+          <w:p>
+            <w:pPr>
+              <w:spacing w:after="0" w:before="0"/>
+            </w:pPr>
+            <w:r>
+              <w:rPr>
+                <w:rFonts w:ascii="Arial" w:cs="Arial" w:eastAsia="Arial" w:hAnsi="Arial"/>
+                <w:color w:val="333333"/>
+                <w:sz w:val="18"/>
+                <w:szCs w:val="18"/>
+              </w:rPr>
+              <w:t xml:space="preserve">maintenance</w:t>
             </w:r>
           </w:p>
         </w:tc>
@@ -26516,25 +26615,26 @@
               <w:bottom w:val="single" w:color="CCCCCC" w:sz="1"/>
               <w:right w:val="single" w:color="CCCCCC" w:sz="1"/>
             </w:tcBorders>
-            <w:tcMar>
-              <w:top w:type="dxa" w:w="60"/>
-              <w:left w:type="dxa" w:w="100"/>
-              <w:bottom w:type="dxa" w:w="60"/>
-              <w:right w:type="dxa" w:w="100"/>
-            </w:tcMar>
-          </w:tcPr>
-          <w:p>
-            <w:pPr>
-              <w:spacing w:after="0" w:before="0"/>
-            </w:pPr>
-            <w:r>
-              <w:rPr>
-                <w:rFonts w:ascii="Arial" w:cs="Arial" w:eastAsia="Arial" w:hAnsi="Arial"/>
-                <w:color w:val="333333"/>
-                <w:sz w:val="18"/>
-                <w:szCs w:val="18"/>
-              </w:rPr>
-              <w:t xml:space="preserve">qa, developer, tech-lead</w:t>
+            <w:shd w:fill="F2F7FB" w:val="clear"/>
+            <w:tcMar>
+              <w:top w:type="dxa" w:w="60"/>
+              <w:left w:type="dxa" w:w="100"/>
+              <w:bottom w:type="dxa" w:w="60"/>
+              <w:right w:type="dxa" w:w="100"/>
+            </w:tcMar>
+          </w:tcPr>
+          <w:p>
+            <w:pPr>
+              <w:spacing w:after="0" w:before="0"/>
+            </w:pPr>
+            <w:r>
+              <w:rPr>
+                <w:rFonts w:ascii="Arial" w:cs="Arial" w:eastAsia="Arial" w:hAnsi="Arial"/>
+                <w:color w:val="333333"/>
+                <w:sz w:val="18"/>
+                <w:szCs w:val="18"/>
+              </w:rPr>
+              <w:t xml:space="preserve">architect, developer, tech-lead</w:t>
             </w:r>
           </w:p>
         </w:tc>
@@ -26549,26 +26649,25 @@
               <w:bottom w:val="single" w:color="CCCCCC" w:sz="1"/>
               <w:right w:val="single" w:color="CCCCCC" w:sz="1"/>
             </w:tcBorders>
-            <w:shd w:fill="F2F7FB" w:val="clear"/>
-            <w:tcMar>
-              <w:top w:type="dxa" w:w="60"/>
-              <w:left w:type="dxa" w:w="100"/>
-              <w:bottom w:type="dxa" w:w="60"/>
-              <w:right w:type="dxa" w:w="100"/>
-            </w:tcMar>
-          </w:tcPr>
-          <w:p>
-            <w:pPr>
-              <w:spacing w:after="0" w:before="0"/>
-            </w:pPr>
-            <w:r>
-              <w:rPr>
-                <w:rFonts w:ascii="Arial" w:cs="Arial" w:eastAsia="Arial" w:hAnsi="Arial"/>
-                <w:color w:val="333333"/>
-                <w:sz w:val="18"/>
-                <w:szCs w:val="18"/>
-              </w:rPr>
-              <w:t xml:space="preserve">58</w:t>
+            <w:tcMar>
+              <w:top w:type="dxa" w:w="60"/>
+              <w:left w:type="dxa" w:w="100"/>
+              <w:bottom w:type="dxa" w:w="60"/>
+              <w:right w:type="dxa" w:w="100"/>
+            </w:tcMar>
+          </w:tcPr>
+          <w:p>
+            <w:pPr>
+              <w:spacing w:after="0" w:before="0"/>
+            </w:pPr>
+            <w:r>
+              <w:rPr>
+                <w:rFonts w:ascii="Arial" w:cs="Arial" w:eastAsia="Arial" w:hAnsi="Arial"/>
+                <w:color w:val="333333"/>
+                <w:sz w:val="18"/>
+                <w:szCs w:val="18"/>
+              </w:rPr>
+              <w:t>58</w:t>
             </w:r>
           </w:p>
         </w:tc>
@@ -26581,26 +26680,25 @@
               <w:bottom w:val="single" w:color="CCCCCC" w:sz="1"/>
               <w:right w:val="single" w:color="CCCCCC" w:sz="1"/>
             </w:tcBorders>
-            <w:shd w:fill="F2F7FB" w:val="clear"/>
-            <w:tcMar>
-              <w:top w:type="dxa" w:w="60"/>
-              <w:left w:type="dxa" w:w="100"/>
-              <w:bottom w:type="dxa" w:w="60"/>
-              <w:right w:type="dxa" w:w="100"/>
-            </w:tcMar>
-          </w:tcPr>
-          <w:p>
-            <w:pPr>
-              <w:spacing w:after="0" w:before="0"/>
-            </w:pPr>
-            <w:r>
-              <w:rPr>
-                <w:rFonts w:ascii="Arial" w:cs="Arial" w:eastAsia="Arial" w:hAnsi="Arial"/>
-                <w:color w:val="333333"/>
-                <w:sz w:val="18"/>
-                <w:szCs w:val="18"/>
-              </w:rPr>
-              <w:t xml:space="preserve">user-story-refiner</w:t>
+            <w:tcMar>
+              <w:top w:type="dxa" w:w="60"/>
+              <w:left w:type="dxa" w:w="100"/>
+              <w:bottom w:type="dxa" w:w="60"/>
+              <w:right w:type="dxa" w:w="100"/>
+            </w:tcMar>
+          </w:tcPr>
+          <w:p>
+            <w:pPr>
+              <w:spacing w:after="0" w:before="0"/>
+            </w:pPr>
+            <w:r>
+              <w:rPr>
+                <w:rFonts w:ascii="Arial" w:cs="Arial" w:eastAsia="Arial" w:hAnsi="Arial"/>
+                <w:color w:val="333333"/>
+                <w:sz w:val="18"/>
+                <w:szCs w:val="18"/>
+              </w:rPr>
+              <w:t xml:space="preserve">test-gen</w:t>
             </w:r>
           </w:p>
         </w:tc>
@@ -26613,26 +26711,25 @@
               <w:bottom w:val="single" w:color="CCCCCC" w:sz="1"/>
               <w:right w:val="single" w:color="CCCCCC" w:sz="1"/>
             </w:tcBorders>
-            <w:shd w:fill="F2F7FB" w:val="clear"/>
-            <w:tcMar>
-              <w:top w:type="dxa" w:w="60"/>
-              <w:left w:type="dxa" w:w="100"/>
-              <w:bottom w:type="dxa" w:w="60"/>
-              <w:right w:type="dxa" w:w="100"/>
-            </w:tcMar>
-          </w:tcPr>
-          <w:p>
-            <w:pPr>
-              <w:spacing w:after="0" w:before="0"/>
-            </w:pPr>
-            <w:r>
-              <w:rPr>
-                <w:rFonts w:ascii="Arial" w:cs="Arial" w:eastAsia="Arial" w:hAnsi="Arial"/>
-                <w:color w:val="333333"/>
-                <w:sz w:val="18"/>
-                <w:szCs w:val="18"/>
-              </w:rPr>
-              <w:t xml:space="preserve">planning</w:t>
+            <w:tcMar>
+              <w:top w:type="dxa" w:w="60"/>
+              <w:left w:type="dxa" w:w="100"/>
+              <w:bottom w:type="dxa" w:w="60"/>
+              <w:right w:type="dxa" w:w="100"/>
+            </w:tcMar>
+          </w:tcPr>
+          <w:p>
+            <w:pPr>
+              <w:spacing w:after="0" w:before="0"/>
+            </w:pPr>
+            <w:r>
+              <w:rPr>
+                <w:rFonts w:ascii="Arial" w:cs="Arial" w:eastAsia="Arial" w:hAnsi="Arial"/>
+                <w:color w:val="333333"/>
+                <w:sz w:val="18"/>
+                <w:szCs w:val="18"/>
+              </w:rPr>
+              <w:t xml:space="preserve">development</w:t>
             </w:r>
           </w:p>
         </w:tc>
@@ -26645,26 +26742,25 @@
               <w:bottom w:val="single" w:color="CCCCCC" w:sz="1"/>
               <w:right w:val="single" w:color="CCCCCC" w:sz="1"/>
             </w:tcBorders>
-            <w:shd w:fill="F2F7FB" w:val="clear"/>
-            <w:tcMar>
-              <w:top w:type="dxa" w:w="60"/>
-              <w:left w:type="dxa" w:w="100"/>
-              <w:bottom w:type="dxa" w:w="60"/>
-              <w:right w:type="dxa" w:w="100"/>
-            </w:tcMar>
-          </w:tcPr>
-          <w:p>
-            <w:pPr>
-              <w:spacing w:after="0" w:before="0"/>
-            </w:pPr>
-            <w:r>
-              <w:rPr>
-                <w:rFonts w:ascii="Arial" w:cs="Arial" w:eastAsia="Arial" w:hAnsi="Arial"/>
-                <w:color w:val="333333"/>
-                <w:sz w:val="18"/>
-                <w:szCs w:val="18"/>
-              </w:rPr>
-              <w:t xml:space="preserve">product-owner, designer, scrum-master, tech-lead</w:t>
+            <w:tcMar>
+              <w:top w:type="dxa" w:w="60"/>
+              <w:left w:type="dxa" w:w="100"/>
+              <w:bottom w:type="dxa" w:w="60"/>
+              <w:right w:type="dxa" w:w="100"/>
+            </w:tcMar>
+          </w:tcPr>
+          <w:p>
+            <w:pPr>
+              <w:spacing w:after="0" w:before="0"/>
+            </w:pPr>
+            <w:r>
+              <w:rPr>
+                <w:rFonts w:ascii="Arial" w:cs="Arial" w:eastAsia="Arial" w:hAnsi="Arial"/>
+                <w:color w:val="333333"/>
+                <w:sz w:val="18"/>
+                <w:szCs w:val="18"/>
+              </w:rPr>
+              <w:t xml:space="preserve">qa, developer, tech-lead</w:t>
             </w:r>
           </w:p>
         </w:tc>
@@ -26679,25 +26775,26 @@
               <w:bottom w:val="single" w:color="CCCCCC" w:sz="1"/>
               <w:right w:val="single" w:color="CCCCCC" w:sz="1"/>
             </w:tcBorders>
-            <w:tcMar>
-              <w:top w:type="dxa" w:w="60"/>
-              <w:left w:type="dxa" w:w="100"/>
-              <w:bottom w:type="dxa" w:w="60"/>
-              <w:right w:type="dxa" w:w="100"/>
-            </w:tcMar>
-          </w:tcPr>
-          <w:p>
-            <w:pPr>
-              <w:spacing w:after="0" w:before="0"/>
-            </w:pPr>
-            <w:r>
-              <w:rPr>
-                <w:rFonts w:ascii="Arial" w:cs="Arial" w:eastAsia="Arial" w:hAnsi="Arial"/>
-                <w:color w:val="333333"/>
-                <w:sz w:val="18"/>
-                <w:szCs w:val="18"/>
-              </w:rPr>
-              <w:t xml:space="preserve">59</w:t>
+            <w:shd w:fill="F2F7FB" w:val="clear"/>
+            <w:tcMar>
+              <w:top w:type="dxa" w:w="60"/>
+              <w:left w:type="dxa" w:w="100"/>
+              <w:bottom w:type="dxa" w:w="60"/>
+              <w:right w:type="dxa" w:w="100"/>
+            </w:tcMar>
+          </w:tcPr>
+          <w:p>
+            <w:pPr>
+              <w:spacing w:after="0" w:before="0"/>
+            </w:pPr>
+            <w:r>
+              <w:rPr>
+                <w:rFonts w:ascii="Arial" w:cs="Arial" w:eastAsia="Arial" w:hAnsi="Arial"/>
+                <w:color w:val="333333"/>
+                <w:sz w:val="18"/>
+                <w:szCs w:val="18"/>
+              </w:rPr>
+              <w:t>59</w:t>
             </w:r>
           </w:p>
         </w:tc>
@@ -26710,25 +26807,26 @@
               <w:bottom w:val="single" w:color="CCCCCC" w:sz="1"/>
               <w:right w:val="single" w:color="CCCCCC" w:sz="1"/>
             </w:tcBorders>
-            <w:tcMar>
-              <w:top w:type="dxa" w:w="60"/>
-              <w:left w:type="dxa" w:w="100"/>
-              <w:bottom w:type="dxa" w:w="60"/>
-              <w:right w:type="dxa" w:w="100"/>
-            </w:tcMar>
-          </w:tcPr>
-          <w:p>
-            <w:pPr>
-              <w:spacing w:after="0" w:before="0"/>
-            </w:pPr>
-            <w:r>
-              <w:rPr>
-                <w:rFonts w:ascii="Arial" w:cs="Arial" w:eastAsia="Arial" w:hAnsi="Arial"/>
-                <w:color w:val="333333"/>
-                <w:sz w:val="18"/>
-                <w:szCs w:val="18"/>
-              </w:rPr>
-              <w:t xml:space="preserve">visual-review</w:t>
+            <w:shd w:fill="F2F7FB" w:val="clear"/>
+            <w:tcMar>
+              <w:top w:type="dxa" w:w="60"/>
+              <w:left w:type="dxa" w:w="100"/>
+              <w:bottom w:type="dxa" w:w="60"/>
+              <w:right w:type="dxa" w:w="100"/>
+            </w:tcMar>
+          </w:tcPr>
+          <w:p>
+            <w:pPr>
+              <w:spacing w:after="0" w:before="0"/>
+            </w:pPr>
+            <w:r>
+              <w:rPr>
+                <w:rFonts w:ascii="Arial" w:cs="Arial" w:eastAsia="Arial" w:hAnsi="Arial"/>
+                <w:color w:val="333333"/>
+                <w:sz w:val="18"/>
+                <w:szCs w:val="18"/>
+              </w:rPr>
+              <w:t xml:space="preserve">user-story-refiner</w:t>
             </w:r>
           </w:p>
         </w:tc>
@@ -26741,25 +26839,26 @@
               <w:bottom w:val="single" w:color="CCCCCC" w:sz="1"/>
               <w:right w:val="single" w:color="CCCCCC" w:sz="1"/>
             </w:tcBorders>
-            <w:tcMar>
-              <w:top w:type="dxa" w:w="60"/>
-              <w:left w:type="dxa" w:w="100"/>
-              <w:bottom w:type="dxa" w:w="60"/>
-              <w:right w:type="dxa" w:w="100"/>
-            </w:tcMar>
-          </w:tcPr>
-          <w:p>
-            <w:pPr>
-              <w:spacing w:after="0" w:before="0"/>
-            </w:pPr>
-            <w:r>
-              <w:rPr>
-                <w:rFonts w:ascii="Arial" w:cs="Arial" w:eastAsia="Arial" w:hAnsi="Arial"/>
-                <w:color w:val="333333"/>
-                <w:sz w:val="18"/>
-                <w:szCs w:val="18"/>
-              </w:rPr>
-              <w:t xml:space="preserve">quality</w:t>
+            <w:shd w:fill="F2F7FB" w:val="clear"/>
+            <w:tcMar>
+              <w:top w:type="dxa" w:w="60"/>
+              <w:left w:type="dxa" w:w="100"/>
+              <w:bottom w:type="dxa" w:w="60"/>
+              <w:right w:type="dxa" w:w="100"/>
+            </w:tcMar>
+          </w:tcPr>
+          <w:p>
+            <w:pPr>
+              <w:spacing w:after="0" w:before="0"/>
+            </w:pPr>
+            <w:r>
+              <w:rPr>
+                <w:rFonts w:ascii="Arial" w:cs="Arial" w:eastAsia="Arial" w:hAnsi="Arial"/>
+                <w:color w:val="333333"/>
+                <w:sz w:val="18"/>
+                <w:szCs w:val="18"/>
+              </w:rPr>
+              <w:t xml:space="preserve">planning</w:t>
             </w:r>
           </w:p>
         </w:tc>
@@ -26772,25 +26871,26 @@
               <w:bottom w:val="single" w:color="CCCCCC" w:sz="1"/>
               <w:right w:val="single" w:color="CCCCCC" w:sz="1"/>
             </w:tcBorders>
-            <w:tcMar>
-              <w:top w:type="dxa" w:w="60"/>
-              <w:left w:type="dxa" w:w="100"/>
-              <w:bottom w:type="dxa" w:w="60"/>
-              <w:right w:type="dxa" w:w="100"/>
-            </w:tcMar>
-          </w:tcPr>
-          <w:p>
-            <w:pPr>
-              <w:spacing w:after="0" w:before="0"/>
-            </w:pPr>
-            <w:r>
-              <w:rPr>
-                <w:rFonts w:ascii="Arial" w:cs="Arial" w:eastAsia="Arial" w:hAnsi="Arial"/>
-                <w:color w:val="333333"/>
-                <w:sz w:val="18"/>
-                <w:szCs w:val="18"/>
-              </w:rPr>
-              <w:t xml:space="preserve">designer, qa, developer, tech-lead</w:t>
+            <w:shd w:fill="F2F7FB" w:val="clear"/>
+            <w:tcMar>
+              <w:top w:type="dxa" w:w="60"/>
+              <w:left w:type="dxa" w:w="100"/>
+              <w:bottom w:type="dxa" w:w="60"/>
+              <w:right w:type="dxa" w:w="100"/>
+            </w:tcMar>
+          </w:tcPr>
+          <w:p>
+            <w:pPr>
+              <w:spacing w:after="0" w:before="0"/>
+            </w:pPr>
+            <w:r>
+              <w:rPr>
+                <w:rFonts w:ascii="Arial" w:cs="Arial" w:eastAsia="Arial" w:hAnsi="Arial"/>
+                <w:color w:val="333333"/>
+                <w:sz w:val="18"/>
+                <w:szCs w:val="18"/>
+              </w:rPr>
+              <w:t xml:space="preserve">product-owner, designer, scrum-master, tech-lead</w:t>
             </w:r>
           </w:p>
         </w:tc>
@@ -26805,26 +26905,152 @@
               <w:bottom w:val="single" w:color="CCCCCC" w:sz="1"/>
               <w:right w:val="single" w:color="CCCCCC" w:sz="1"/>
             </w:tcBorders>
-            <w:shd w:fill="F2F7FB" w:val="clear"/>
-            <w:tcMar>
-              <w:top w:type="dxa" w:w="60"/>
-              <w:left w:type="dxa" w:w="100"/>
-              <w:bottom w:type="dxa" w:w="60"/>
-              <w:right w:type="dxa" w:w="100"/>
-            </w:tcMar>
-          </w:tcPr>
-          <w:p>
-            <w:pPr>
-              <w:spacing w:after="0" w:before="0"/>
-            </w:pPr>
-            <w:r>
-              <w:rPr>
-                <w:rFonts w:ascii="Arial" w:cs="Arial" w:eastAsia="Arial" w:hAnsi="Arial"/>
-                <w:color w:val="333333"/>
-                <w:sz w:val="18"/>
-                <w:szCs w:val="18"/>
-              </w:rPr>
-              <w:t xml:space="preserve">60</w:t>
+            <w:tcMar>
+              <w:top w:type="dxa" w:w="60"/>
+              <w:left w:type="dxa" w:w="100"/>
+              <w:bottom w:type="dxa" w:w="60"/>
+              <w:right w:type="dxa" w:w="100"/>
+            </w:tcMar>
+          </w:tcPr>
+          <w:p>
+            <w:pPr>
+              <w:spacing w:after="0" w:before="0"/>
+            </w:pPr>
+            <w:r>
+              <w:rPr>
+                <w:rFonts w:ascii="Arial" w:cs="Arial" w:eastAsia="Arial" w:hAnsi="Arial"/>
+                <w:color w:val="333333"/>
+                <w:sz w:val="18"/>
+                <w:szCs w:val="18"/>
+              </w:rPr>
+              <w:t>60</w:t>
+            </w:r>
+          </w:p>
+        </w:tc>
+        <w:tc>
+          <w:tcPr>
+            <w:tcW w:type="dxa" w:w="2800"/>
+            <w:tcBorders>
+              <w:top w:val="single" w:color="CCCCCC" w:sz="1"/>
+              <w:left w:val="single" w:color="CCCCCC" w:sz="1"/>
+              <w:bottom w:val="single" w:color="CCCCCC" w:sz="1"/>
+              <w:right w:val="single" w:color="CCCCCC" w:sz="1"/>
+            </w:tcBorders>
+            <w:tcMar>
+              <w:top w:type="dxa" w:w="60"/>
+              <w:left w:type="dxa" w:w="100"/>
+              <w:bottom w:type="dxa" w:w="60"/>
+              <w:right w:type="dxa" w:w="100"/>
+            </w:tcMar>
+          </w:tcPr>
+          <w:p>
+            <w:pPr>
+              <w:spacing w:after="0" w:before="0"/>
+            </w:pPr>
+            <w:r>
+              <w:rPr>
+                <w:rFonts w:ascii="Arial" w:cs="Arial" w:eastAsia="Arial" w:hAnsi="Arial"/>
+                <w:color w:val="333333"/>
+                <w:sz w:val="18"/>
+                <w:szCs w:val="18"/>
+              </w:rPr>
+              <w:t xml:space="preserve">visual-review</w:t>
+            </w:r>
+          </w:p>
+        </w:tc>
+        <w:tc>
+          <w:tcPr>
+            <w:tcW w:type="dxa" w:w="2400"/>
+            <w:tcBorders>
+              <w:top w:val="single" w:color="CCCCCC" w:sz="1"/>
+              <w:left w:val="single" w:color="CCCCCC" w:sz="1"/>
+              <w:bottom w:val="single" w:color="CCCCCC" w:sz="1"/>
+              <w:right w:val="single" w:color="CCCCCC" w:sz="1"/>
+            </w:tcBorders>
+            <w:tcMar>
+              <w:top w:type="dxa" w:w="60"/>
+              <w:left w:type="dxa" w:w="100"/>
+              <w:bottom w:type="dxa" w:w="60"/>
+              <w:right w:type="dxa" w:w="100"/>
+            </w:tcMar>
+          </w:tcPr>
+          <w:p>
+            <w:pPr>
+              <w:spacing w:after="0" w:before="0"/>
+            </w:pPr>
+            <w:r>
+              <w:rPr>
+                <w:rFonts w:ascii="Arial" w:cs="Arial" w:eastAsia="Arial" w:hAnsi="Arial"/>
+                <w:color w:val="333333"/>
+                <w:sz w:val="18"/>
+                <w:szCs w:val="18"/>
+              </w:rPr>
+              <w:t xml:space="preserve">quality</w:t>
+            </w:r>
+          </w:p>
+        </w:tc>
+        <w:tc>
+          <w:tcPr>
+            <w:tcW w:type="dxa" w:w="3760"/>
+            <w:tcBorders>
+              <w:top w:val="single" w:color="CCCCCC" w:sz="1"/>
+              <w:left w:val="single" w:color="CCCCCC" w:sz="1"/>
+              <w:bottom w:val="single" w:color="CCCCCC" w:sz="1"/>
+              <w:right w:val="single" w:color="CCCCCC" w:sz="1"/>
+            </w:tcBorders>
+            <w:tcMar>
+              <w:top w:type="dxa" w:w="60"/>
+              <w:left w:type="dxa" w:w="100"/>
+              <w:bottom w:type="dxa" w:w="60"/>
+              <w:right w:type="dxa" w:w="100"/>
+            </w:tcMar>
+          </w:tcPr>
+          <w:p>
+            <w:pPr>
+              <w:spacing w:after="0" w:before="0"/>
+            </w:pPr>
+            <w:r>
+              <w:rPr>
+                <w:rFonts w:ascii="Arial" w:cs="Arial" w:eastAsia="Arial" w:hAnsi="Arial"/>
+                <w:color w:val="333333"/>
+                <w:sz w:val="18"/>
+                <w:szCs w:val="18"/>
+              </w:rPr>
+              <w:t xml:space="preserve">designer, qa, developer, tech-lead</w:t>
+            </w:r>
+          </w:p>
+        </w:tc>
+      </w:tr>
+      <w:tr>
+        <w:tc>
+          <w:tcPr>
+            <w:tcW w:type="dxa" w:w="400"/>
+            <w:tcBorders>
+              <w:top w:val="single" w:color="CCCCCC" w:sz="1"/>
+              <w:left w:val="single" w:color="CCCCCC" w:sz="1"/>
+              <w:bottom w:val="single" w:color="CCCCCC" w:sz="1"/>
+              <w:right w:val="single" w:color="CCCCCC" w:sz="1"/>
+            </w:tcBorders>
+            <w:shd w:fill="F2F7FB" w:val="clear"/>
+            <w:tcMar>
+              <w:top w:type="dxa" w:w="60"/>
+              <w:left w:type="dxa" w:w="100"/>
+              <w:bottom w:type="dxa" w:w="60"/>
+              <w:right w:type="dxa" w:w="100"/>
+            </w:tcMar>
+          </w:tcPr>
+          <w:p>
+            <w:pPr>
+              <w:spacing w:after="0" w:before="0"/>
+            </w:pPr>
+            <w:r>
+              <w:rPr>
+                <w:rFonts w:ascii="Arial" w:cs="Arial" w:eastAsia="Arial" w:hAnsi="Arial"/>
+                <w:color w:val="333333"/>
+                <w:sz w:val="18"/>
+                <w:szCs w:val="18"/>
+              </w:rPr>
+              <w:t>61</w:t>
             </w:r>
           </w:p>
         </w:tc>

</xml_diff>